<commit_message>
Finalize Brazilian Portuguese edition: proofread text + PT cover
- Reassemble A Promessa do Cardeal from the 13 native pt-BR proofread
  chunks (stray dialogue quotes removed, Scripture in Almeida register,
  anglicisms/calques corrected, place-name agreement, glossary consistency).
- Remove the cover-design credit (Grace Nobrega) from the PT edition.
- Rebuild PDF/EPUB/DOCX with the Portuguese cover embedded (226 pp).

Co-Authored-By: Claude Opus 4.8 <noreply@anthropic.com>
Claude-Session: https://claude.ai/code/session_013TTacQAr67Pe2VUwTPop1A
</commit_message>
<xml_diff>
--- a/The_Cardinals_Promise_PT.docx
+++ b/The_Cardinals_Promise_PT.docx
@@ -131,14 +131,6 @@
       </w:pPr>
       <w:r>
         <w:t xml:space="preserve">Esta é uma obra de memórias. Reflete as lembranças atuais do autor sobre experiências ao longo do tempo. Alguns nomes e detalhes de identificação foram alterados, alguns diálogos foram reconstruídos, e alguns acontecimentos são apresentados como composições, conforme descrito na Nota do Autor.</w:t>
-      </w:r>
-    </w:p>
-    <w:p>
-      <w:pPr>
-        <w:pStyle w:val="BodyText"/>
-      </w:pPr>
-      <w:r>
-        <w:t xml:space="preserve">Projeto da capa: Grace Nobrega</w:t>
       </w:r>
     </w:p>
     <w:p>
@@ -923,7 +915,7 @@
           <w:iCs/>
           <w:i/>
         </w:rPr>
-        <w:t xml:space="preserve">Fez-me subir dum lago horrível, dum charco de lodo; pôs os meus pés sobre uma rocha, firmou os meus passos.</w:t>
+        <w:t xml:space="preserve">Tirou-me dum lago horrível, dum charco de lodo; pôs os meus pés sobre uma rocha, firmou os meus passos.</w:t>
       </w:r>
       <w:r>
         <w:rPr>
@@ -1032,15 +1024,15 @@
         <w:pStyle w:val="BodyText"/>
       </w:pPr>
       <w:r>
-        <w:t xml:space="preserve">Alguns dos homens estavam perdidos da cabeça, balançando, rindo, falando com ninguém. Outros estavam sentados de costas para a parede e os olhos vazios. Uns poucos apenas me observavam. Eu não pertencia àquele lugar, e eles sabiam. Rico era um deles.</w:t>
-      </w:r>
-    </w:p>
-    <w:p>
-      <w:pPr>
-        <w:pStyle w:val="BodyText"/>
-      </w:pPr>
-      <w:r>
-        <w:t xml:space="preserve">Minha garganta ardia. Eu quis levar a mão a ela e não levei. Não ia deixar a sala ver isso. Em vez disso deslizei pela parede e sentei, joelhos contra o peito, o concreto frio através da roupa, a testa baixa. Eu conhecia a posição. Meu corpo a encontrou antes de minha mente alcançar. Ficar pequeno, ficar quieto, não segurar o olhar de ninguém, não dar à sala um motivo para te escolher. Era a mesma forma na qual eu me dobrava quando menino, quando a gritaria começava.</w:t>
+        <w:t xml:space="preserve">Alguns dos homens estavam fora de si, balançando, rindo, falando com ninguém. Outros estavam sentados de costas para a parede e os olhos vazios. Uns poucos apenas me observavam. Eu não pertencia àquele lugar, e eles sabiam. Rico era um deles.</w:t>
+      </w:r>
+    </w:p>
+    <w:p>
+      <w:pPr>
+        <w:pStyle w:val="BodyText"/>
+      </w:pPr>
+      <w:r>
+        <w:t xml:space="preserve">Minha garganta ardia. Eu quis levar a mão a ela e não levei. Não ia deixar a sala ver isso. Em vez disso deslizei pela parede e sentei, joelhos contra o peito, o concreto frio através da roupa, a testa baixa. Eu conhecia a posição. Meu corpo a encontrou antes de a minha mente acompanhar. Ficar pequeno, ficar quieto, não segurar o olhar de ninguém, não dar à sala um motivo para te escolher. Era a mesma forma em que eu me dobrava quando menino, quando a gritaria começava.</w:t>
       </w:r>
     </w:p>
     <w:p>
@@ -1104,7 +1096,7 @@
         <w:pStyle w:val="BodyText"/>
       </w:pPr>
       <w:r>
-        <w:t xml:space="preserve">Tive que ficar com essa frase por mais tempo do que qualquer outra neste livro. Vinte e quatro horas fora daquela cela, tudo o que eles tinham levado ainda perdido, e eu cruzei a mesma ponte na mesma direção. Eu gostaria de te dizer que lutei contra isso no carro — que alguma voz argumentou comigo em direção à fronteira e perdeu. Não houve voz. Essa é a parte que eu não consegui encarar por anos. A mente que deveria estar gritando estava quieta. Ela já tinha arquivado a noite inteira como sobrevivível, algo que eu podia deixar para trás, e àquela tarde era como se a cela tivesse acontecido com outro homem. Não disse nada a mim mesmo. Esse silêncio é a doença. Não a bebida, não a fronteira, nem mesmo a cela — a coisa dentro de mim que podia pegar uma noite como aquela e, um dia depois, alcançar a porta e ir de novo.</w:t>
+        <w:t xml:space="preserve">Tive que ficar com essa frase por mais tempo do que qualquer outra neste livro. Vinte e quatro horas fora daquela cela, tudo o que eles tinham levado ainda perdido, e eu cruzei a mesma ponte na mesma direção. Eu gostaria de te dizer que lutei contra isso no carro — que alguma voz discutiu comigo o caminho inteiro até a fronteira e perdeu. Não houve voz. Essa é a parte que eu não consegui encarar por anos. A mente que deveria estar gritando estava quieta. Ela já tinha arquivado a noite inteira como algo que dava para sobreviver, algo que eu podia deixar para trás, e àquela tarde era como se a cela tivesse acontecido com outro homem. Não disse nada a mim mesmo. Esse silêncio é a doença. Não a bebida, não a fronteira, nem mesmo a cela — a coisa dentro de mim que podia pegar uma noite como aquela e, um dia depois, alcançar a porta e ir de novo.</w:t>
       </w:r>
     </w:p>
     <w:p>
@@ -1418,7 +1410,7 @@
         <w:pStyle w:val="BodyText"/>
       </w:pPr>
       <w:r>
-        <w:t xml:space="preserve">Mas havia outro lado do papa. Ele ficava em cafés depois do trabalho, jogando xadrez, tomando café, sem voltar para casa. Alguns fins de semana ele dormia direto, e o próprio pai dele tinha que vir acordá-lo. Num Dia de Ação de Graças minha mãe cozinhou o jantar inteiro, e o papa nunca se levantou para ele. Outras vezes ele saía para o trabalho e não voltava. Um dia. Depois dois. Depois três. Depois ele entrava esgotado, os olhos idos para algum lugar, ia direto para o quarto, trancava a porta, e fechava a casa do lado de fora.</w:t>
+        <w:t xml:space="preserve">Mas havia outro lado do papa. Ele ficava em cafés depois do trabalho, jogando xadrez, tomando café, sem voltar para casa. Alguns fins de semana ele dormia direto, e o próprio pai dele tinha que vir acordá-lo. Num Dia de Ação de Graças minha mãe cozinhou o jantar inteiro, e o papa nunca se levantou para ele. Outras vezes ele saía para o trabalho e não voltava. Um dia. Depois dois. Depois três. Depois ele entrava esgotado, os olhos perdidos em algum lugar, ia direto para o quarto, trancava a porta, e fechava a casa do lado de fora.</w:t>
       </w:r>
     </w:p>
     <w:p>
@@ -1530,7 +1522,7 @@
         <w:pStyle w:val="BodyText"/>
       </w:pPr>
       <w:r>
-        <w:t xml:space="preserve">Depois o aeroporto. Minha mãe carregava uma mala e Chris enquanto eu arrastava uma malinha vermelha atrás de mim. Eu tinha voado uma vez antes, como bebê, para Houston, mas um bebê não guarda nada. Até onde eu sabia, eu nunca tinha visto um avião de perto. Os motores subiram pelo chão e pelo assento e para dentro de mim. Quando começamos a descer a pista alguma coisa me empurrou de volta contra o assento. Olhei pela janela. As casas e as ruas deslizavam, devagar e depois rápido, até se misturarem e caírem embaixo das nuvens.</w:t>
+        <w:t xml:space="preserve">Depois o aeroporto. Minha mãe carregava uma mala e Chris enquanto eu arrastava uma malinha vermelha atrás de mim. Eu tinha voado uma vez antes, como bebê, para Houston, mas um bebê não guarda nada. Até onde eu sabia, eu nunca tinha visto um avião de perto. Os motores subiram pelo chão e pelo assento e para dentro de mim. Quando começamos a correr pela pista alguma coisa me empurrou de volta contra o assento. Olhei pela janela. As casas e as ruas deslizavam, devagar e depois rápido, até se misturarem e caírem embaixo das nuvens.</w:t>
       </w:r>
     </w:p>
     <w:p>
@@ -1570,7 +1562,7 @@
         <w:pStyle w:val="BodyText"/>
       </w:pPr>
       <w:r>
-        <w:t xml:space="preserve">Minha tia Nancey nos pegou no seu pequeno Honda Civic vermelho e nos levou até a casa dos meus avós em West Paterson. Saí para fora e vi minha própria respiração pela primeira vez. Eu não sabia que aquilo podia sequer acontecer. Eu só tinha visto fumaça assim saindo de um cigarro.</w:t>
+        <w:t xml:space="preserve">Minha tia Nancey nos pegou no seu pequeno Honda Civic vermelho e nos levou até a casa dos meus avós em West Paterson. Saí e vi minha própria respiração pela primeira vez. Eu não sabia que aquilo podia sequer acontecer. Eu só tinha visto fumaça assim saindo de um cigarro.</w:t>
       </w:r>
     </w:p>
     <w:p>
@@ -1700,15 +1692,15 @@
         <w:pStyle w:val="BodyText"/>
       </w:pPr>
       <w:r>
-        <w:t xml:space="preserve">A primeira coisa que New Jersey me tirou foi o barulho. Na Cidade do México, o som tinha sido a textura de cada dia. A casa dos meus avós em West Paterson não tinha nada disso. O silêncio ali era de propósito, e a casa funcionava por horário: jantar sempre na mesma hora, luzes apagadas na mesma hora, conversa que nunca ia além do que dava para conduzir com educação. Não era frieza, só contenção. Depois de onde eu tinha vindo, contido chegava perto de seguro.</w:t>
-      </w:r>
-    </w:p>
-    <w:p>
-      <w:pPr>
-        <w:pStyle w:val="BodyText"/>
-      </w:pPr>
-      <w:r>
-        <w:t xml:space="preserve">Em pouco tempo eu tinha amigos na rua, Frank e Jason, e saía correndo atrás deles para ficar na rua o dia inteiro. O inglês veio rápido porque não havia outro jeito, e meu espanhol foi silenciando mais rápido do que qualquer um esperava, uma palavra aqui, uma frase ali, até que um dia me peguei traduzindo na cabeça, e pouco depois tinha parado de traduzir. A escola me confundia. Eu entendia mais do que conseguia dizer, então observava as outras crianças em busca de deixas, quando falar, quando rir, como me portar, e aprendi que era mais seguro absorver um ambiente do que me anunciar. Meu nome era Claudio Horacio Balderas, e numa turma de John Smiths e Erik Thomases ninguém conseguia dizer nada daquilo, então pararam em Cloudio e pegou.</w:t>
+        <w:t xml:space="preserve">A primeira coisa que New Jersey me tirou foi o barulho. Na Cidade do México, o som tinha sido a textura de cada dia. A casa dos meus avós em West Paterson não tinha nada disso. O silêncio ali era de propósito, e a casa funcionava por horário: jantar sempre na mesma hora, luzes apagadas na mesma hora, conversa que nunca ia além do que dava para conduzir com educação. Não era frieza, só contenção. Vindo de onde eu vinha, contido chegava perto de seguro.</w:t>
+      </w:r>
+    </w:p>
+    <w:p>
+      <w:pPr>
+        <w:pStyle w:val="BodyText"/>
+      </w:pPr>
+      <w:r>
+        <w:t xml:space="preserve">Em pouco tempo eu tinha amigos na rua, Frank e Jason, e saía correndo atrás deles para ficar na rua o dia inteiro. O inglês veio rápido porque não havia outro jeito, e meu espanhol foi silenciando mais rápido do que qualquer um esperava, uma palavra aqui, uma frase ali, até que um dia me peguei traduzindo na cabeça, e pouco depois tinha parado de traduzir. A escola me confundia. Eu entendia mais do que conseguia dizer, então observava as outras crianças em busca de deixas, quando falar, quando rir, como me portar, e aprendi que era mais seguro absorver um ambiente do que me anunciar. Meu nome era Claudio Horacio Balderas, e numa turma de John Smiths e Erik Thomases ninguém conseguia dizer nada daquilo, então pararam em Cloudio, e pegou.</w:t>
       </w:r>
     </w:p>
     <w:p>
@@ -1740,42 +1732,24 @@
         <w:pStyle w:val="BodyText"/>
       </w:pPr>
       <w:r>
-        <w:t xml:space="preserve">“</w:t>
-      </w:r>
-      <w:r>
         <w:t xml:space="preserve">Ainda acordado?</w:t>
       </w:r>
-      <w:r>
-        <w:t xml:space="preserve">”</w:t>
-      </w:r>
-    </w:p>
-    <w:p>
-      <w:pPr>
-        <w:pStyle w:val="BodyText"/>
-      </w:pPr>
-      <w:r>
-        <w:t xml:space="preserve">“</w:t>
-      </w:r>
+    </w:p>
+    <w:p>
+      <w:pPr>
+        <w:pStyle w:val="BodyText"/>
+      </w:pPr>
       <w:r>
         <w:t xml:space="preserve">Estou.</w:t>
       </w:r>
-      <w:r>
-        <w:t xml:space="preserve">”</w:t>
-      </w:r>
-    </w:p>
-    <w:p>
-      <w:pPr>
-        <w:pStyle w:val="BodyText"/>
-      </w:pPr>
-      <w:r>
-        <w:t xml:space="preserve">“</w:t>
-      </w:r>
+    </w:p>
+    <w:p>
+      <w:pPr>
+        <w:pStyle w:val="BodyText"/>
+      </w:pPr>
       <w:r>
         <w:t xml:space="preserve">Quer McDonald’s?</w:t>
       </w:r>
-      <w:r>
-        <w:t xml:space="preserve">”</w:t>
-      </w:r>
     </w:p>
     <w:p>
       <w:pPr>
@@ -1806,15 +1780,15 @@
         <w:pStyle w:val="BodyText"/>
       </w:pPr>
       <w:r>
-        <w:t xml:space="preserve">Chris se adaptou a New Jersey sem problema. Ele tinha deixado o México bebê; eu tinha deixado aos quatro anos, com um pai para sentir falta.</w:t>
-      </w:r>
-    </w:p>
-    <w:p>
-      <w:pPr>
-        <w:pStyle w:val="BodyText"/>
-      </w:pPr>
-      <w:r>
-        <w:t xml:space="preserve">À noite eu pensava em Horacio, não com raiva, com confusão, quase esperando que ele aparecesse um dia para a gente retomar as coisas. Eu não sabia como amar um homem que tinha sumido mas não estava morto. Sem funeral, sem túmulo, sem explicação que uma criança pudesse segurar. Os adultos raramente falavam dele, e quando falavam era com cuidado, do jeito que se lida com algo que pode quebrar se você nomear direto.</w:t>
+        <w:t xml:space="preserve">Chris se adaptou a New Jersey sem problema. Ele tinha deixado o México bebê; eu tinha deixado aos quatro anos, com um pai de quem sentir falta.</w:t>
+      </w:r>
+    </w:p>
+    <w:p>
+      <w:pPr>
+        <w:pStyle w:val="BodyText"/>
+      </w:pPr>
+      <w:r>
+        <w:t xml:space="preserve">À noite eu pensava em Horacio, não com raiva, com confusão, quase esperando que ele aparecesse um dia para a gente retomar as coisas. Eu não sabia como amar um homem que tinha sumido, mas não estava morto. Sem funeral, sem túmulo, sem explicação que uma criança pudesse segurar. Os adultos raramente falavam dele, e quando falavam era com cuidado, do jeito que se lida com algo que pode quebrar se você nomear direto.</w:t>
       </w:r>
     </w:p>
     <w:p>
@@ -1862,7 +1836,7 @@
         <w:pStyle w:val="BodyText"/>
       </w:pPr>
       <w:r>
-        <w:t xml:space="preserve">E tinha a Nancey, a irmã mais nova da minha mãe, que tratou a mim e ao Chris como se fôssemos dela desde o começo. Estava nos jogos e nas lutas, sempre do nosso lado. Tinha uns vinte e poucos anos quando chegamos do México, anos antes de conhecer o Charlie. Ela me disse não faz muito tempo que, por mais que eu fique velho, sempre vai enxergar o mesmo menininho, e eu sei qual ela quer dizer: o menino no banco de trás com medo demais de sair do carro.</w:t>
+        <w:t xml:space="preserve">E tinha a Nancey, a irmã mais nova da minha mãe, que tratou a mim e ao Chris como se fôssemos dela desde o começo. Estava nos jogos e nas lutas, sempre do nosso lado. Tinha uns vinte e poucos anos quando chegamos do México, anos antes de conhecer o Charlie. Ela me disse não faz muito tempo que, por mais velho que eu fique, sempre vai enxergar o mesmo menininho, e eu sei qual ela quer dizer: o menino no banco de trás com medo demais de sair do carro.</w:t>
       </w:r>
     </w:p>
     <w:p>
@@ -2016,7 +1990,7 @@
         <w:pStyle w:val="BodyText"/>
       </w:pPr>
       <w:r>
-        <w:t xml:space="preserve">Ele tinha três filhos quando fez vinte e dois anos. A primeira esposa dele, Judy, era alguns anos mais nova e lutava contra a depressão pós-parto numa época que não tinha nome para isso nem ajuda. Ele ainda saía para festas de vez em quando. O casamento não se sustentou, e as crianças passavam a maior parte do tempo com Mag, a mãe dele. Ele mesmo me contou a verdade nua, sem desculpa nenhuma: não tinha sido a melhor versão de si mesmo naquela época. Ele sabia o que era dever aos filhos um homem melhor do que o que eles tiveram.</w:t>
+        <w:t xml:space="preserve">Ele tinha três filhos quando fez vinte e dois anos. A primeira esposa dele, Judy, era alguns anos mais nova e lutava contra a depressão pós-parto numa época em que não havia nome para aquilo nem ajuda. Ele ainda saía para festas de vez em quando. O casamento não se sustentou, e as crianças passavam a maior parte do tempo com Mag, a mãe dele. Ele mesmo me contou a verdade nua, sem desculpa nenhuma: não tinha sido a melhor versão de si mesmo naquela época. Ele sabia o que era dever aos filhos um homem melhor do que o que eles tiveram.</w:t>
       </w:r>
     </w:p>
     <w:p>
@@ -2072,28 +2046,7 @@
         <w:pStyle w:val="BodyText"/>
       </w:pPr>
       <w:r>
-        <w:t xml:space="preserve">“</w:t>
-      </w:r>
-      <w:r>
-        <w:t xml:space="preserve">Você muda seu primeiro nome para Robert</w:t>
-      </w:r>
-      <w:r>
-        <w:t xml:space="preserve">”</w:t>
-      </w:r>
-      <w:r>
-        <w:t xml:space="preserve">, ele disse.</w:t>
-      </w:r>
-      <w:r>
-        <w:t xml:space="preserve"> </w:t>
-      </w:r>
-      <w:r>
-        <w:t xml:space="preserve">“</w:t>
-      </w:r>
-      <w:r>
-        <w:t xml:space="preserve">Rob. E eu te dou cem dólares.</w:t>
-      </w:r>
-      <w:r>
-        <w:t xml:space="preserve">”</w:t>
+        <w:t xml:space="preserve">Você muda seu primeiro nome para Robert, ele disse. Rob. E eu te dou cem dólares.</w:t>
       </w:r>
     </w:p>
     <w:p>
@@ -2109,16 +2062,7 @@
         <w:pStyle w:val="BodyText"/>
       </w:pPr>
       <w:r>
-        <w:t xml:space="preserve">“</w:t>
-      </w:r>
-      <w:r>
-        <w:t xml:space="preserve">Tá bom</w:t>
-      </w:r>
-      <w:r>
-        <w:t xml:space="preserve">”</w:t>
-      </w:r>
-      <w:r>
-        <w:t xml:space="preserve">, eu disse.</w:t>
+        <w:t xml:space="preserve">Tá bom, eu disse.</w:t>
       </w:r>
     </w:p>
     <w:p>
@@ -2328,7 +2272,7 @@
         <w:pStyle w:val="BodyText"/>
       </w:pPr>
       <w:r>
-        <w:t xml:space="preserve">Nem tudo daqueles anos era pesado. A gente morava na Woodridge Street, e Domino’s era a nossa pizza. Naquela época eles cumpriam a promessa: trinta minutos ou é de graça. O que eles não previram foi que nossa cidade tinha uma Woodridge Street e uma Woodridge Avenue, e o entregador ia para a Avenue todas as vezes. Ele chegava na nossa porta atrasado e pedindo desculpa, e a gente devolvia o dinheiro e ficava com a pizza. Domino’s de graça, vez após vez, porque um cara não conseguia diferenciar uma street de uma avenue. Eu e o Chris tínhamos certeza de que a gente tinha vencido o sistema.</w:t>
+        <w:t xml:space="preserve">Nem tudo daqueles anos era pesado. A gente morava na Woodridge Street, e Domino’s era a nossa pizza. Naquela época eles cumpriam a promessa: trinta minutos ou é de graça. O que eles não previram foi que nossa cidade tinha uma Woodridge Street e uma Woodridge Avenue, e o entregador ia para a Avenue todas as vezes. Ele chegava na nossa porta atrasado e pedindo desculpa, e ele devolvia o dinheiro e a gente ficava com a pizza. Domino’s de graça, vez após vez, porque um cara não conseguia diferenciar uma street de uma avenue. Eu e o Chris tínhamos certeza de que a gente tinha vencido o sistema.</w:t>
       </w:r>
     </w:p>
     <w:bookmarkStart w:id="27" w:name="claudio-e-rob"/>
@@ -2365,14 +2309,8 @@
         <w:pStyle w:val="BodyText"/>
       </w:pPr>
       <w:r>
-        <w:t xml:space="preserve">“</w:t>
-      </w:r>
-      <w:r>
         <w:t xml:space="preserve">Posso te chamar de pai?</w:t>
       </w:r>
-      <w:r>
-        <w:t xml:space="preserve">”</w:t>
-      </w:r>
     </w:p>
     <w:p>
       <w:pPr>
@@ -2387,28 +2325,7 @@
         <w:pStyle w:val="BodyText"/>
       </w:pPr>
       <w:r>
-        <w:t xml:space="preserve">“</w:t>
-      </w:r>
-      <w:r>
-        <w:t xml:space="preserve">Sim</w:t>
-      </w:r>
-      <w:r>
-        <w:t xml:space="preserve">”</w:t>
-      </w:r>
-      <w:r>
-        <w:t xml:space="preserve">, ele disse.</w:t>
-      </w:r>
-      <w:r>
-        <w:t xml:space="preserve"> </w:t>
-      </w:r>
-      <w:r>
-        <w:t xml:space="preserve">“</w:t>
-      </w:r>
-      <w:r>
-        <w:t xml:space="preserve">Claro, filho.</w:t>
-      </w:r>
-      <w:r>
-        <w:t xml:space="preserve">”</w:t>
+        <w:t xml:space="preserve">Sim, ele disse. Claro, filho.</w:t>
       </w:r>
     </w:p>
     <w:p>
@@ -2456,28 +2373,7 @@
         <w:pStyle w:val="BodyText"/>
       </w:pPr>
       <w:r>
-        <w:t xml:space="preserve">“</w:t>
-      </w:r>
-      <w:r>
-        <w:t xml:space="preserve">Querido</w:t>
-      </w:r>
-      <w:r>
-        <w:t xml:space="preserve">”</w:t>
-      </w:r>
-      <w:r>
-        <w:t xml:space="preserve">, ela dizia, pondo o papel de volta na minha carteira, batendo de leve no canto de cima com um dedo.</w:t>
-      </w:r>
-      <w:r>
-        <w:t xml:space="preserve"> </w:t>
-      </w:r>
-      <w:r>
-        <w:t xml:space="preserve">“</w:t>
-      </w:r>
-      <w:r>
-        <w:t xml:space="preserve">Lembra? Agora a gente escreve Robert.</w:t>
-      </w:r>
-      <w:r>
-        <w:t xml:space="preserve">”</w:t>
+        <w:t xml:space="preserve">Querido, ela dizia, pondo o papel de volta na minha carteira, batendo de leve no canto de cima com um dedo. Lembra? Agora a gente escreve Robert.</w:t>
       </w:r>
     </w:p>
     <w:p>
@@ -2592,145 +2488,127 @@
         <w:pStyle w:val="BodyText"/>
       </w:pPr>
       <w:r>
-        <w:t xml:space="preserve">“</w:t>
-      </w:r>
+        <w:t xml:space="preserve">Eu te amo tanto quanto amo meus próprios filhos. Ele me disse isso um dia em que eu estava desmoronando na frente dele, e segurou meu olhar até eu acreditar. Carreguei o nome dele antes de entender o que havia por trás. O que Lou me ensinou sobre ser homem se resume a poucas coisas, e nenhuma delas foi discurso.</w:t>
+      </w:r>
+    </w:p>
+    <w:p>
+      <w:pPr>
+        <w:pStyle w:val="BodyText"/>
+      </w:pPr>
+      <w:r>
+        <w:t xml:space="preserve">Você não reclama. Você não banca a vítima. Você aparece.</w:t>
+      </w:r>
+    </w:p>
+    <w:p>
+      <w:pPr>
+        <w:pStyle w:val="BodyText"/>
+      </w:pPr>
+      <w:r>
+        <w:t xml:space="preserve">Ele nunca me sentou para dizer essas palavras. Ele apenas as viveu na minha frente até que se tornaram minhas.</w:t>
+      </w:r>
+    </w:p>
+    <w:p>
+      <w:pPr>
+        <w:pStyle w:val="BodyText"/>
+      </w:pPr>
+      <w:r>
+        <w:t xml:space="preserve">Quando chegou a minha vez, foram os torneios de luta no interior do estado. Meu pai me levava até New York fim de semana após fim de semana, por mais longe que a chave nos levasse. Ele não falava dos quilômetros nem da saída cedo nem de que tinha trabalhado na noite anterior. Ele só entrava no carro, porque o filho dele estava lutando e era ali que ele devia estar. Se aquilo importava para um dos filhos, a distância não era motivo. Você aparecia.</w:t>
+      </w:r>
+    </w:p>
+    <w:p>
+      <w:pPr>
+        <w:pStyle w:val="BodyText"/>
+      </w:pPr>
+      <w:r>
+        <w:t xml:space="preserve">As viagens eram intermináveis. Cooperstown. New York City. Albany, para ver os Yankees da Double-A. Lehigh, lá na Pennsylvania. Philadelphia, onde ele levou Jon e a mim a um jogo entre Giants e Eagles. Alguém nas fileiras abaixo de nós tinha um cartaz: LT PREFERE COKE A PEPSI. Os problemas de Lawrence Taylor já eram piada pública naquela época. Lou desceu e arrancou o cartaz, e quase começou uma briga. Eu era criança; achei que era sobre futebol. Levei anos para me perguntar se era sobre outra coisa — se alguma parte dele simplesmente não conseguia ver um estádio rir de um homem pela coisa que o estava consumindo.</w:t>
+      </w:r>
+    </w:p>
+    <w:p>
+      <w:pPr>
+        <w:pStyle w:val="BodyText"/>
+      </w:pPr>
+      <w:r>
+        <w:t xml:space="preserve">Ele treinava beisebol, os Foxes e os Falcons, e a mim ele treinava com mais rigor do que a todos. A gente ia para o campo e ele me rebatia cem bolas, depois mais cem. Nas gaiolas de rebatida ele alimentava a máquina até minhas mãos ficarem em carne viva e eu mal conseguir segurar o bastão. Ele nunca me deixou desistir porque doía.</w:t>
+      </w:r>
+      <w:r>
+        <w:t xml:space="preserve"> </w:t>
+      </w:r>
+      <w:r>
+        <w:rPr>
+          <w:iCs/>
+          <w:i/>
+        </w:rPr>
+        <w:t xml:space="preserve">Fique na caixa. Encare o próximo arremesso.</w:t>
+      </w:r>
+      <w:r>
+        <w:t xml:space="preserve"> </w:t>
+      </w:r>
+      <w:r>
+        <w:t xml:space="preserve">Essa era a lição por baixo da lição.</w:t>
+      </w:r>
+    </w:p>
+    <w:p>
+      <w:pPr>
+        <w:pStyle w:val="BodyText"/>
+      </w:pPr>
+      <w:r>
+        <w:t xml:space="preserve">Chris e meu pai guardavam uma frase entre eles. Depois dos grandes momentos, uma escola, uma luta ganha a duras penas, um emprego, eles diziam baixinho um para o outro.</w:t>
+      </w:r>
+      <w:r>
+        <w:t xml:space="preserve"> </w:t>
+      </w:r>
+      <w:r>
+        <w:rPr>
+          <w:iCs/>
+          <w:i/>
+        </w:rPr>
+        <w:t xml:space="preserve">Ei, pai, a gente conseguiu.</w:t>
+      </w:r>
+      <w:r>
+        <w:t xml:space="preserve"> </w:t>
+      </w:r>
+      <w:r>
+        <w:t xml:space="preserve">Eu tinha a minha própria versão dela naquele carro voltando do interior, o silêncio depois de um longo dia, nós dois, a sensação de que tínhamos feito aquilo juntos. Essa era a ideia de amor do Lou. Não anunciada. Conquistada, juntos. E quando ele tinha orgulho de você, não dizia. Ele te dava um sorriso pequeno e um olhar, e o olhar dizia tudo.</w:t>
+      </w:r>
+    </w:p>
+    <w:p>
+      <w:pPr>
+        <w:pStyle w:val="BodyText"/>
+      </w:pPr>
+      <w:r>
+        <w:t xml:space="preserve">E não eram só as coisas grandes. Uma vez eu pedi White Castle, e o mais próximo ficava a uma hora de distância. Ele me levou. Uma hora de ida por um saco de hambúrgueres pequenos, porque o filho dele tinha vontade de comer. Quando precisei fazer um canal na faculdade em Ohio, ele dirigiu dez horas para me levar ao dentista e dez horas de volta. Um dia inteiro de estrada, por uma cadeira de dentista. Grande ou pequeno, divertido ou doloroso, se era meu, ele estava lá.</w:t>
+      </w:r>
+    </w:p>
+    <w:p>
+      <w:pPr>
+        <w:pStyle w:val="BodyText"/>
+      </w:pPr>
+      <w:r>
+        <w:t xml:space="preserve">E uma vez, foi muito maior que um torneio, um saco de hambúrgueres ou uma cadeira de dentista. Eu estava na faculdade em Oxford, Ohio, e estava num lugar escuro, do tipo em que você não encontra a saída, em que só admitir que precisa de ajuda já custa tudo o que você tem. Meu pai entrou no carro e dirigiu até Ohio. Ele veio como sempre tinha vindo, só que desta vez não era por um jogo.</w:t>
+      </w:r>
+    </w:p>
+    <w:p>
+      <w:pPr>
+        <w:pStyle w:val="BodyText"/>
+      </w:pPr>
+      <w:r>
+        <w:t xml:space="preserve">Depois veio West Palm Beach. Àquela altura eu não era mais criança. Era um homem adulto afundado no vício, sem opções. Meu pai pegou um avião e tirou o filho moribundo daquilo. Ele não me humilhou. Ele apareceu mais uma vez, quando aparecer significava salvar a minha vida.</w:t>
+      </w:r>
+    </w:p>
+    <w:p>
+      <w:pPr>
+        <w:pStyle w:val="BodyText"/>
+      </w:pPr>
+      <w:r>
+        <w:t xml:space="preserve">Eu desmoronei na frente dele uma vez. Já não me lembro do que tinha me levado àquilo, só que eu estava desfeito, do jeito que a gente só se permite ficar diante de alguém seguro. Ele não me mandou me recompor. Ele me deixou pôr tudo para fora, e então olhou para mim e disse com todas as letras.</w:t>
+      </w:r>
+    </w:p>
+    <w:p>
+      <w:pPr>
+        <w:pStyle w:val="BodyText"/>
+      </w:pPr>
       <w:r>
         <w:t xml:space="preserve">Eu te amo tanto quanto amo meus próprios filhos.</w:t>
-      </w:r>
-      <w:r>
-        <w:t xml:space="preserve">”</w:t>
-      </w:r>
-      <w:r>
-        <w:t xml:space="preserve"> </w:t>
-      </w:r>
-      <w:r>
-        <w:t xml:space="preserve">Ele me disse isso um dia em que eu estava desmoronado na frente dele, e segurou meu olhar até eu acreditar. Carreguei o nome dele antes de entender o que havia por trás. O que Lou me ensinou sobre ser homem se resume a poucas coisas, e nenhuma delas foi discurso.</w:t>
-      </w:r>
-    </w:p>
-    <w:p>
-      <w:pPr>
-        <w:pStyle w:val="BodyText"/>
-      </w:pPr>
-      <w:r>
-        <w:t xml:space="preserve">Você não reclama. Você não banca a vítima. Você aparece.</w:t>
-      </w:r>
-    </w:p>
-    <w:p>
-      <w:pPr>
-        <w:pStyle w:val="BodyText"/>
-      </w:pPr>
-      <w:r>
-        <w:t xml:space="preserve">Ele nunca me sentou para dizer essas palavras. Ele apenas as viveu na minha frente até que se tornaram minhas.</w:t>
-      </w:r>
-    </w:p>
-    <w:p>
-      <w:pPr>
-        <w:pStyle w:val="BodyText"/>
-      </w:pPr>
-      <w:r>
-        <w:t xml:space="preserve">Quando chegou a minha vez, foram os torneios de luta no interior do estado. Meu pai me levava até New York fim de semana após fim de semana, por mais longe que a chave nos levasse. Ele não falava dos quilômetros nem da saída cedo nem de que tinha trabalhado na noite anterior. Ele só entrava no carro, porque o filho dele estava lutando e era ali que ele devia estar. Se importava para um dos filhos dele, distância não era motivo. Você aparecia.</w:t>
-      </w:r>
-    </w:p>
-    <w:p>
-      <w:pPr>
-        <w:pStyle w:val="BodyText"/>
-      </w:pPr>
-      <w:r>
-        <w:t xml:space="preserve">As viagens eram intermináveis. Cooperstown. New York City. Albany, para ver os Yankees da Double-A. Lehigh, lá na Pennsylvania. Philadelphia, onde ele levou Jon e eu a um jogo entre Giants e Eagles. Alguém nas fileiras abaixo de nós tinha um cartaz: LT PREFERE COKE A PEPSI. Os problemas de Lawrence Taylor já eram piada pública naquela época. Lou desceu e arrancou o cartaz, e quase começou uma briga. Eu era criança; achei que era sobre futebol. Levei anos para me perguntar se era sobre outra coisa — se alguma parte dele simplesmente não conseguia ver um estádio rir de um homem pela coisa que o estava consumindo.</w:t>
-      </w:r>
-    </w:p>
-    <w:p>
-      <w:pPr>
-        <w:pStyle w:val="BodyText"/>
-      </w:pPr>
-      <w:r>
-        <w:t xml:space="preserve">Ele treinava beisebol, os Foxes e os Falcons, e a mim ele treinava com mais rigor do que a todos. A gente ia para o campo e ele me rebatia cem bolas, depois mais cem. Nas gaiolas de rebatida ele alimentava a máquina até minhas mãos ficarem em carne viva e eu mal conseguir segurar o bastão. Ele nunca me deixou desistir porque doía.</w:t>
-      </w:r>
-      <w:r>
-        <w:t xml:space="preserve"> </w:t>
-      </w:r>
-      <w:r>
-        <w:rPr>
-          <w:iCs/>
-          <w:i/>
-        </w:rPr>
-        <w:t xml:space="preserve">Fique na caixa. Encare o próximo arremesso.</w:t>
-      </w:r>
-      <w:r>
-        <w:t xml:space="preserve"> </w:t>
-      </w:r>
-      <w:r>
-        <w:t xml:space="preserve">Essa era a lição por baixo da lição.</w:t>
-      </w:r>
-    </w:p>
-    <w:p>
-      <w:pPr>
-        <w:pStyle w:val="BodyText"/>
-      </w:pPr>
-      <w:r>
-        <w:t xml:space="preserve">Chris e meu pai guardavam uma frase entre eles. Depois dos grandes momentos, uma escola, uma luta ganha a duras penas, um emprego, eles diziam baixinho um para o outro.</w:t>
-      </w:r>
-      <w:r>
-        <w:t xml:space="preserve"> </w:t>
-      </w:r>
-      <w:r>
-        <w:rPr>
-          <w:iCs/>
-          <w:i/>
-        </w:rPr>
-        <w:t xml:space="preserve">Ei, pai, a gente conseguiu.</w:t>
-      </w:r>
-      <w:r>
-        <w:t xml:space="preserve"> </w:t>
-      </w:r>
-      <w:r>
-        <w:t xml:space="preserve">Eu tinha a minha própria versão dela naquele carro voltando do interior, o silêncio depois de um longo dia, nós dois, a sensação de que tínhamos feito aquilo juntos. Essa era a ideia de amor do Lou. Não anunciada. Conquistada, juntos. E quando ele tinha orgulho de você, não dizia. Ele te dava um sorriso pequeno e um olhar, e o olhar dizia tudo.</w:t>
-      </w:r>
-    </w:p>
-    <w:p>
-      <w:pPr>
-        <w:pStyle w:val="BodyText"/>
-      </w:pPr>
-      <w:r>
-        <w:t xml:space="preserve">E não eram só as coisas grandes. Uma vez eu pedi White Castle, e o mais próximo ficava a uma hora de distância. Ele me levou. Uma hora de ida por um saco de hambúrgueres pequenos, porque o filho dele tinha vontade de comer. Quando precisei de um canal na faculdade em Ohio, ele dirigiu dez horas para me levar ao dentista e dez horas de volta. Um dia inteiro de estrada, por uma cadeira de dentista. Grande ou pequeno, divertido ou doloroso, se era meu, ele estava lá.</w:t>
-      </w:r>
-    </w:p>
-    <w:p>
-      <w:pPr>
-        <w:pStyle w:val="BodyText"/>
-      </w:pPr>
-      <w:r>
-        <w:t xml:space="preserve">E uma vez, foi muito maior que um torneio, um saco de hambúrgueres ou uma cadeira de dentista. Eu estava na faculdade em Oxford, Ohio, e estava num lugar escuro, do tipo em que você não encontra a saída, em que finalmente custa tudo o que você tem só para admitir que precisa de ajuda. Meu pai entrou no carro e dirigiu até Ohio. Ele veio como sempre tinha vindo, só que desta vez não era por um jogo.</w:t>
-      </w:r>
-    </w:p>
-    <w:p>
-      <w:pPr>
-        <w:pStyle w:val="BodyText"/>
-      </w:pPr>
-      <w:r>
-        <w:t xml:space="preserve">Depois veio West Palm Beach. Àquela altura eu não era mais criança. Era um homem adulto afundado no vício, sem opções. Meu pai pegou um avião e tirou o filho moribundo daquilo. Ele não me humilhou. Ele apareceu mais uma vez, quando aparecer significava salvar a minha vida.</w:t>
-      </w:r>
-    </w:p>
-    <w:p>
-      <w:pPr>
-        <w:pStyle w:val="BodyText"/>
-      </w:pPr>
-      <w:r>
-        <w:t xml:space="preserve">Eu desmoronei na frente dele uma vez. Já não me lembro do que tinha me levado àquilo, só que eu estava desfeito, do jeito que a gente só se permite ficar diante de alguém seguro. Ele não me mandou me recompor. Ele me deixou pôr tudo para fora, e então olhou para mim e disse com todas as letras.</w:t>
-      </w:r>
-    </w:p>
-    <w:p>
-      <w:pPr>
-        <w:pStyle w:val="BodyText"/>
-      </w:pPr>
-      <w:r>
-        <w:t xml:space="preserve">“</w:t>
-      </w:r>
-      <w:r>
-        <w:t xml:space="preserve">Eu te amo tanto quanto amo meus próprios filhos.</w:t>
-      </w:r>
-      <w:r>
-        <w:t xml:space="preserve">”</w:t>
       </w:r>
     </w:p>
     <w:p>
@@ -2807,7 +2685,7 @@
           <w:iCs/>
           <w:i/>
         </w:rPr>
-        <w:t xml:space="preserve">Em casa, o amor vinha de graça. Em todo lugar mais, eu achava que a gente tinha que conquistá-lo.</w:t>
+        <w:t xml:space="preserve">Em casa, o amor vinha de graça. Em qualquer outro lugar, eu achava que a gente tinha que conquistá-lo.</w:t>
       </w:r>
     </w:p>
     <w:p>
@@ -2900,7 +2778,7 @@
         <w:pStyle w:val="BodyText"/>
       </w:pPr>
       <w:r>
-        <w:t xml:space="preserve">Kris e Kyle eram irmãos gêmeos, os mais populares da série, e também sentavam ali, e nunca uma vez sequer entraram na brincadeira. Eles não impediam. Só me deixavam em paz, e ser deixado em paz pelos populares era o mais perto de seguro que aquela sala chegava. Lembrei os nomes deles por trinta anos. Nunca lembrei os nomes de quem fazia aquilo.</w:t>
+        <w:t xml:space="preserve">Kris e Kyle eram irmãos gêmeos, os mais populares da série, e também sentavam ali, e nunca uma vez sequer entraram na brincadeira. Eles não impediam. Só me deixavam em paz, e ser deixado em paz pelos populares era o mais perto de seguro que aquela sala chegava. Guardei os nomes deles por trinta anos. Nunca guardei os nomes de quem fazia aquilo.</w:t>
       </w:r>
     </w:p>
     <w:p>
@@ -2932,7 +2810,7 @@
         <w:pStyle w:val="BodyText"/>
       </w:pPr>
       <w:r>
-        <w:t xml:space="preserve">O primeiro lugar onde tive que aprender a aparecer por mim mesmo, com Lou assistindo da arquibancada, foi um tatame de luta. Eu tinha doze anos quando a luta surgiu pela primeira vez, e surgiu entre o Charlie e meu pai. Os dois conversaram sobre aquilo antes de alguém dizer uma palavra para mim. Não era uma leitura de talento algum. Eu não tinha nenhum. Era desajeitado, franzino, o menino escolhido lá pelo meio na aula de educação física, não por último, o que teria dado uma história, só no meio. Foi um palpite, do jeito que as pessoas apontam uma criança para alguma coisa porque nada mais pegou.</w:t>
+        <w:t xml:space="preserve">O primeiro lugar onde tive que aprender a aparecer por mim mesmo, com Lou assistindo da arquibancada, foi um tatame de luta. Eu tinha doze anos quando a luta surgiu pela primeira vez, e surgiu entre o Charlie e meu pai. Os dois conversaram sobre aquilo antes de alguém dizer uma palavra para mim. Não era que tivessem visto algum talento. Eu não tinha nenhum. Era desajeitado, franzino, o menino escolhido lá pelo meio na aula de educação física, não por último, o que teria dado uma história, só no meio. Foi um palpite, do jeito que as pessoas apontam uma criança para alguma coisa porque nada mais pegou.</w:t>
       </w:r>
     </w:p>
     <w:p>
@@ -2964,7 +2842,7 @@
         <w:pStyle w:val="BodyText"/>
       </w:pPr>
       <w:r>
-        <w:t xml:space="preserve">Naquele primeiro ano, antes de eu ter ganhado qualquer coisa, meu pai me levou para assistir ao torneio do condado. Eu tinha doze anos, novato total, sentado lá em cima na arquibancada olhando os tatames lá embaixo. Um menino de Ramsey venceu uma única luta no torneio inteiro, e na nossa cidade isso já contava como algo importante. Havia quarenta e oito nomes em cada chave, uma parede deles, e ter a mão erguida nem que fosse uma vez numa multidão daquelas significava alguma coisa. Meu pai olhou os tatames lá embaixo, depois olhou para mim, e disse como um fato que já tinha. Um dia você vai ganhar uma luta aqui. Eu não acreditei nele nem por um segundo. Ele acreditou.</w:t>
+        <w:t xml:space="preserve">Naquele primeiro ano, antes de eu ter ganhado qualquer coisa, meu pai me levou para assistir ao torneio do condado. Eu tinha doze anos, novato total, sentado lá em cima na arquibancada olhando os tatames lá embaixo. Um menino de Ramsey venceu uma única luta no torneio inteiro, e na nossa cidade isso já contava como algo importante. Havia quarenta e oito nomes em cada chave, uma parede deles, e ter a mão erguida nem que fosse uma vez numa multidão daquelas significava alguma coisa. Meu pai olhou os tatames lá embaixo, depois olhou para mim, e disse aquilo como quem constata um fato. Um dia você vai ganhar uma luta aqui. Eu não acreditei nele nem por um segundo. Ele acreditou.</w:t>
       </w:r>
     </w:p>
     <w:p>
@@ -2988,7 +2866,7 @@
         <w:pStyle w:val="BodyText"/>
       </w:pPr>
       <w:r>
-        <w:t xml:space="preserve">O treino era o mesmo todo dia. Corrida primeiro, depois exercícios, entradas, sprawls, saídas, até os movimentos viverem abaixo do pensamento. Minhas pernas sabiam quando mudar de nível; minhas mãos sabiam onde achar um pulso. Então o treinador chamava luta livre e era em velocidade total. Cair na base, joelhos flexionados, mãos à frente, olhos entre os ombros e os quadris dele. O apito, e a gente se fechava, testas juntas, mãos brigando por posição, o trabalho acontecendo em ajustes pequenos demais para se ler da arquibancada. No tatame você sentia tudo, cada mudança de peso, cada meio segundo de hesitação. Você não conseguia se esconder. Em todo lugar mais eu podia construir a versão de mim que a sala queria. Ali não.</w:t>
+        <w:t xml:space="preserve">O treino era o mesmo todo dia. Corrida primeiro, depois exercícios, entradas, sprawls, saídas, até os movimentos viverem abaixo do pensamento. Minhas pernas sabiam quando mudar de nível; minhas mãos sabiam onde achar um pulso. Então o treinador chamava luta livre e era em velocidade total. Cair na base, joelhos flexionados, mãos à frente, olhos entre os ombros e os quadris dele. O apito, e a gente se fechava, testas juntas, mãos brigando por posição, o trabalho acontecendo em ajustes pequenos demais para se ler da arquibancada. No tatame você sentia tudo, cada mudança de peso, cada meio segundo de hesitação. Você não conseguia se esconder. Em qualquer outro lugar eu podia construir a versão de mim que a sala queria. Ali não.</w:t>
       </w:r>
     </w:p>
     <w:p>
@@ -3028,7 +2906,7 @@
         <w:pStyle w:val="BodyText"/>
       </w:pPr>
       <w:r>
-        <w:t xml:space="preserve">Ele estava sempre na arquibancada. Quase nunca perdeu uma luta em quatro anos de ensino médio, nem aquela de dezenove segundos, nem as apertadas que deram errado, nem as boas quando o trabalho começou a aparecer. Terceira fila, em geral. Braços cruzados, não em julgamento, em atenção, ou a filmadora ligada e gravando. A luta era a única coisa que ele filmava, a única razão de ele ter o aparelho. Minha mãe e a tia Nancey também estavam lá. Todas as lutas. E depois de cada pesagem, quando eu tinha me matado de fome até o número por dias, minha mãe estava lá com sanduíches de frango do Wendy’s, prontos no segundo em que eu batia o peso. Ela sempre parecia saber o que uma coisa tinha me custado, e sempre tinha a comida esperando. Era assim que ela amava você. Ela te alimentava.</w:t>
+        <w:t xml:space="preserve">Ele estava sempre na arquibancada. Quase nunca faltou a uma luta em quatro anos de ensino médio, nem à de dezenove segundos, nem às apertadas que deram errado, nem às boas quando o trabalho começou a aparecer. Terceira fila, em geral. Braços cruzados, não em julgamento, em atenção, ou a filmadora ligada e gravando. A luta era a única coisa que ele filmava, a única razão de ele ter o aparelho. Minha mãe e a tia Nancey também estavam lá. Todas as lutas. E depois de cada pesagem, quando eu tinha me matado de fome até o número por dias, minha mãe estava lá com sanduíches de frango do Wendy’s, prontos no segundo em que eu batia o peso. Ela sempre parecia saber o que uma coisa tinha me custado, e sempre tinha a comida esperando. Era assim que ela amava você. Ela te alimentava.</w:t>
       </w:r>
     </w:p>
     <w:bookmarkStart w:id="32" w:name="cooperstown"/>
@@ -3069,42 +2947,24 @@
         <w:pStyle w:val="BodyText"/>
       </w:pPr>
       <w:r>
-        <w:t xml:space="preserve">“</w:t>
-      </w:r>
-      <w:r>
         <w:t xml:space="preserve">Quer dar uma volta?</w:t>
       </w:r>
-      <w:r>
-        <w:t xml:space="preserve">”</w:t>
-      </w:r>
-    </w:p>
-    <w:p>
-      <w:pPr>
-        <w:pStyle w:val="BodyText"/>
-      </w:pPr>
-      <w:r>
-        <w:t xml:space="preserve">“</w:t>
-      </w:r>
+    </w:p>
+    <w:p>
+      <w:pPr>
+        <w:pStyle w:val="BodyText"/>
+      </w:pPr>
       <w:r>
         <w:t xml:space="preserve">Onde a gente vai?</w:t>
       </w:r>
-      <w:r>
-        <w:t xml:space="preserve">”</w:t>
-      </w:r>
-    </w:p>
-    <w:p>
-      <w:pPr>
-        <w:pStyle w:val="BodyText"/>
-      </w:pPr>
-      <w:r>
-        <w:t xml:space="preserve">“</w:t>
-      </w:r>
+    </w:p>
+    <w:p>
+      <w:pPr>
+        <w:pStyle w:val="BodyText"/>
+      </w:pPr>
       <w:r>
         <w:t xml:space="preserve">É surpresa.</w:t>
       </w:r>
-      <w:r>
-        <w:t xml:space="preserve">”</w:t>
-      </w:r>
     </w:p>
     <w:p>
       <w:pPr>
@@ -3127,33 +2987,15 @@
         <w:pStyle w:val="BodyText"/>
       </w:pPr>
       <w:r>
-        <w:t xml:space="preserve">“</w:t>
-      </w:r>
-      <w:r>
         <w:t xml:space="preserve">Pai. Onde a gente vai?</w:t>
       </w:r>
-      <w:r>
-        <w:t xml:space="preserve">”</w:t>
-      </w:r>
-    </w:p>
-    <w:p>
-      <w:pPr>
-        <w:pStyle w:val="BodyText"/>
-      </w:pPr>
-      <w:r>
-        <w:t xml:space="preserve">Ele olhou para o lado, sorrindo um pouco.</w:t>
-      </w:r>
-      <w:r>
-        <w:t xml:space="preserve"> </w:t>
-      </w:r>
-      <w:r>
-        <w:t xml:space="preserve">“</w:t>
-      </w:r>
-      <w:r>
-        <w:t xml:space="preserve">Cooperstown.</w:t>
-      </w:r>
-      <w:r>
-        <w:t xml:space="preserve">”</w:t>
+    </w:p>
+    <w:p>
+      <w:pPr>
+        <w:pStyle w:val="BodyText"/>
+      </w:pPr>
+      <w:r>
+        <w:t xml:space="preserve">Ele olhou para o lado, sorrindo um pouco. Cooperstown.</w:t>
       </w:r>
     </w:p>
     <w:p>
@@ -3177,13 +3019,7 @@
         <w:pStyle w:val="BodyText"/>
       </w:pPr>
       <w:r>
-        <w:t xml:space="preserve">“</w:t>
-      </w:r>
-      <w:r>
         <w:t xml:space="preserve">Essa é uma bola do Babe Ruth.</w:t>
-      </w:r>
-      <w:r>
-        <w:t xml:space="preserve">”</w:t>
       </w:r>
     </w:p>
     <w:p>
@@ -3378,7 +3214,7 @@
         <w:pStyle w:val="BodyText"/>
       </w:pPr>
       <w:r>
-        <w:t xml:space="preserve">Eu não conseguia absorver nada daquilo. A distância entre quem todos de repente diziam que eu era e quem eu sabia que era, era ampla demais para atravessar. A conquista era real. A sensação de que eu a tinha merecido não estava lá, e não estaria por anos. Eu sentiria a mesma coisa depois, na MTV com câmeras apontadas para mim, a mesma pergunta silenciosa correndo por baixo de tudo: quem sou eu para ser alguém? Levaria muito tempo, e perder quase tudo, antes que eu pudesse ficar de pé numa sala e acreditar que pertencia a ela.</w:t>
+        <w:t xml:space="preserve">Eu não conseguia absorver nada daquilo. A distância entre quem todos de repente diziam que eu era e quem eu sabia que era, era grande demais para atravessar. A conquista era real. A sensação de que eu a tinha merecido não estava lá, e não estaria por anos. Eu sentiria a mesma coisa depois, na MTV com câmeras apontadas para mim, a mesma pergunta silenciosa correndo por baixo de tudo: quem sou eu para ser alguém? Levaria muito tempo, e perder quase tudo, antes que eu pudesse ficar de pé numa sala e acreditar que pertencia a ela.</w:t>
       </w:r>
     </w:p>
     <w:bookmarkEnd w:id="35"/>
@@ -3400,7 +3236,7 @@
         <w:pStyle w:val="FirstParagraph"/>
       </w:pPr>
       <w:r>
-        <w:t xml:space="preserve">No terceiro ano cortei dezenove libras na semana do torneio, depois comi tão descontroladamente depois da pesagem que vomitei duas vezes no tatame durante uma luta contra um cara que tinha duas vitórias sobre mim. O árbitro parou a luta. Greeny, o treinador Greenshields, pegou uma toalha, me limpou, me mandou de volta. Venci a luta e o torneio.</w:t>
+        <w:t xml:space="preserve">No terceiro ano cortei dezenove libras na semana do torneio e comi de forma tão descontrolada depois da pesagem que vomitei duas vezes no tatame durante uma luta contra um cara que tinha duas vitórias sobre mim. O árbitro parou a luta. Greeny, o treinador Greenshields, pegou uma toalha, me limpou, me mandou de volta. Venci a luta e o torneio.</w:t>
       </w:r>
     </w:p>
     <w:p>
@@ -3428,25 +3264,7 @@
         <w:pStyle w:val="BodyText"/>
       </w:pPr>
       <w:r>
-        <w:t xml:space="preserve">Venci minha semifinal, perdi uma apertada na final, mesmo assim fui ao Estadual. Terminei 18–4. Depois daquela luta Lou sentou comigo enquanto eu recuperava o fôlego e a chave seguia sem a gente. Então:</w:t>
-      </w:r>
-      <w:r>
-        <w:t xml:space="preserve"> </w:t>
-      </w:r>
-      <w:r>
-        <w:t xml:space="preserve">“</w:t>
-      </w:r>
-      <w:r>
-        <w:t xml:space="preserve">É isso que você é.</w:t>
-      </w:r>
-      <w:r>
-        <w:t xml:space="preserve">”</w:t>
-      </w:r>
-      <w:r>
-        <w:t xml:space="preserve"> </w:t>
-      </w:r>
-      <w:r>
-        <w:t xml:space="preserve">Não boa luta. Não eu sabia que você conseguia. É isso que você é. Eu só assenti. Para ele, aquilo bastava.</w:t>
+        <w:t xml:space="preserve">Venci minha semifinal, perdi uma apertada na final, mesmo assim fui ao Estadual. Terminei 18–4. Depois daquela luta Lou sentou comigo enquanto eu recuperava o fôlego e a chave seguia sem a gente. Então: É isso que você é. Não boa luta. Não eu sabia que você conseguia. É isso que você é. Eu só assenti. Para ele, aquilo bastava.</w:t>
       </w:r>
     </w:p>
     <w:bookmarkEnd w:id="36"/>
@@ -3468,7 +3286,7 @@
         <w:pStyle w:val="FirstParagraph"/>
       </w:pPr>
       <w:r>
-        <w:t xml:space="preserve">Eu estava no ensino fundamental quando recebi a notícia sobre Charlie. Ele e Nancey tinham se separado e ele tinha derivado para algum lugar mais difícil de alcançar. A doença o tinha, a mesma que veio atrás de mim uma década depois, embora eu ainda não soubesse disso. Meu pai foi quem foi buscá-lo, encontrou-o sozinho no apartamento do jeito que se encontra alguém que deixou de conseguir cuidar de si mesmo. Charlie morreu uns quatro anos depois disso. Nunca soube se ele ficou sóbrio lá dentro. Ele me pareceu sóbrio quando o vi — mas uma criança lê o que quer ler, e até hoje não sei te dizer se aqueles últimos anos foram limpos ou se a doença tinha só ficado quieta.</w:t>
+        <w:t xml:space="preserve">Eu estava no ensino fundamental quando recebi a notícia sobre Charlie. Ele e Nancey tinham se separado e ele tinha derivado para algum lugar mais difícil de alcançar. A doença o tinha, a mesma que veio atrás de mim uma década depois, embora eu ainda não soubesse disso. Meu pai foi quem foi até lá buscá-lo, e o encontrou sozinho no apartamento, do jeito que se encontra alguém que deixou de conseguir cuidar de si mesmo. Charlie morreu uns quatro anos depois disso. Nunca soube se ele ficou sóbrio lá dentro. Ele me pareceu sóbrio quando o vi — mas uma criança lê o que quer ler, e até hoje não sei te dizer se aqueles últimos anos foram limpos ou se a doença tinha só ficado quieta.</w:t>
       </w:r>
     </w:p>
     <w:p>
@@ -3484,7 +3302,7 @@
         <w:pStyle w:val="BodyText"/>
       </w:pPr>
       <w:r>
-        <w:t xml:space="preserve">Eis o que fica comigo agora: Lou entrou naquele apartamento antes de algum dia entrar no meu. Quando ele veio me buscar em West Palm Beach anos depois e me encontrou no escuro, não era a primeira vez que fazia aquilo. Ele já tinha entrado num quarto onde alguém que amava estava se perdendo, e não tinha bastado. Ele veio me buscar mesmo assim, sabendo como aquilo pode terminar.</w:t>
+        <w:t xml:space="preserve">Eis o que fica comigo agora: Lou entrou naquele apartamento antes de um dia entrar no meu. Quando ele veio me buscar em West Palm Beach anos depois e me encontrou no escuro, não era a primeira vez que fazia aquilo. Ele já tinha entrado num quarto onde alguém que amava estava se perdendo, e não tinha bastado. Ele veio me buscar mesmo assim, sabendo como aquilo pode terminar.</w:t>
       </w:r>
     </w:p>
     <w:bookmarkEnd w:id="37"/>
@@ -3570,7 +3388,7 @@
         <w:pStyle w:val="BodyText"/>
       </w:pPr>
       <w:r>
-        <w:t xml:space="preserve">Ele é complicado. Inteligente. Polido e estratégico, um sujeito de alto desempenho no sentido verdadeiro. E ainda assim, a primeira coisa que qualquer um diz sobre ele é que é gentil. De um jeito silencioso, constante. Ele é meu melhor amigo. Seguimos caminhos diferentes e processamos a mesma infância de formas diferentes, mas não há ninguém que eu prefira que me ligue na manhã de Natal, ninguém que eu prefira ter ao meu lado à beira de um túmulo. Lou construiu nós dois, de formas diferentes, e nunca nos comparou. Ele apareceu pelos recordes do Chris e pelo meu título do condado com o mesmo orgulho.</w:t>
+        <w:t xml:space="preserve">Ele é complicado. Inteligente. Polido e estratégico, um sujeito de alto desempenho no sentido verdadeiro. E ainda assim, a primeira coisa que qualquer um diz sobre ele é que é gentil. De um jeito silencioso, constante. Ele é meu melhor amigo. Seguimos caminhos diferentes e processamos a mesma infância de formas diferentes, mas não há ninguém que eu prefira que me ligue na manhã de Natal, ninguém que eu prefira ter ao meu lado à beira de um túmulo. Lou construiu a nós dois, de formas diferentes, e nunca nos comparou. Ele apareceu pelos recordes do Chris e pelo meu título do condado com o mesmo orgulho.</w:t>
       </w:r>
     </w:p>
     <w:bookmarkEnd w:id="39"/>
@@ -3608,7 +3426,7 @@
         <w:pStyle w:val="BodyText"/>
       </w:pPr>
       <w:r>
-        <w:t xml:space="preserve">Um momento no Campeonato do Condado: eu estava prestes a lutar pelo título e meu Walkman foi roubado. Eu precisava dele para aquecer. Lou não me deu sermão. Ele dirigiu até a Best Buy e me comprou um novo. Anos depois eu disse, pai, você sempre fez tudo o que eu pedia. Ele pausou do jeito que pausava antes de algo verdadeiro. Rob. Houve vezes em que aquilo era os últimos vinte dólares que eu tinha no bolso. E eu dei a você. Sem ressentimento. Só um fato. Eu não sabia o que dizer. Ainda não sei.</w:t>
+        <w:t xml:space="preserve">Um momento no Campeonato do Condado: eu estava prestes a lutar pelo título e meu Walkman foi roubado. Eu precisava dele para aquecer. Lou não me deu sermão. Ele dirigiu até a Best Buy e me comprou um novo. Anos depois eu disse, pai, você sempre fez tudo o que eu pedia. Ele fez uma pausa, do jeito que fazia antes de algo verdadeiro. Rob. Houve vezes em que aquilo eram os últimos vinte dólares que eu tinha no bolso. E eu dei a você. Sem ressentimento. Só um fato. Eu não sabia o que dizer. Ainda não sei.</w:t>
       </w:r>
     </w:p>
     <w:p>
@@ -3638,7 +3456,7 @@
         <w:pStyle w:val="FirstParagraph"/>
       </w:pPr>
       <w:r>
-        <w:t xml:space="preserve">Os anos de luta deixaram marcas que ainda sinto. Por muito tempo meu corpo não parecia meu. Era algo a administrar, um número a bater, prova de que eu merecia meu lugar. A comida seguiu complicada, algumas refeições eram refeições livres, outras eu comia magro. Quando a vida parecia fora de controle, perder peso ainda era o primeiro pensamento que voltava. O mesmo impulso que cortou dezenove libras para bater o peso depois foi procurar outras formas de anestesiar tudo. Levei anos para fazer as pazes com meu corpo, e não foi disciplina que me levou até lá. Foi Lou me dizendo, sem rodeios, que me amava tanto quanto os próprios filhos, e as refeições silenciosas da minha mãe. Alguns dias eu ainda tenho que escolher essa paz de propósito. Fica mais fácil a cada ano.</w:t>
+        <w:t xml:space="preserve">Os anos de luta deixaram marcas que ainda sinto. Por muito tempo meu corpo não parecia meu. Era algo a administrar, um número a bater, prova de que eu merecia meu lugar. A comida seguiu complicada, algumas refeições eram livres, outras eu comia restrito. Quando a vida parecia fora de controle, perder peso ainda era o primeiro pensamento que voltava. O mesmo impulso que cortou dezenove libras para bater o peso depois foi procurar outras formas de anestesiar tudo. Levei anos para fazer as pazes com meu corpo, e não foi disciplina que me levou até lá. Foi Lou me dizendo, sem rodeios, que me amava tanto quanto os próprios filhos, e as refeições silenciosas da minha mãe. Alguns dias eu ainda tenho que escolher essa paz de propósito. Fica mais fácil a cada ano.</w:t>
       </w:r>
     </w:p>
     <w:p>
@@ -3729,7 +3547,7 @@
         <w:pStyle w:val="BodyText"/>
       </w:pPr>
       <w:r>
-        <w:t xml:space="preserve">De fora, nossa vida parecia estável. Uma casa. Carros na garagem. Comida na mesa, treino de luta, as contas pagas, a rotina se mantendo. Eu não via o quanto tudo aquilo se sustentava por ele levantar da cama toda manhã.</w:t>
+        <w:t xml:space="preserve">De fora, nossa vida parecia estável. Uma casa. Carros na garagem. Comida na mesa, treino de luta, as contas pagas, a rotina se mantendo. Eu não via o quanto tudo aquilo dependia de ele levantar da cama toda manhã.</w:t>
       </w:r>
     </w:p>
     <w:p>
@@ -3761,7 +3579,7 @@
         <w:pStyle w:val="BodyText"/>
       </w:pPr>
       <w:r>
-        <w:t xml:space="preserve">O recrutador tinha falado com ele na lata, do jeito que se diz a um homem uma coisa para o próprio bem dele. Você quer uma chance de verdade, ele disse, tem que pintar o grisalho. Vão olhar para você e ver um velho. Um homem feito, um marido, um pai, ouvindo que tinha que parecer mais novo do que era para valer uma chance. Esse detalhe nunca me deixou.</w:t>
+        <w:t xml:space="preserve">O recrutador tinha falado com ele na lata, do jeito que se diz a um homem uma coisa para o próprio bem. Você quer uma chance de verdade, ele disse, tem que pintar o grisalho. Vão olhar para você e ver um velho. Um homem feito, um marido, um pai, ouvindo que tinha que parecer mais novo do que era para valer uma chance. Esse detalhe nunca me deixou.</w:t>
       </w:r>
     </w:p>
     <w:p>
@@ -3899,7 +3717,7 @@
         <w:pStyle w:val="BodyText"/>
       </w:pPr>
       <w:r>
-        <w:t xml:space="preserve">Eles me sentavam com esses livros-razão gigantes e eu virava as páginas como se soubesse o que estava fazendo. Sempre eram gentis a respeito. Você quer café, bolo, rosquinhas? Eu dizia não, virava páginas por uma hora, ia embora.</w:t>
+        <w:t xml:space="preserve">Eles me sentavam com esses livros-razão gigantes e eu virava as páginas como se soubesse o que estava fazendo. Eram sempre gentis quanto a isso. Você quer café, bolo, rosquinhas? Eu dizia não, virava páginas por uma hora, ia embora.</w:t>
       </w:r>
     </w:p>
     <w:p>
@@ -3971,7 +3789,7 @@
         <w:pStyle w:val="BodyText"/>
       </w:pPr>
       <w:r>
-        <w:t xml:space="preserve">São os Rascals. Quando aquilo não caiu a ficha, ela tentou de novo. Você conhece</w:t>
+        <w:t xml:space="preserve">São os Rascals. Quando a ficha não caiu, ela tentou de novo. Você conhece</w:t>
       </w:r>
       <w:r>
         <w:t xml:space="preserve"> </w:t>
@@ -4062,7 +3880,7 @@
         <w:pStyle w:val="FirstParagraph"/>
       </w:pPr>
       <w:r>
-        <w:t xml:space="preserve">Se você só conhecesse os discos de ouro e as sedes de sindicato, perderia a metade dele que eu mais amava — a que ficava em casa, aplicando pequenos golpes no próprio filho pelo puro prazer disso. Ele parecia com o Robert De Niro, meu pai. Mesmo porte, mesmo rosto, o homem que o elenco manda quando o papel pede alguém com quem você não quer se meter. Aí ele abria a boca e te dizia que o gramado estava sendo cuidado por um bode.</w:t>
+        <w:t xml:space="preserve">Se você só conhecesse os discos de ouro e as sedes de sindicato, perderia a metade dele que eu mais amava — a que ficava em casa, aplicando pequenos golpes no próprio filho pelo puro prazer disso. Ele se parecia com o Robert De Niro, meu pai. Mesmo porte, mesmo rosto, o homem que a produção escala quando o papel pede alguém com quem você não quer se meter. Aí ele abria a boca e te dizia que o gramado estava sendo cuidado por um bode.</w:t>
       </w:r>
     </w:p>
     <w:p>
@@ -4094,7 +3912,7 @@
         <w:pStyle w:val="BodyText"/>
       </w:pPr>
       <w:r>
-        <w:t xml:space="preserve">Em algumas tardes ele gravava um jogo dos Yankees que já tinha acontecido, e depois botava para eu ver como se fosse ao vivo. O Rickey Henderson vai fazer um home run aqui, ele dizia. E o Henderson mandava para longe. Eu era um menininho. Achava que meu pai conseguia ver o futuro. Ele me deixou acreditar nisso por anos antes de me contar que já tinha assistido a coisa toda.</w:t>
+        <w:t xml:space="preserve">Em algumas tardes ele gravava um jogo dos Yankees que já tinha acontecido, e depois botava para eu ver como se fosse ao vivo. O Rickey Henderson vai fazer um home run aqui, ele dizia. E o Henderson mandava para longe. Eu era um menininho. Achava que meu pai conseguia ver o futuro. Ele me deixou acreditar nisso por anos antes de me contar que já tinha assistido à coisa toda.</w:t>
       </w:r>
     </w:p>
     <w:p>
@@ -4217,15 +4035,15 @@
         <w:pStyle w:val="BodyText"/>
       </w:pPr>
       <w:r>
-        <w:t xml:space="preserve">A primeira vez que eu a vi, meu pai me levou de carro para uma visita de luta. Saímos da rodovia e o mundo virou milho — pés de milho em todas as direções, quilômetro após quilômetro plano, o tipo de vazio para o qual um menino de Jersey não tem categoria. Parecia que a gente tinha feito uma conversão errada e ido parar em Iowa. Aonde a gente vai afinal, eu ficava pensando, aqui no meio do nada. Aí os campos deram lugar e lá estava: tijolo vermelho e árvores antigas, um dos campi mais bonitos que eu já tinha visto, plantado no meio de toda aquela lavoura.</w:t>
-      </w:r>
-    </w:p>
-    <w:p>
-      <w:pPr>
-        <w:pStyle w:val="BodyText"/>
-      </w:pPr>
-      <w:r>
-        <w:t xml:space="preserve">Antes mesmo de pisar no campus, houve uma festa em New Jersey. A Tricia Hart organizou, um encontro para a garotada que ia para Miami naquele outono. Naquela noite conheci o Dean Ferrera, de Hawthorne, e gente que ia importar por anos. Eu gostava de ir para uma faculdade em Ohio já conhecendo alguns rostos. O Dean virou um dos meus melhores amigos.</w:t>
+        <w:t xml:space="preserve">A primeira vez que eu a vi, meu pai me levou de carro para uma visita de luta. Saímos da rodovia e o mundo virou milho — pés de milho em todas as direções, quilômetro após quilômetro plano, o tipo de vazio para o qual um menino de Jersey não tem categoria. Parecia que a gente tinha feito uma curva errada e ido parar em Iowa. Aonde a gente vai afinal, eu ficava pensando, aqui no meio do nada. Aí os campos deram lugar e lá estava: tijolo vermelho e árvores antigas, um dos campi mais bonitos que eu já tinha visto, plantado no meio de toda aquela lavoura.</w:t>
+      </w:r>
+    </w:p>
+    <w:p>
+      <w:pPr>
+        <w:pStyle w:val="BodyText"/>
+      </w:pPr>
+      <w:r>
+        <w:t xml:space="preserve">Antes mesmo de pisar no campus, houve uma festa em New Jersey. A Tricia Hart organizou, um encontro para a garotada que ia para Miami naquele outono. Naquela noite conheci o Dean Ferrera, de Hawthorne, e gente que seria importante por anos. Eu gostava de ir para uma faculdade em Ohio já conhecendo alguns rostos. O Dean virou um dos meus melhores amigos.</w:t>
       </w:r>
     </w:p>
     <w:p>
@@ -4277,7 +4095,7 @@
         <w:pStyle w:val="BodyText"/>
       </w:pPr>
       <w:r>
-        <w:t xml:space="preserve">Era essa a versão de mim que eu estava construindo em Miami. Não o Claudio. O Rob — campeão de luta do condado, aluno de Miami, americano. Ninguém aqui sabia quem eu tinha sido antes de chegar. Ser o garoto de pele mais escura num campus quase todo branquelo me deu alguma coisa, e eu me conectei de jeitos que não tinham vindo com tanta facilidade no ensino médio.</w:t>
+        <w:t xml:space="preserve">Era essa a versão de mim que eu estava construindo em Miami. Não o Claudio. O Rob — campeão de luta do condado, aluno de Miami, americano. Ninguém aqui sabia quem eu tinha sido antes de chegar. Ser o garoto de pele mais escura num campus quase todo branco me deu alguma coisa, e eu me conectei de jeitos que não tinham vindo com tanta facilidade no ensino médio.</w:t>
       </w:r>
     </w:p>
     <w:p>
@@ -4309,15 +4127,15 @@
         <w:pStyle w:val="BodyText"/>
       </w:pPr>
       <w:r>
-        <w:t xml:space="preserve">Então eu tive que descobrir o que estava fazendo ali. Fui transferido para a Richard T. Farmer School of Business e me declarei de marketing. Por que marketing? Porque eu era ruim em todo o resto e sabia falar. As pessoas perguntam por que eu fui para vendas e a resposta é essa.</w:t>
-      </w:r>
-    </w:p>
-    <w:p>
-      <w:pPr>
-        <w:pStyle w:val="BodyText"/>
-      </w:pPr>
-      <w:r>
-        <w:t xml:space="preserve">A Kappa Sigma fez uma coisa que eu não esperava. Depois do recrutamento padrão, eles voltaram atrás de mim. Não uma carta genérica — um pedido específico. Eu conhecia a sensação. O envelope fino do treinador. O Lou entrando na vida da minha mãe e não indo embora. Eu entrei. Pela primeira vez eu não era o lutador. Eu era só o Rob, ainda tentando entender o que isso queria dizer.</w:t>
+        <w:t xml:space="preserve">Então eu tive que descobrir o que estava fazendo ali. Fui transferido para a Richard T. Farmer School of Business e escolhi marketing. Por que marketing? Porque eu era ruim em todo o resto e sabia falar. As pessoas perguntam por que eu fui para vendas e a resposta é essa.</w:t>
+      </w:r>
+    </w:p>
+    <w:p>
+      <w:pPr>
+        <w:pStyle w:val="BodyText"/>
+      </w:pPr>
+      <w:r>
+        <w:t xml:space="preserve">A Kappa Sigma fez uma coisa que eu não esperava. Depois do recrutamento padrão, eles vieram atrás de mim. Não uma carta genérica — um pedido específico. Eu conhecia a sensação. O envelope fino do treinador. O Lou entrando na vida da minha mãe e não indo embora. Eu entrei. Pela primeira vez eu não era o lutador. Eu era só o Rob, ainda tentando entender o que isso queria dizer.</w:t>
       </w:r>
     </w:p>
     <w:p>
@@ -4333,7 +4151,7 @@
         <w:pStyle w:val="BodyText"/>
       </w:pPr>
       <w:r>
-        <w:t xml:space="preserve">Eu bebia. Todo mundo bebia; era esse o disfarce. Levaria anos até eu entender que nem todo mundo bebia do jeito que eu bebia. Não vou glamurizar, mas as festas eram ótimas — a diversão que você sabe que não vai durar, o que é parte do motivo de ela ter importado. No terceiro ano morei na casa da fraternidade. Por baixo de tudo havia uma insegurança que eu não conseguia sacudir. A luta, a fraternidade, os amigos, e ainda assim alguma parte de mim não acreditava que nada daquilo fosse real.</w:t>
+        <w:t xml:space="preserve">Eu bebia. Todo mundo bebia; era esse o disfarce. Levaria anos até eu entender que nem todo mundo bebia do jeito que eu bebia. Não vou glamurizar, mas as festas eram ótimas — a diversão que você sabe que não vai durar, o que é parte do motivo de ela ter importado. No terceiro ano morei na casa da fraternidade. Por baixo de tudo havia uma insegurança da qual eu não conseguia me livrar. A luta, a fraternidade, os amigos, e ainda assim alguma parte de mim não acreditava que nada daquilo fosse real.</w:t>
       </w:r>
     </w:p>
     <w:p>
@@ -4455,7 +4273,7 @@
         <w:pStyle w:val="BodyText"/>
       </w:pPr>
       <w:r>
-        <w:t xml:space="preserve">O programa foi ao ar oito vezes por dia durante três meses. De volta a Oxford, os carros diminuíam a velocidade, as pessoas apontavam, estranhos nas festas se viravam para a gente com um carinho de que eu nunca tinha sido o destinatário antes. Eu tomei a dimensão daquilo pelo Chris: uma garota do ensino médio dele estava assistindo uma noite, chamou ele, disse tem um cara aqui que é a sua cara. Aquele é o meu irmão, o Chris disse. Ela olhou para a tela, olhou para ele, disse, sei.</w:t>
+        <w:t xml:space="preserve">O programa foi ao ar oito vezes por dia durante três meses. De volta a Oxford, os carros diminuíam a velocidade, as pessoas apontavam, estranhos nas festas se viravam para a gente com um carinho de que eu nunca tinha sido alvo antes. Eu tomei a dimensão daquilo pelo Chris: uma garota do ensino médio dele estava assistindo uma noite, chamou ele, disse tem um cara aqui que é a sua cara. Aquele é o meu irmão, o Chris disse. Ela olhou para a tela, olhou para ele, disse, sei.</w:t>
       </w:r>
     </w:p>
     <w:p>
@@ -4487,7 +4305,7 @@
         <w:pStyle w:val="BodyText"/>
       </w:pPr>
       <w:r>
-        <w:t xml:space="preserve">Ele trabalhou em dois empregos naqueles anos, e um deles era num centro de jardinagem, plantando árvores, um homem nos seus cinquenta de joelhos na terra. E eu era egoísta com isso. Eu ligava para ele pedindo mais dinheiro, não para livros ou aluguel, mas para beber e sair, e ele mandava toda vez. Eu não pensava duas vezes de onde vinha ou o que custava a ele. Agora eu penso.</w:t>
+        <w:t xml:space="preserve">Ele trabalhou em dois empregos naqueles anos, e um deles era num centro de jardinagem, plantando árvores, um homem nos seus cinquenta de joelhos na terra. E eu era egoísta com isso. Eu ligava para ele pedindo mais dinheiro, não para livros ou aluguel, mas para beber e sair, e ele mandava toda vez. Eu não parava para pensar de onde vinha ou o que custava a ele. Agora eu penso.</w:t>
       </w:r>
     </w:p>
     <w:p>
@@ -4675,7 +4493,7 @@
         <w:pStyle w:val="BodyText"/>
       </w:pPr>
       <w:r>
-        <w:t xml:space="preserve">Chris e eu nunca brigamos. Nem uma vez. Você pensaria que meu vício teria nos explodido, e a coisa apertou muito quando eu estava no meu pior em California, mas nunca se rompeu. Nem mesmo na noite em que ele me sentou e me deu o ultimato: admita que você é viciado em drogas, ou admita que você tem um problema de saúde mental que precisa de tratamento. Escolha um. Eu não estava com raiva. Eu o respeitava demais para ficar com raiva. Ele me amava o bastante para me dizer a verdade quando todo mundo já tinha ficado sem ela. Em meio a todos os comprimidos e às mentiras e aos destroços, eu sempre soube que meu irmão estava tentando salvar a minha vida. Ele talvez seja a única pessoa que poderia ter dito aquela frase e me feito de fato escutar. Era esse o ponto de Tsunetomo: a verdade dura só atinge quando vem de alguém que conquistou o direito de dizê-la. Chris tinha conquistado esse direito cem vezes.</w:t>
+        <w:t xml:space="preserve">Chris e eu nunca brigamos. Nem uma vez. Você pensaria que meu vício teria nos explodido, e a coisa apertou muito quando eu estava no meu pior na California, mas nunca se rompeu. Nem mesmo na noite em que ele me sentou e me deu o ultimato: admita que você é viciado em drogas, ou admita que você tem um problema de saúde mental que precisa de tratamento. Escolha um. Eu não estava com raiva. Eu o respeitava demais para ficar com raiva. Ele me amava o bastante para me dizer a verdade quando todo mundo já tinha ficado sem ela. Em meio a todos os comprimidos e às mentiras e aos destroços, eu sempre soube que meu irmão estava tentando salvar a minha vida. Ele talvez seja a única pessoa que poderia ter dito aquela frase e me feito de fato escutar. Era esse o ponto de Tsunetomo: a verdade dura só atinge quando vem de alguém que conquistou o direito de dizê-la. Chris tinha conquistado esse direito cem vezes.</w:t>
       </w:r>
     </w:p>
     <w:p>
@@ -4990,7 +4808,7 @@
         <w:pStyle w:val="BodyText"/>
       </w:pPr>
       <w:r>
-        <w:t xml:space="preserve">Àquela altura eu tinha uma receita completa minha em California, o vidro bem ali, sem mais racionar o que eu tinha. O acesso fácil não satisfez a caça. Amplificou. O que eu não via era a aritmética por baixo. Você toma mais para conseguir o mesmo efeito. A linha de base se desloca. Quando California secou comecei a atravessar para Tijuana para me reabastecer, uma rotina, ainda antes de alguém perceber. Uma dessas idas terminou no chão de concreto onde este livro começou. Mesmo assim atravessei de novo no dia seguinte. Seis dígitos por ano, atravessando a fronteira por comprimidos, porque a máquina que eu tinha construído não rodava sem combustível.</w:t>
+        <w:t xml:space="preserve">Àquela altura eu tinha uma receita completa minha na California, o vidro bem ali, sem mais racionar o que eu tinha. O acesso fácil não satisfez a caça. Amplificou. O que eu não via era a aritmética por baixo. Você toma mais para conseguir o mesmo efeito. A linha de base se desloca. Quando California secou, comecei a atravessar para Tijuana para me reabastecer, uma rotina, ainda antes de alguém perceber. Uma dessas idas terminou no chão de concreto onde este livro começou. Mesmo assim atravessei de novo no dia seguinte. Seis dígitos por ano, atravessando a fronteira por comprimidos, porque a máquina que eu tinha construído não rodava sem combustível.</w:t>
       </w:r>
     </w:p>
     <w:p>
@@ -5028,15 +4846,15 @@
         <w:pStyle w:val="BodyText"/>
       </w:pPr>
       <w:r>
-        <w:t xml:space="preserve">E não era só a minha vida que ela estava desmontando. Há um momento daqueles anos em California que não consigo tirar da cabeça. Num dia de trabalho, ainda por cima, fui ver uma cartomante. Eu nem acredito nelas. Ela olhou para mim e disse, sua mãe chora até dormir à noite de preocupação com você, e seu pai está doente de tanta aflição. Fiquei ali pasmo. Como ela poderia saber disso? Não acho que tenha sido um truque. Acho que estava tão escrito em mim que até um estranho conseguia ler no meu rosto.</w:t>
-      </w:r>
-    </w:p>
-    <w:p>
-      <w:pPr>
-        <w:pStyle w:val="BodyText"/>
-      </w:pPr>
-      <w:r>
-        <w:t xml:space="preserve">Porque era verdade. Enquanto eu perseguia uma sensação, as pessoas que me amavam ficavam acordadas. Minha mãe. Minha tia Nancey. Meu pai. Meu irmão Chris. Não sei quantas horas passaram ao telefone umas com as outras fazendo a mesma pergunta gasta: o que a gente vai fazer com o Rob? Menti para eles. Manipulei eles. Roubei. Peguei o amor e a confiança deles e transformei em combustível, e deixei cada um deles esgotado de um jeito que não aparece em nenhuma história a não ser na deles.</w:t>
+        <w:t xml:space="preserve">E não era só a minha vida que ela estava desmontando. Há um momento daqueles anos na California que não consigo tirar da cabeça. Num dia de trabalho, ainda por cima, fui ver uma cartomante. Eu nem acredito nelas. Ela olhou para mim e disse, sua mãe chora até dormir à noite de preocupação com você, e seu pai está doente de tanta aflição. Fiquei ali pasmo. Como ela poderia saber disso? Não acho que tenha sido um truque. Acho que estava tão escrito em mim que até um estranho conseguia ler no meu rosto.</w:t>
+      </w:r>
+    </w:p>
+    <w:p>
+      <w:pPr>
+        <w:pStyle w:val="BodyText"/>
+      </w:pPr>
+      <w:r>
+        <w:t xml:space="preserve">Porque era verdade. Enquanto eu perseguia uma sensação, as pessoas que me amavam ficavam acordadas. Minha mãe. Minha tia Nancey. Meu pai. Meu irmão Chris. Não sei quantas horas passaram ao telefone uns com os outros fazendo a mesma pergunta gasta: o que a gente vai fazer com o Rob? Menti para eles. Manipulei eles. Roubei. Peguei o amor e a confiança deles e transformei em combustível, e deixei cada um deles esgotado de um jeito que não aparece em nenhuma história a não ser na deles.</w:t>
       </w:r>
     </w:p>
     <w:p>
@@ -5152,7 +4970,7 @@
         <w:pStyle w:val="BodyText"/>
       </w:pPr>
       <w:r>
-        <w:t xml:space="preserve">As algemas se fecharam e meu corpo simplesmente afundou para a frente no banco. Não sobrava luta nele. Fiquei sentado dobrado sobre os meus próprios joelhos no banco de trás daquele carro e aquilo era, mais do que qualquer coisa, triste. Pensei na minha mãe e no meu pai — todos os anos, todo o trabalho que tinham colocado em construir uma vida para mim, a adoção, as arquibancadas, o dinheiro que Lou não tinha — e o trabalho que eu finalmente tinha começado a fazer sozinho em cima disso. E assisti a coisa toda ser tirada num estacionamento. Eu sabia, sentado ali, que levaria anos para escalar de volta a qualquer coisa que se parecesse com uma vida normal. E levou.</w:t>
+        <w:t xml:space="preserve">As algemas se fecharam e meu corpo simplesmente afundou para a frente no banco. Não sobrava luta nele. Fiquei sentado dobrado sobre os meus próprios joelhos no banco de trás daquele carro e aquilo era, mais do que qualquer coisa, triste. Pensei na minha mãe e no meu pai — todos os anos, todo o trabalho que tinham colocado em construir uma vida para mim, a adoção, as arquibancadas, o dinheiro que Lou não tinha — e o trabalho que eu finalmente tinha começado a fazer sozinho em cima disso. E assisti à coisa toda ser tirada num estacionamento. Eu sabia, sentado ali, que levaria anos para escalar de volta a qualquer coisa que se parecesse com uma vida normal. E levou.</w:t>
       </w:r>
     </w:p>
     <w:p>
@@ -5196,15 +5014,15 @@
         <w:pStyle w:val="BodyText"/>
       </w:pPr>
       <w:r>
-        <w:t xml:space="preserve">Foi então que meu pai entrou em cena. Ele tinha se casado de novo anos antes, Donna, uma enfermeira, a mulher com quem ficaria casado pelo resto da vida, e os dois tinham acabado de comprar uma casa em Pensacola. Eles disseram que estavam pensando em se mudar e perguntaram se eu gostaria de ir junto. Eu sabia o que aquilo realmente era, uma missão de resgate disfarçada de decisão imobiliária. Venha para cá, ele disse. Fique em casa, se organize. Então deixei California e me mudei para Pensacola em 2007, sem nenhuma habilitação ativa no meu nome, alguns meses antes de eles chegarem, ainda bebendo, ainda me virando, ainda certo de que eu podia trabalhar mais do que o estrago. Minha mãe dirigiu o meu carro de California até Pensacola, porque o filho dela não podia dirigi-lo legalmente. Eu deixei. Até meu pai e Donna chegarem eu tinha a casa só para mim, e dormia no sofá. Enquanto esperava por eles recebi interesse de verdade da Boston Scientific e da Schering-Plough, dinheiro bom, empregos que poderiam ter reiniciado tudo. Aí eles puxaram o meu histórico de direção. Fim daquilo. Quando a sua carreira depende de estar num carro, uma habilitação suspensa não é um contratempo, é uma parede.</w:t>
-      </w:r>
-    </w:p>
-    <w:p>
-      <w:pPr>
-        <w:pStyle w:val="BodyText"/>
-      </w:pPr>
-      <w:r>
-        <w:t xml:space="preserve">A habilitação da Florida parecia uma brecha que eu tinha encontrado no universo. Os computadores deles não conversavam com os da California, então passei no teste, sorri para a câmera, e saí com uma limpa, prova laminada de que eu tinha vencido o sistema. Eu dizia a mim mesmo que aqui tudo seria diferente. Mas uma cura geográfica só funciona se você deixa o problema para trás, e eu não tinha deixado. Mesmo homem, habilitação nova. Uma noite antes de meu pai e Donna descerem, saí, e dirigi para casa bêbado. Num sinal vermelho olhei para a esquerda, e havia um policial. Olhei para a direita. Outro policial. Um homem bêbado com a habilitação suspensa, encurralado dos dois lados, prendendo a respiração num sinal numa cidade onde ninguém ainda o conhecia. O sinal mudou. Eles seguiram em frente. Pela graça de Deus eu não fui parado, não naquela noite, nunca. As pessoas nas salas falam do momento de clareza. Aquele sinal vermelho foi o meu. Não fiquei sóbrio naquela noite, e não desacelerei por muito tempo. Mas nunca esqueci como era aquele cerco. Os velhos padrões voltaram como memória muscular, as noites viradas, as manhãs que viravam tardes, o currículo que eu ficava atualizando e nunca enviava. Eu passava de carro pela casa do meu pai e da Donna, o via na entrada da garagem lavando o carro, e pensava em parar. Mas isso significava perguntas sobre entrevistas e os contatos que eu não tinha seguido, então era mais fácil acenar e continuar dirigindo. Os empregos tinham ido embora, e Pensacola sem trabalho começou a parecer um lugar onde eu estava me escondendo em vez de me reconstruindo. Então quando minha tia Nancey ligou e disse venha ficar comigo, eu fui.</w:t>
+        <w:t xml:space="preserve">Foi então que meu pai entrou em cena. Ele tinha se casado de novo anos antes, Donna, uma enfermeira, a mulher com quem ficaria casado pelo resto da vida, e os dois tinham acabado de comprar uma casa em Pensacola. Eles disseram que estavam pensando em se mudar e perguntaram se eu gostaria de ir junto. Eu sabia o que aquilo realmente era, uma missão de resgate disfarçada de decisão imobiliária. Venha para cá, ele disse. Fique em casa, se organize. Então deixei California e me mudei para Pensacola em 2007, sem nenhuma habilitação ativa no meu nome, alguns meses antes de eles chegarem, ainda bebendo, ainda me virando, ainda certo de que eu podia trabalhar mais do que o estrago. Minha mãe dirigiu o meu carro da California até Pensacola, porque o filho dela não podia dirigi-lo legalmente. Eu deixei. Até meu pai e Donna chegarem eu tinha a casa só para mim, e dormia no sofá. Enquanto esperava por eles recebi interesse de verdade da Boston Scientific e da Schering-Plough, dinheiro bom, empregos que poderiam ter reiniciado tudo. Aí eles puxaram o meu histórico de direção. Fim daquilo. Quando a sua carreira depende de estar num carro, uma habilitação suspensa não é um contratempo, é uma parede.</w:t>
+      </w:r>
+    </w:p>
+    <w:p>
+      <w:pPr>
+        <w:pStyle w:val="BodyText"/>
+      </w:pPr>
+      <w:r>
+        <w:t xml:space="preserve">A habilitação da Florida parecia uma brecha que eu tinha encontrado no universo. Os computadores deles não conversavam com os da California, então passei no teste, sorri para a câmera e saí com uma prova limpa e laminada de que eu tinha vencido o sistema. Eu dizia a mim mesmo que aqui tudo seria diferente. Mas uma cura geográfica só funciona se você deixa o problema para trás, e eu não tinha deixado. Mesmo homem, habilitação nova. Uma noite antes de meu pai e Donna descerem, saí e dirigi para casa bêbado. Num sinal vermelho olhei para a esquerda, e havia um policial. Olhei para a direita. Outro policial. Um homem bêbado com a habilitação suspensa, encurralado dos dois lados, prendendo a respiração num sinal numa cidade onde ninguém ainda o conhecia. O sinal mudou. Eles seguiram em frente. Pela graça de Deus eu não fui parado, não naquela noite, nunca. As pessoas nas salas falam do momento de clareza. Aquele sinal vermelho foi o meu. Não fiquei sóbrio naquela noite, e não desacelerei por muito tempo. Mas nunca esqueci como era aquele cerco. Os velhos padrões voltaram como memória muscular, as noites viradas, as manhãs que viravam tardes, o currículo que eu ficava atualizando e nunca enviava. Eu passava de carro pela casa do meu pai e da Donna, o via na entrada da garagem lavando o carro, e pensava em parar. Mas isso significava perguntas sobre entrevistas e os contatos que eu não tinha seguido, então era mais fácil acenar e continuar dirigindo. Os empregos tinham ido embora, e Pensacola sem trabalho começou a parecer um lugar onde eu estava me escondendo em vez de me reconstruindo. Então, quando minha tia Nancey ligou e disse venha ficar comigo, eu fui.</w:t>
       </w:r>
     </w:p>
     <w:p>
@@ -5250,7 +5068,7 @@
           <w:iCs/>
           <w:i/>
         </w:rPr>
-        <w:t xml:space="preserve">O homem olha para o que está diante dos olhos, porém o SENHOR olha para o coração.</w:t>
+        <w:t xml:space="preserve">O homem vê o que está diante dos olhos, porém o SENHOR olha para o coração.</w:t>
       </w:r>
       <w:r>
         <w:rPr>
@@ -5303,7 +5121,7 @@
         <w:pStyle w:val="BodyText"/>
       </w:pPr>
       <w:r>
-        <w:t xml:space="preserve">Fiz amizade com um cara chamado Tristan. Ele tinha feito uma novela. Um lunático de carteirinha. Tinha usado muita cocaína e batido numa parede. A gente se deu bem, os dois de vidas que pareciam boas por fora e apodreciam por dentro. Ficávamos juntos entre as sessões, falávamos de nada, contávamos piadas. Parecia mais um acampamento de verão do que uma reabilitação. Esse era o problema.</w:t>
+        <w:t xml:space="preserve">Fiz amizade com um cara chamado Tristan. Ele tinha feito uma novela. Um lunático de carteirinha. Tinha usado muita cocaína e batido numa parede. A gente se deu bem, os dois com vidas que pareciam boas por fora e apodreciam por dentro. Ficávamos juntos entre as sessões, falávamos de nada, contávamos piadas. Parecia mais um acampamento de verão do que uma reabilitação. Esse era o problema.</w:t>
       </w:r>
     </w:p>
     <w:p>
@@ -5327,7 +5145,7 @@
         <w:pStyle w:val="BodyText"/>
       </w:pPr>
       <w:r>
-        <w:t xml:space="preserve">A terapeuta teve uma ideia. Disse que eu precisava entrar em contato com meu pai de nascimento. Horacio. O homem que deixei na Cidade do México aos quatro anos. Fazia anos que eu não falava com ele e mal tinha uma lembrança dele que não fosse montada com histórias dos outros e meus próprios fragmentos de quando tinha quatro anos. Ela achava que parte do que eu carregava era um luto não resolvido por ter sido deixado. Talvez ela tivesse razão. O que sei é que concordei em tentar, porque concordar em tentar era mais uma caixa para marcar.</w:t>
+        <w:t xml:space="preserve">A terapeuta teve uma ideia. Disse que eu precisava entrar em contato com meu pai biológico. Horacio. O homem que deixei na Cidade do México aos quatro anos. Fazia anos que eu não falava com ele e mal tinha uma lembrança dele que não fosse montada com histórias dos outros e meus próprios fragmentos de quando tinha quatro anos. Ela achava que parte do que eu carregava era um luto não resolvido por ter sido deixado. Talvez ela tivesse razão. O que sei é que concordei em tentar, porque concordar em tentar era mais uma caixa para marcar.</w:t>
       </w:r>
     </w:p>
     <w:p>
@@ -5351,15 +5169,15 @@
         <w:pStyle w:val="BodyText"/>
       </w:pPr>
       <w:r>
-        <w:t xml:space="preserve">Ele era generoso, e estava tentando fazer sua reparação da única forma que sabia. Me deu dez mil dólares. Em dinheiro. Simplesmente entregou. Dez mil dólares a um cara que tinha acabado de sair da reabilitação e ainda dizia à terapeuta que não conseguia viver sem comprimidos. Aquele dinheiro caiu sobre uma fissura que nunca tinha se apagado. No instante em que ele estava na minha mão, algo mudou, não em direção à cura, em direção ao planejamento. Eu sentia a doença fazendo as contas dela. Horacio queria ir comigo aonde quer que eu fosse. Então eu disse a ele que ia sair para comprar um presente para ele, o que era pelo menos meia verdade, já que eu tinha chegado sem nada para dar a ele. Um presente significava que ele tinha que ficar para trás. Saí sozinho e comprei Ritalina. Com o dinheiro que meu pai biológico tinha me dado num reencontro que deveria ser sobre cura.</w:t>
-      </w:r>
-    </w:p>
-    <w:p>
-      <w:pPr>
-        <w:pStyle w:val="BodyText"/>
-      </w:pPr>
-      <w:r>
-        <w:t xml:space="preserve">Depois teve o álbum. Minha mãe tinha montado um álbum da minha infância, Nova Jersey, aniversários, festas, fotos de escola, lutas de wrestling, e me deu para mostrar a ele. Um jeito de dizer, olha, ele ficou bem, é isso que você perdeu, é isso que a gente construiu. Horacio foi folheando, e conforme as páginas viravam ele ficava voltando à minha mãe. Becky. Becky. Becky. Aí parou numa página e disse, você parecia muito triste aí. Você deve ter sentido minha falta. Não disse nada. Deixei aquilo pairando. Não era sobre mim. Ele estava olhando para uma infância que tinha escolhido não fazer parte, e a única forma que tinha de processar aquilo era se colocar no centro.</w:t>
+        <w:t xml:space="preserve">Ele era generoso, e estava tentando fazer sua reparação da única forma que sabia. Me deu dez mil dólares. Em dinheiro. Simplesmente entregou. Dez mil dólares a um cara que tinha acabado de sair da reabilitação e ainda dizia à terapeuta que não conseguia viver sem comprimidos. Aquele dinheiro caiu sobre uma fissura que nunca tinha se apagado. No instante em que ele estava na minha mão, algo mudou, não em direção à cura, em direção ao planejamento. Eu sentia a doença fazendo as contas dela. Horacio queria ir comigo aonde quer que eu fosse. Então disse a ele que ia sair para comprar um presente, o que era pelo menos meia verdade, já que eu tinha chegado sem nada para dar a ele. Um presente significava que ele tinha que ficar para trás. Saí sozinho e comprei Ritalina. Com o dinheiro que meu pai biológico tinha me dado num reencontro que deveria ser sobre cura.</w:t>
+      </w:r>
+    </w:p>
+    <w:p>
+      <w:pPr>
+        <w:pStyle w:val="BodyText"/>
+      </w:pPr>
+      <w:r>
+        <w:t xml:space="preserve">Depois teve o álbum. Minha mãe tinha montado um álbum da minha infância, New Jersey, aniversários, festas, fotos de escola, lutas de wrestling, e me deu para mostrar a ele. Um jeito de dizer, olha, ele ficou bem, é isso que você perdeu, é isso que a gente construiu. Horacio foi folheando, e conforme as páginas viravam ele ficava voltando à minha mãe. Becky. Becky. Becky. Aí parou numa página e disse, você parecia muito triste aí. Você deve ter sentido minha falta. Não disse nada. Deixei aquilo pairando. Não era sobre mim. Ele estava olhando para uma infância que tinha escolhido não fazer parte, e a única forma que tinha de processar aquilo era se colocar no centro.</w:t>
       </w:r>
     </w:p>
     <w:p>
@@ -5440,7 +5258,7 @@
         <w:pStyle w:val="BodyText"/>
       </w:pPr>
       <w:r>
-        <w:t xml:space="preserve">Nancey não bebia. Eu também não estava bebendo naquela época — os comprimidos, sim — esses nunca pararam — mas não estava bebendo. Isso se manteve até eu sair de Boca. Eu ainda não estava onde precisava estar, mas ainda não em queda livre. Às vezes a gente se reunia com amigos sóbrios, não porque ela precisasse, mas porque ela sabia que eu precisava e não ia me deixar ir sozinho. Na maioria das noites a gente só sentava no sofá. É disso que eu mais me lembro. Nós dois somos pessoas que não precisam estar em movimento constante. A gente assistia</w:t>
+        <w:t xml:space="preserve">Nancey não bebia. Eu também não estava bebendo naquela época — os comprimidos, sim, esses nunca pararam — mas não estava bebendo. Isso se manteve até eu sair de Boca. Eu ainda não estava onde precisava estar, mas também não em queda livre. Às vezes a gente se reunia com amigos sóbrios, não porque ela precisasse, mas porque ela sabia que eu precisava e não ia me deixar ir sozinho. Na maioria das noites a gente só sentava no sofá. É disso que eu mais me lembro. Nós dois somos pessoas que não precisam estar em movimento constante. A gente assistia</w:t>
       </w:r>
       <w:r>
         <w:t xml:space="preserve"> </w:t>
@@ -5503,7 +5321,7 @@
         <w:pStyle w:val="BodyText"/>
       </w:pPr>
       <w:r>
-        <w:t xml:space="preserve">Aí eu fui embora. Aluguei um apartamento em West Palm Beach, e não consigo te dar um motivo limpo do porquê. Disse a mim mesmo que era um recomeço. Em West Palm os comprimidos deixaram de ser a história toda. A bebida voltou, e adicionei cocaína. Praticamente parei de comer, e meu corpo começou a falhar — desnutrição, o dano se acumulando em silêncio enquanto eu dizia a quem perguntasse que estava bem. Boca foi o último lugar macio. West Palm Beach foi onde a doença finalmente me pegou sozinho.</w:t>
+        <w:t xml:space="preserve">Aí eu fui embora. Aluguei um apartamento em West Palm Beach, e não consigo te dar um motivo limpo do porquê. Disse a mim mesmo que era um recomeço. Em West Palm os comprimidos deixaram de ser a história toda. A bebida voltou, e acrescentei cocaína. Praticamente parei de comer, e meu corpo começou a falhar — desnutrição, o dano se acumulando em silêncio enquanto eu dizia a quem perguntasse que estava bem. Boca foi o último lugar macio. West Palm Beach foi onde a doença finalmente me pegou sozinho.</w:t>
       </w:r>
     </w:p>
     <w:p>
@@ -5549,7 +5367,7 @@
           <w:iCs/>
           <w:i/>
         </w:rPr>
-        <w:t xml:space="preserve">E, quando ainda estava longe, viu-o o seu pai, e se moveu de íntima compaixão e, correndo, lançou-se-lhe ao pescoço.</w:t>
+        <w:t xml:space="preserve">E, quando ainda estava longe, viu-o seu pai, e se moveu de íntima compaixão e, correndo, lançou-se-lhe ao pescoço.</w:t>
       </w:r>
       <w:r>
         <w:rPr>
@@ -5610,7 +5428,7 @@
         <w:pStyle w:val="BodyText"/>
       </w:pPr>
       <w:r>
-        <w:t xml:space="preserve">Eu tinha parado de pagar as coisas. As taxas do condomínio venceram. As contas de serviço venceram. A energia foi cortada, então puxei uma extensão da geladeira até uma tomada no corredor do prédio e deixei ela puxar a eletricidade da área comum, roubando, na verdade, porque eu não conseguia, ou não queria, pagar a conta. Havia talvez um par de iogurtes naquela geladeira. Era essa a comida no apartamento. O dinheiro que entrava ia para comprimidos, e quando acabava eu furtava eletrônicos para transformar em mais.</w:t>
+        <w:t xml:space="preserve">Eu tinha parado de pagar as coisas. As taxas do condomínio venceram. As contas de serviço venceram. A energia foi cortada, então puxei uma extensão da geladeira até uma tomada no corredor do prédio e deixei ela puxar a eletricidade da área comum, roubando, na verdade, porque eu não conseguia, ou não queria, pagar a conta. Havia talvez uns dois iogurtes naquela geladeira. Era essa a comida no apartamento. O dinheiro que entrava ia para comprimidos, e quando acabava eu furtava eletrônicos para transformar em mais.</w:t>
       </w:r>
     </w:p>
     <w:p>
@@ -5642,7 +5460,7 @@
         <w:pStyle w:val="BodyText"/>
       </w:pPr>
       <w:r>
-        <w:t xml:space="preserve">A essa altura eu estava fazendo coisas que não faziam sentido nem para mim. Passando cheques para mim mesmo que eu sabia que iam voltar, girando dinheiro que eu não tinha só para atravessar mais uma noite. Numa dessas noites acabei num clube com uma conta que eu não conseguia cobrir, aplicando em mim mesmo o mesmo golpe que eu tinha aplicado em todo mundo. Voltei para o apartamento quando o sol estava nascendo, e me ajoelhei no chão. Quero ter cuidado e ser honesto sobre como digo isso. Eu não rezei por ajuda. Pedi a Deus que acabasse com aquilo. Deus, por favor, acabe com isso para mim. Eu queria morrer. Não era um plano e não era um método — eu também não tinha isso em mim. Eu já era um homem morto, sem alma nenhuma dentro, sem sequer a coragem de fazer algo a respeito. Esse é o mais baixo que eu já cheguei: de joelhos ao amanhecer, pedindo para ser tirado da minha própria vida, e longe demais até para conseguir isso.</w:t>
+        <w:t xml:space="preserve">A essa altura eu estava fazendo coisas que não faziam sentido nem para mim. Passando cheques para mim mesmo que eu sabia que iam voltar, girando dinheiro que eu não tinha só para atravessar mais uma noite. Numa dessas noites acabei num clube com uma conta que eu não conseguia cobrir, aplicando em mim mesmo o mesmo golpe que eu tinha aplicado em todo mundo. Voltei para o apartamento quando o sol estava nascendo, e me ajoelhei no chão. Quero ter cuidado e ser honesto sobre como digo isso. Eu não rezei por ajuda. Pedi a Deus que acabasse com aquilo. Deus, por favor, acabe com isso para mim. Eu queria morrer. Não era um plano e não era um método — eu também não tinha isso em mim. Eu já era um homem morto, sem alma nenhuma dentro, sem sequer a coragem de fazer algo a respeito. Esse é o mais baixo a que eu já cheguei: de joelhos ao amanhecer, pedindo para ser tirado da minha própria vida, e longe demais até para conseguir isso.</w:t>
       </w:r>
     </w:p>
     <w:p>
@@ -5852,7 +5670,7 @@
         <w:pStyle w:val="BodyText"/>
       </w:pPr>
       <w:r>
-        <w:t xml:space="preserve">Encontrei uma ponte e pensei, talvez eu durma aqui. Quinhentos dólares sumidos em poucas horas, e eu estava olhando para o vão de baixo de uma ponte achando que aquela era minha melhor opção.</w:t>
+        <w:t xml:space="preserve">Encontrei uma ponte e pensei, talvez eu durma aqui. Quinhentos dólares sumidos em poucas horas, e eu estava olhando para o vão embaixo de uma ponte achando que aquela era minha melhor opção.</w:t>
       </w:r>
     </w:p>
     <w:p>
@@ -5868,7 +5686,7 @@
         <w:pStyle w:val="BodyText"/>
       </w:pPr>
       <w:r>
-        <w:t xml:space="preserve">Então corri. De volta pelo caminho que eu tinha vindo, por aquele bairro, no escuro, só disparando. Não parei. Não olhei em volta. Corri até ver algo que reconheci.</w:t>
+        <w:t xml:space="preserve">Então corri. De volta por onde eu tinha vindo, por aquele bairro, no escuro, só disparando. Não parei. Não olhei em volta. Corri até ver algo que reconheci.</w:t>
       </w:r>
     </w:p>
     <w:p>
@@ -5884,7 +5702,7 @@
         <w:pStyle w:val="BodyText"/>
       </w:pPr>
       <w:r>
-        <w:t xml:space="preserve">Minha mãe estava acordada. Ela olhou para mim e soube. Meus olhos entregavam. Sempre entregavam.</w:t>
+        <w:t xml:space="preserve">Minha mãe estava acordada. Ela olhou para mim e soube. Meus olhos me entregavam. Sempre me entregavam.</w:t>
       </w:r>
     </w:p>
     <w:p>
@@ -5908,15 +5726,15 @@
         <w:pStyle w:val="BodyText"/>
       </w:pPr>
       <w:r>
-        <w:t xml:space="preserve">As duas semanas seguintes foram puro pânico. Não o medo de morrer — isso eu já tinha passado. O pânico de ser pego. Eu atravessava os dias com a sensação de que todo mundo sabia do segredo, de que as pessoas falavam de mim em salas onde eu não estava, conspirando ao meu redor. E o negócio dessa paranoia: era verdade. Estavam mesmo. Meus pais estavam planejando uma intervenção para a reabilitação, meu pai e minha mãe se coordenando nos bastidores, divorciados havia doze anos e trabalhando juntos como se nunca tivessem parado, porque o filho deles estava morrendo e isso superava tudo.</w:t>
-      </w:r>
-    </w:p>
-    <w:p>
-      <w:pPr>
-        <w:pStyle w:val="BodyText"/>
-      </w:pPr>
-      <w:r>
-        <w:t xml:space="preserve">Aí o Chris veio com o ultimato que eu te contei. Admita que você é viciado em drogas, ou admita que tem um problema de saúde mental que precisa de tratamento. Escolha um. Nenhum meio-termo oferecido, nenhuma terceira porta em que eu pudesse continuar seguindo.</w:t>
+        <w:t xml:space="preserve">As duas semanas seguintes foram puro pânico. Não o medo de morrer — por essa eu já tinha passado. O pânico de ser pego. Eu atravessava os dias com a sensação de que todo mundo sabia do segredo, de que as pessoas falavam de mim em salas onde eu não estava, conspirando ao meu redor. E o negócio dessa paranoia: era verdade. Estavam mesmo. Meus pais estavam planejando uma intervenção para a reabilitação, meu pai e minha mãe se coordenando nos bastidores, divorciados havia doze anos e trabalhando juntos como se nunca tivessem parado, porque o filho deles estava morrendo e isso superava tudo.</w:t>
+      </w:r>
+    </w:p>
+    <w:p>
+      <w:pPr>
+        <w:pStyle w:val="BodyText"/>
+      </w:pPr>
+      <w:r>
+        <w:t xml:space="preserve">Aí o Chris veio com o ultimato que eu te contei. Admita que você é viciado em drogas, ou admita que tem um problema de saúde mental que precisa de tratamento. Escolha um. Nenhum meio-termo oferecido, nenhuma terceira porta por onde eu pudesse continuar.</w:t>
       </w:r>
     </w:p>
     <w:p>
@@ -5993,7 +5811,7 @@
           <w:iCs/>
           <w:i/>
         </w:rPr>
-        <w:t xml:space="preserve">Você não consegue pagar de volta um homem que nunca mandou a conta. Você pode passar adiante.</w:t>
+        <w:t xml:space="preserve">Você não consegue pagar um homem que nunca mandou a conta. Você pode passar adiante.</w:t>
       </w:r>
     </w:p>
     <w:p>
@@ -6098,7 +5916,7 @@
         <w:pStyle w:val="BodyText"/>
       </w:pPr>
       <w:r>
-        <w:t xml:space="preserve">Na manhã seguinte dirigimos até uma fazenda no panhandle. Chumuckla. O nome parecia inventado. Não era uma instalação do jeito que Laguna Beach tinha sido, sem oceano, sem terreno bem cuidado, sem atores de novela no quarto ao lado. Uma fazenda no fim de uma estrada de terra, campos ao redor, tocada por um homem chamado Ron que tinha visto mais do que a maioria das pessoas acreditaria. Lou me acompanhou para dentro, assinou a papelada, me abraçou e foi embora.</w:t>
+        <w:t xml:space="preserve">Na manhã seguinte dirigimos até uma fazenda no panhandle. Chumuckla. O nome parecia inventado. Não era uma clínica do jeito que Laguna Beach tinha sido, sem oceano, sem terreno bem cuidado, sem atores de novela no quarto ao lado. Uma fazenda no fim de uma estrada de terra, campos ao redor, tocada por um homem chamado Ron que tinha visto mais do que a maioria das pessoas acreditaria. Lou me acompanhou para dentro, assinou a papelada, me abraçou e foi embora.</w:t>
       </w:r>
     </w:p>
     <w:p>
@@ -6114,7 +5932,7 @@
         <w:pStyle w:val="BodyText"/>
       </w:pPr>
       <w:r>
-        <w:t xml:space="preserve">Mas vou te contar o que estava por baixo da fantasia, porque é a parte que ninguém espera. Mesmo no fundo — sessenta e cinco quilos, a energia cortada, o U-Haul, tudo aquilo — alguma voz em mim nunca tinha deixado de ser confiante. O wrestling colocou ela ali. Uma vez eu tinha sido imobilizado em dezenove segundos na frente de uma academia inteira, e aquilo não me definiu. Fiz 2 a 4 no primeiro ano e saí com um título do condado e meu nome na parede. Em algum lugar por baixo dos comprimidos e da polo passada, aquele garoto ainda estava no tatame, ainda certo de que uma derrota humilhante não precisa ser a história.</w:t>
+        <w:t xml:space="preserve">Mas vou te contar o que estava por baixo da fantasia, porque é a parte que ninguém espera. Mesmo no fundo — sessenta e cinco quilos, a energia cortada, o U-Haul, tudo aquilo — alguma voz em mim nunca tinha deixado de ser confiante. O wrestling colocou ela ali. Uma vez eu tinha sido imobilizado em dezenove segundos na frente de um ginásio inteiro, e aquilo não me definiu. Fiz duas vitórias e quatro derrotas no primeiro ano e saí com um título do condado e meu nome na parede. Em algum lugar por baixo dos comprimidos e da polo passada, aquele garoto ainda estava no tatame, ainda certo de que uma derrota humilhante não precisa ser a história.</w:t>
       </w:r>
     </w:p>
     <w:p>
@@ -6130,15 +5948,15 @@
         <w:pStyle w:val="BodyText"/>
       </w:pPr>
       <w:r>
-        <w:t xml:space="preserve">A verdade veio nas primeiras setenta e duas horas, e foi a coisa que finalmente quebrou a história com que eu tinha entrado. Quando você sair daqui, o Chad me disse, você vai estar usando metanfetamina e sabendo que é melhor do que Adderall. Ele não estava sendo cruel. Estava me desenhando o mapa. Eu tinha entrado ainda acreditando que meu vício tinha uma coleira — comprimidos, receitas, um rótulo de farmácia, nada parecido com os homens injetando heroína. A frase do Chad tirou a coleira. Eu não era diferente. Só havia uma direção restante de onde eu estava, e era para baixo. A abstinência foi uma guerra à parte, e mesmo assim não foi o que quebrou o Rob Corporativo. O espelho também não. O que quebrou foi um chef viciado em crack me dizendo, com gentileza, exatamente para onde ia a minha estrada.</w:t>
-      </w:r>
-    </w:p>
-    <w:p>
-      <w:pPr>
-        <w:pStyle w:val="BodyText"/>
-      </w:pPr>
-      <w:r>
-        <w:t xml:space="preserve">Mais tarde descobri que o Chad e o ginasta morreram juntos. Uma overdose. Duas das pessoas que me carregaram por aqueles noventa dias, partiram no mesmo dia. É isso que essa doença faz. Ela vai eliminando as pessoas.</w:t>
+        <w:t xml:space="preserve">A verdade veio nas primeiras setenta e duas horas, e foi a coisa que finalmente quebrou a história com que eu tinha entrado. Quando você sair daqui, o Chad me disse, você vai estar usando metanfetamina e sabendo que é melhor do que Adderall. Ele não estava sendo cruel. Estava me desenhando o mapa. Eu tinha entrado ainda acreditando que meu vício tinha uma coleira — comprimidos, receitas, um rótulo de farmácia, nada parecido com os homens injetando heroína. A frase do Chad tirou a coleira. Eu não era diferente. Só restava uma direção de onde eu estava, e era para baixo. A abstinência foi uma guerra à parte, e mesmo assim não foi o que quebrou o Rob Corporativo. O espelho também não. O que quebrou foi um chef viciado em crack me dizendo, com gentileza, exatamente para onde ia a minha estrada.</w:t>
+      </w:r>
+    </w:p>
+    <w:p>
+      <w:pPr>
+        <w:pStyle w:val="BodyText"/>
+      </w:pPr>
+      <w:r>
+        <w:t xml:space="preserve">Mais tarde descobri que o Chad e o ginasta morreram juntos. Uma overdose. Duas das pessoas que me carregaram por aqueles noventa dias partiram no mesmo dia. É isso que essa doença faz. Ela vai eliminando as pessoas.</w:t>
       </w:r>
     </w:p>
     <w:p>
@@ -6350,7 +6168,7 @@
         <w:pStyle w:val="BodyText"/>
       </w:pPr>
       <w:r>
-        <w:t xml:space="preserve">Eu tinha trinta e um anos, sem emprego, morando na casa dos meus pais sob um termostato que não era meu para mexer, num quarto que esquentava mais que o resto da casa. Ficava deitado lá em cima à noite somando como minha vida parecia de fora. Eu pagava tudo em dinheiro. Comprei uma Grand Cherokee por quatro mil dólares, e um telefone da Walmart no plano de quarenta e cinco dólares por mês, e quando todo mundo à minha volta sacava iPhones eu atendia o meu embaixo da mesa onde ninguém pudesse ver. Coisas pequenas. Mas quando a sua confiança se foi, não existem coisas pequenas. Em vez de academia eu fazia P90X no chão daquele quarto quente e guardava a diferença.</w:t>
+        <w:t xml:space="preserve">Eu tinha trinta e um anos, sem emprego, morando na casa dos meus pais sob um termostato que não me cabia ajustar, num quarto que esquentava mais que o resto da casa. Ficava deitado lá em cima à noite fazendo as contas de como minha vida parecia de fora. Eu pagava tudo em dinheiro. Comprei uma Grand Cherokee por quatro mil dólares, e um telefone da Walmart no plano de quarenta e cinco dólares por mês, e quando todo mundo à minha volta sacava iPhones eu atendia o meu embaixo da mesa onde ninguém pudesse ver. Coisas pequenas. Mas quando a sua confiança se foi, não existem coisas pequenas. Em vez de academia eu fazia P90X no chão daquele quarto quente e guardava a diferença.</w:t>
       </w:r>
     </w:p>
     <w:p>
@@ -6398,7 +6216,7 @@
         <w:pStyle w:val="BodyText"/>
       </w:pPr>
       <w:r>
-        <w:t xml:space="preserve">Trabalhei como salva-vidas, vigiando a água na piscina da UWF. Eu tinha trinta e dois anos numa cadeira em que todo mundo trabalhando tinha dezenove. Me sentia velho. Também me sentia bem. Três rounds de P90X me deixaram na melhor forma em anos. O trabalho era simples. Vigiar rostos, contar cabeças, garantir que todo mundo voltasse para casa em segurança. Pare de prestar atenção e alguém pode morrer. Eu gostava disso. Ser salva-vidas era presença. Você ficava de vigia, turno após turno, e na maioria dos dias nada acontecia. Esse era o ponto. Um dia uma mãe perguntou se eu daria aula de natação para o filho dela. Tenho quase certeza de que as aulas não eram bem sobre a criança. Eu disse talvez e voltei a vigiar a água. O antigo eu teria transformado aquilo em alguma coisa. O novo eu conseguia deixar um momento continuar pequeno.</w:t>
+        <w:t xml:space="preserve">Trabalhei como salva-vidas, vigiando a água na piscina da UWF. Eu tinha trinta e dois anos numa cadeira em que todo mundo trabalhando tinha dezenove. Me sentia velho. Também me sentia bem. Três ciclos de P90X me deixaram na melhor forma em anos. O trabalho era simples. Vigiar rostos, contar cabeças, garantir que todo mundo voltasse para casa em segurança. Pare de prestar atenção e alguém pode morrer. Eu gostava disso. Ser salva-vidas era presença. Você ficava de vigia, turno após turno, e na maioria dos dias nada acontecia. Esse era o ponto. Um dia uma mãe perguntou se eu daria aula de natação para o filho dela. Tenho quase certeza de que as aulas não eram bem sobre a criança. Eu disse talvez e voltei a vigiar a água. O antigo eu teria transformado aquilo em alguma coisa. O novo eu conseguia deixar um momento continuar pequeno.</w:t>
       </w:r>
     </w:p>
     <w:p>
@@ -6430,7 +6248,7 @@
         <w:pStyle w:val="BodyText"/>
       </w:pPr>
       <w:r>
-        <w:t xml:space="preserve">Em algum ponto ali eu passei do homem que precisava ser salvo ao homem para quem outro homem ligava à meia-noite. Apadrinhei onze pessoas. Algumas realmente queriam. Algumas só precisavam do nome de um padrinho no papel, uma casinha para marcar num tribunal ou num programa, e nós dois sabíamos disso. Algumas conseguiram. Algumas não. Das onze, uma que eu saiba continua sóbria até hoje. Uma. Você atende o telefone toda vez mesmo assim, porque alguém atendeu por você, e porque você nunca sabe qual vai ser a que consegue. Essa aí fez o trabalho e se mudou. Um ano depois me ligou do nada, só para dizer obrigado. Já estava apadrinhando três pessoas dela agora. É assim que deve ser. Você recebe de graça, você dá de graça, e um dia um homem que você nunca vai conhecer continua sóbrio porque alguém uma vez ficou com você.</w:t>
+        <w:t xml:space="preserve">Em algum ponto ali eu passei do homem que precisava ser salvo ao homem para quem outro homem ligava à meia-noite. Apadrinhei onze pessoas. Algumas realmente queriam. Algumas só precisavam do nome de um padrinho no papel, uma casinha para marcar num tribunal ou num programa, e nós dois sabíamos disso. Algumas conseguiram. Algumas não. Das onze, uma que eu saiba continua sóbria até hoje. Uma. Você atende o telefone toda vez mesmo assim, porque alguém atendeu por você, e porque você nunca sabe qual vai ser a que consegue. Essa aí fez o trabalho e se mudou. Um ano depois me ligou do nada, só para dizer obrigado. Já estava apadrinhando três pessoas agora. É assim que deve ser. Você recebe de graça, você dá de graça, e um dia um homem que você nunca vai conhecer continua sóbrio porque alguém uma vez ficou com você.</w:t>
       </w:r>
     </w:p>
     <w:p>
@@ -6552,7 +6370,7 @@
         <w:pStyle w:val="BodyText"/>
       </w:pPr>
       <w:r>
-        <w:t xml:space="preserve">Eu precisava de um padrinho. Então escolhi um cara chamado Andy. A energia inteira do Andy era de Bisonho, um peso de baixa intensidade sobre ele como uma nuvem que nunca se movia. Não bravo, só para baixo, como se o mundo o tivesse desgastado tempos atrás e ele tivesse feito as pazes com estar cansado. Eu olhando para o meu padrinho pensando: é isso que o longo prazo parece? Se isso é sóbrio depois de quinze anos, eu não sei no que fui me meter.</w:t>
+        <w:t xml:space="preserve">Eu precisava de um padrinho. Então escolhi um cara chamado Andy. A energia inteira do Andy era de Bisonho, um peso de baixa intensidade sobre ele como uma nuvem que nunca se movia. Não bravo, só para baixo, como se o mundo o tivesse desgastado tempos atrás e ele tivesse feito as pazes com estar cansado. Eu olhava para o meu padrinho pensando: é com isso que o longo prazo se parece? Se isso é sóbrio depois de quinze anos, eu não sei no que fui me meter.</w:t>
       </w:r>
     </w:p>
     <w:p>
@@ -6592,7 +6410,7 @@
         <w:pStyle w:val="BodyText"/>
       </w:pPr>
       <w:r>
-        <w:t xml:space="preserve">O Mager virou meu padrinho e me ensinou mais do que eu conseguiria listar, mas uma coisa pegou mais fundo. Você quer saber que tipo de programa alguém está seguindo? Não escute a pessoa no púlpito. Converse com as pessoas na vida dela. A esposa, os filhos, o chefe. A pessoa no púlpito está representando. As pessoas em casa estão dizendo a verdade. Eu e o Mager falamos ao telefone toda manhã. Todas, sem exceção. Fazemos uma oração curta juntos, um jeito de começar o dia certo. Já vai para quinze anos disso. E ele não tratava a sobriedade como um teto, tratava como um chão: uma das carreiras mais intensas na venda de dispositivos médicos, e ele decide treinar para um Ironman. O primeiro por volta dos quarenta e seis, uma prova que leva quatorze horas. Depois outro. Se classificou para um Ironman na França. Se classificou para o Havaí. Uma máquina absoluta. É assim que a recuperação parece quando você se recusa a colocar uma tampa nela. O senso de humor de Deus: meu irmão Chris estava tocando o território da Costa do Golfo pela Intuitive Surgical e precisava de um representante em Pensacola. Falei para o Chris: você tem que entrevistar meu padrinho, esse cara é um maníaco, nunca vendeu dispositivos, mas confia em mim. O Mager ainda trabalha com o Chris até hoje, outra empresa agora.</w:t>
+        <w:t xml:space="preserve">O Mager virou meu padrinho e me ensinou mais do que eu conseguiria listar, mas uma coisa pegou mais fundo. Você quer saber que tipo de programa alguém está seguindo? Não escute a pessoa no púlpito. Converse com as pessoas na vida dela. A esposa, os filhos, o chefe. A pessoa no púlpito está representando. As pessoas em casa estão dizendo a verdade. Eu e o Mager falamos ao telefone toda manhã. Todas, sem exceção. Fazemos uma oração curta juntos, um jeito de começar o dia certo. Já vai para quinze anos disso. E ele não tratava a sobriedade como um teto, tratava como um chão: uma das carreiras mais intensas na venda de dispositivos médicos, e ele decide treinar para um Ironman. O primeiro por volta dos quarenta e seis, uma prova que leva quatorze horas. Depois outro. Se classificou para um Ironman na França. Se classificou para o Havaí. Uma máquina absoluta. É assim que a recuperação é quando você se recusa a colocar uma tampa nela. O senso de humor de Deus: meu irmão Chris estava tocando o território da Costa do Golfo pela Intuitive Surgical e precisava de um representante em Pensacola. Falei para o Chris: você tem que entrevistar meu padrinho, esse cara é um maníaco, nunca vendeu dispositivos, mas confia em mim. O Mager ainda trabalha com o Chris até hoje, outra empresa agora.</w:t>
       </w:r>
     </w:p>
     <w:p>
@@ -6648,23 +6466,23 @@
         <w:pStyle w:val="BodyText"/>
       </w:pPr>
       <w:r>
-        <w:t xml:space="preserve">Anos dentro da amizade, na conferência de negócios que ele criou para a cidade, ele estava falando, e fez uma pausa e olhou para a plateia. Lou Brizzi, ótimo cara. Chris e Rob, vocês conhecem? Ouvir o nome do meu pai numa sala daquelas me parou. Meu pai trabalhou no Baptist Hospital por anos, apareceu, fez o serviço bem, tratou as pessoas direito, ficou até os oitenta e dois. O Quint dizendo o nome dele numa sala cheia de líderes honrou a vida em que meu pai acreditava.</w:t>
-      </w:r>
-    </w:p>
-    <w:p>
-      <w:pPr>
-        <w:pStyle w:val="BodyText"/>
-      </w:pPr>
-      <w:r>
-        <w:t xml:space="preserve">Na manhã seguinte à morte do meu pai, todos esses anos depois, o Quint foi a primeira pessoa a me alcançar. Seu pai era um grande homem, dizia a mensagem dele. De todos que iriam entrar em contato naqueles dias, ele chegou primeiro, e disse a coisa mais verdadeira. Deus não colocou o Quint na minha vida para me resgatar. Ele o colocou ali para me mostrar o que era possível. Pela primeira vez desde que fiquei sóbrio, acreditei que havia mais para eu fazer do que continuar vivo.</w:t>
-      </w:r>
-    </w:p>
-    <w:p>
-      <w:pPr>
-        <w:pStyle w:val="BodyText"/>
-      </w:pPr>
-      <w:r>
-        <w:t xml:space="preserve">Comecei sóbrio achando que a mediocridade era o teto. Aí conheci Andy, Bob, Mager, Matt e Quint. Essas são as pessoas que você encontra quando para de beber. Não as que você esperava, as que Deus colocou na sua frente. Eu achava que estava longe demais para qualquer coisa daquilo. Eles também achavam, um dia. Eles entraram na sala mesmo assim, e eu também, e isso acabou sendo a coisa toda. E a melhor de todas não veio de uma reunião. Você vai conhecê-la em breve.</w:t>
+        <w:t xml:space="preserve">Já com anos de amizade, na conferência de negócios que ele criou para a cidade, ele estava falando, e fez uma pausa e olhou para a plateia. Lou Brizzi, ótimo cara. Chris e Rob, vocês conhecem? Ouvir o nome do meu pai numa sala daquelas me parou. Meu pai trabalhou no Baptist Hospital por anos, apareceu, fez o serviço bem, tratou as pessoas direito, ficou até os oitenta e dois. O Quint dizendo o nome dele numa sala cheia de líderes honrou a vida em que meu pai acreditava.</w:t>
+      </w:r>
+    </w:p>
+    <w:p>
+      <w:pPr>
+        <w:pStyle w:val="BodyText"/>
+      </w:pPr>
+      <w:r>
+        <w:t xml:space="preserve">Na manhã seguinte à morte do meu pai, todos esses anos depois, o Quint foi a primeira pessoa a me procurar. Seu pai era um grande homem, dizia a mensagem dele. De todos que iriam entrar em contato naqueles dias, ele chegou primeiro, e disse a coisa mais verdadeira. Deus não colocou o Quint na minha vida para me resgatar. Ele o colocou ali para me mostrar o que era possível. Pela primeira vez desde que fiquei sóbrio, acreditei que havia mais para eu fazer do que continuar vivo.</w:t>
+      </w:r>
+    </w:p>
+    <w:p>
+      <w:pPr>
+        <w:pStyle w:val="BodyText"/>
+      </w:pPr>
+      <w:r>
+        <w:t xml:space="preserve">Comecei sóbrio achando que a mediocridade era o teto. Aí conheci Andy, Bob, Mager, Matt e Quint. Essas são as pessoas que você encontra quando para de beber. Não as que você esperava, as que Deus colocou na sua frente. Eu achava que estava longe demais para qualquer coisa daquilo. Eles também achavam, um dia. Eles entraram na sala mesmo assim, e eu também, e isso acabou sendo tudo. E a melhor de todas não veio de uma reunião. Você vai conhecê-la em breve.</w:t>
       </w:r>
     </w:p>
     <w:p>
@@ -6770,23 +6588,23 @@
         <w:pStyle w:val="BodyText"/>
       </w:pPr>
       <w:r>
-        <w:t xml:space="preserve">A vez seguinte em que o vi pessoalmente foi em Ensenada, em 2006, logo depois da primeira reabilitação. Eu mesmo já estava em plena dependência ativa a essa altura, embora não tivesse dito essas palavras. Voltei ao homem que tinha estado no centro da minha primeira vida, e eu não era mais um menino olhando para cima para ele. Eu conseguia vê-lo como ele era, a circunstância dele, as coisas que o tinham feito o pai que trancou a porta. Talvez eu tenha visto tão claramente porque estava mais perto disso do que gostaria de saber. De perto, a raiva que eu tinha carregado por tanto tempo começou a virar algo mais silencioso.</w:t>
-      </w:r>
-    </w:p>
-    <w:p>
-      <w:pPr>
-        <w:pStyle w:val="BodyText"/>
-      </w:pPr>
-      <w:r>
-        <w:t xml:space="preserve">O que eu não conseguia fazer era me tornar o filho que ele queria. Ele procurava uma relação que eu não tinha dentro de mim para dar. O que me levou mais tempo foi enxergar essas como duas coisas separadas — que você pode perdoar um homem por completo e ainda assim não conseguir entregar a ele a sua vida.</w:t>
-      </w:r>
-    </w:p>
-    <w:p>
-      <w:pPr>
-        <w:pStyle w:val="BodyText"/>
-      </w:pPr>
-      <w:r>
-        <w:t xml:space="preserve">Em 2015 estiquei a mão para ele de novo. Eu tinha trinta e seis anos e estava sóbrio, e parte do estender a mão era reparação, a minha parte da rua, os anos de raiva, o silêncio. Eu as fiz. E eu o chamei de Horacio. Não de Papai. Não de Pai. Pai era uma palavra que pertencia a outra pessoa a essa altura. O Horacio nunca disse nada sobre isso. A gente conversou toda semana por alguns meses.</w:t>
+        <w:t xml:space="preserve">A vez seguinte em que o vi pessoalmente foi em Ensenada, em 2006, logo depois da primeira reabilitação. Eu mesmo já estava em plena dependência ativa a essa altura, embora não tivesse dito essas palavras. Voltei ao homem que tinha estado no centro da minha primeira vida, e eu não era mais um menino que olhava para ele lá de baixo. Eu conseguia vê-lo como ele era, a circunstância dele, as coisas que o tinham feito o pai que trancou a porta. Talvez eu tenha visto tão claramente porque estava mais perto disso do que gostaria de saber. De perto, a raiva que eu tinha carregado por tanto tempo começou a virar algo mais silencioso.</w:t>
+      </w:r>
+    </w:p>
+    <w:p>
+      <w:pPr>
+        <w:pStyle w:val="BodyText"/>
+      </w:pPr>
+      <w:r>
+        <w:t xml:space="preserve">O que eu não conseguia fazer era me tornar o filho que ele queria. Ele procurava uma relação que eu não tinha dentro de mim para dar. O que me levou mais tempo foi enxergar isso como duas coisas separadas — que você pode perdoar um homem por completo e ainda assim não conseguir entregar a ele a sua vida.</w:t>
+      </w:r>
+    </w:p>
+    <w:p>
+      <w:pPr>
+        <w:pStyle w:val="BodyText"/>
+      </w:pPr>
+      <w:r>
+        <w:t xml:space="preserve">Em 2015 estendi a mão para ele de novo. Eu tinha trinta e seis anos e estava sóbrio, e parte do estender a mão era reparação, a minha parte da rua, os anos de raiva, o silêncio. Eu a fiz. E eu o chamei de Horacio. Não de Papai. Não de Pai. Pai era uma palavra que pertencia a outra pessoa a essa altura. O Horacio nunca disse nada sobre isso. A gente conversou toda semana por alguns meses.</w:t>
       </w:r>
     </w:p>
     <w:p>
@@ -6927,7 +6745,7 @@
           <w:iCs/>
           <w:i/>
         </w:rPr>
-        <w:t xml:space="preserve">Sobre tudo o que se deve guardar, guarda o teu coração, porque dele procedem as fontes da vida.</w:t>
+        <w:t xml:space="preserve">Sobre tudo o que se deve guardar, guarda o teu coração, porque dele procedem as saídas da vida.</w:t>
       </w:r>
       <w:r>
         <w:rPr>
@@ -6964,7 +6782,7 @@
         <w:pStyle w:val="BodyText"/>
       </w:pPr>
       <w:r>
-        <w:t xml:space="preserve">Rob, se você tiver uma recaída, vou ter que lavar as mãos em relação a você. Sem emoção. Sem ameaça. Meu pai disse aquilo do jeito que enunciava fatos, e foi a coisa dura mais gentil que alguém já me disse. Só funcionou vindo dele. Ele passou a minha vida inteira provando que nunca me abandonaria de verdade. A sobriedade não apagou o desejo. Isso me surpreendeu. O que a sobriedade me deu foi tempo. O que ela tirou foi a anestesia, e sem ela eu conseguia sentir tudo, a fome inclusive. A doença não foi embora quando eu larguei a bebida. Ela ficou quieta e esperou.</w:t>
+        <w:t xml:space="preserve">Rob, se você tiver uma recaída, vou ter que lavar as mãos em relação a você. Sem emoção. Sem ameaça. Meu pai disse aquilo do jeito que enunciava fatos, e foi a mais gentil das coisas duras que alguém já me disse. Só funcionou vindo dele. Durante toda a minha vida, ele provou que nunca me abandonaria de verdade. A sobriedade não apagou o desejo. Isso me surpreendeu. O que a sobriedade me deu foi tempo. O que ela tirou foi a anestesia, e sem ela eu conseguia sentir tudo, a fome inclusive. A doença não foi embora quando eu larguei a bebida. Ela ficou quieta e esperou.</w:t>
       </w:r>
     </w:p>
     <w:p>
@@ -6996,7 +6814,7 @@
         <w:pStyle w:val="BodyText"/>
       </w:pPr>
       <w:r>
-        <w:t xml:space="preserve">Saí abalado. Aquela linha me forçou a uma escolha que eu não podia repassar a ninguém. Voltar àquele mundo cedo demais e eu não estaria retornando, estaria tendo uma recaída com um currículo. Não aceitei o emprego. Não pareceu coragem. Pareceu continuar vivo.</w:t>
+        <w:t xml:space="preserve">Saí abalado. Aquela linha me forçou a uma escolha que eu não podia repassar a ninguém. Se eu voltasse àquele mundo cedo demais, não estaria retornando; estaria tendo uma recaída com um currículo. Não aceitei o emprego. Não pareceu coragem. Pareceu continuar vivo.</w:t>
       </w:r>
     </w:p>
     <w:p>
@@ -7094,7 +6912,7 @@
         <w:pStyle w:val="BodyText"/>
       </w:pPr>
       <w:r>
-        <w:t xml:space="preserve">A cor era impossível de ignorar. Salmão. Quente e desafiadora. Erguia-se acima da rua como um pequeno castelo numa colina, e é exatamente por isso que meus amigos o batizaram de Palácio Salmão. Eles diziam com orgulho. A escritura dizia Mirador. Ambos eram verdade. Durante anos passei de carro por ali no caminho de volta das reuniões. No começo eu mal reparava nele. Depois reparava toda vez. Depois eu estava diminuindo a velocidade, depois estacionando do outro lado da rua para sentar e ficar olhando. Eu não conseguia imaginar morar ali um dia. Então fiz aquilo que eles ensinam. Imaginei mesmo assim, ser dono dele um dia, uma espécie de oração que eu não tinha coragem de dizer em voz alta. Algo em mim reconhecia aquele lugar.</w:t>
+        <w:t xml:space="preserve">A cor era impossível de ignorar. Salmão. Quente e desafiadora. Erguia-se acima da rua como um pequeno castelo numa colina, e é exatamente por isso que meus amigos o batizaram de Palácio Salmão. Eles diziam com orgulho. A escritura dizia Mirador. Ambos eram verdade. Durante anos passei de carro por ali no caminho de volta das reuniões. No começo eu mal reparava nele. Depois reparava toda vez. Depois eu estava diminuindo a velocidade, depois estacionando do outro lado da rua para sentar e ficar olhando. Eu não conseguia imaginar morar ali um dia. Então fiz aquilo que eles ensinam. Imaginei mesmo assim ser dono dele um dia, uma espécie de oração que eu não tinha coragem de dizer em voz alta. Algo em mim reconhecia aquele lugar.</w:t>
       </w:r>
     </w:p>
     <w:p>
@@ -7134,7 +6952,7 @@
         <w:pStyle w:val="BodyText"/>
       </w:pPr>
       <w:r>
-        <w:t xml:space="preserve">Aquele apartamento é onde eu finalmente parei de fugir. Anos depois, quando Hope atravessou aquela porta pela primeira vez, ela não disse uma palavra sobre o tamanho. Ela reparou em como ele parecia. A gente levava um devocional para a piscina, ou lá embaixo para o píer, e lia junto. O hábito para o qual ainda recorremos, aquele que hoje é só parte da casa, começou ali. Vendemos em 2019, cem mil de patrimônio, e demos de entrada na casa que Hope e eu construímos juntos em East Hill, do tipo que eu nunca tinha me permitido imaginar do outro lado da rua. De um castelo salmão de um quarto para uma casa que construímos do zero. É isso que cinco anos de aparecer em silêncio conseguem fazer.</w:t>
+        <w:t xml:space="preserve">Aquele apartamento é onde eu finalmente parei de fugir. Anos depois, quando Hope atravessou aquela porta pela primeira vez, ela não disse uma palavra sobre o tamanho. Ela reparou em como ele parecia. A gente levava um devocional para a piscina, ou lá embaixo para o píer, e lia junto. O hábito ao qual ainda recorremos, aquele que hoje é só parte da casa, começou ali. Vendemos em 2019, cem mil de patrimônio, e demos de entrada na casa que Hope e eu construímos juntos em East Hill, do tipo que eu nunca tinha me permitido imaginar do outro lado da rua. De um castelo salmão de um quarto para uma casa que construímos do zero. É isso que cinco anos de aparecer em silêncio conseguem fazer.</w:t>
       </w:r>
     </w:p>
     <w:p>
@@ -7304,7 +7122,7 @@
         <w:pStyle w:val="BodyText"/>
       </w:pPr>
       <w:r>
-        <w:t xml:space="preserve">Era familiar. Eu sabia como era precisar de ajuda e não querer, ter vergonha da dependência, pedir desculpas por ocupar espaço quando é você que está sofrendo. Então quando as famílias falavam eu não as apressava, não preenchia o silêncio, não fazia discurso de venda. Eu escutava. Caroline reparou. Você é diferente com as pessoas, ela disse uma tarde. Você não fala para cima delas. Eu sei como é ter medo, eu disse. Ela assentiu. Sem prosseguir. Ela já tinha decidido confiar em mim, e eu entendi o que aquela confiança significava de um jeito que não teria entendido antes.</w:t>
+        <w:t xml:space="preserve">Era familiar. Eu sabia como era precisar de ajuda e não querer, ter vergonha da dependência, pedir desculpas por ocupar espaço quando é você que está sofrendo. Então quando as famílias falavam eu não as apressava, não preenchia o silêncio, não fazia discurso de venda. Eu escutava. Caroline reparou. Você é diferente com as pessoas, ela disse uma tarde. Você não fala com elas de cima para baixo. Eu sei como é ter medo, eu disse. Ela assentiu. Sem prosseguir. Ela já tinha decidido confiar em mim, e eu entendi o que aquela confiança significava de um jeito que não teria entendido antes.</w:t>
       </w:r>
     </w:p>
     <w:p>
@@ -7547,7 +7365,7 @@
           <w:iCs/>
           <w:i/>
         </w:rPr>
-        <w:t xml:space="preserve">A esperança adiada faz adoecer o coração, mas o desejo que se cumpre é árvore de vida.</w:t>
+        <w:t xml:space="preserve">A esperança que se adia faz adoecer o coração, mas o desejo que se cumpre é árvore de vida.</w:t>
       </w:r>
       <w:r>
         <w:rPr>
@@ -7592,7 +7410,7 @@
         <w:pStyle w:val="BodyText"/>
       </w:pPr>
       <w:r>
-        <w:t xml:space="preserve">Mandei mensagem para ela mesmo assim. Sei que você está de saída, eu disse, mas você teria interesse em só tomar um café? Ela respondeu: Que tal você me levar para jantar? Essa menina é algo. Tentei ligar. Ela não atendeu, disse que a gente conversaria no jantar. Então montei um plano. Liguei para o Global Grill, um dos nossos favoritos, o lugar do meu pai, reservei para as 18h45. Depois mandei mensagem para ela: Hope, te pego às 18h15. A reserva é às 18h45. Te vejo então. Descobri depois que ela ficou pasma. Ela estava acostumada com caras que não faziam um plano, não a buscavam, só me encontra em algum lugar. O primeiro ano inteiro foi assim para ela, ela disse, um choque silencioso de que um homem tão atencioso e cuidadoso de fato existia.</w:t>
+        <w:t xml:space="preserve">Mandei mensagem para ela mesmo assim. Sei que você está de saída, eu disse, mas você teria interesse em só tomar um café? Ela respondeu: Que tal você me levar para jantar? Essa menina é demais. Tentei ligar. Ela não atendeu, disse que a gente conversaria no jantar. Então montei um plano. Liguei para o Global Grill, um dos nossos favoritos, o lugar do meu pai, reservei para as 18h45. Depois mandei mensagem para ela: Hope, te pego às 18h15. A reserva é às 18h45. Te vejo então. Descobri depois que ela ficou pasma. Ela estava acostumada com caras que não faziam um plano, não a buscavam, só me encontra em algum lugar. O primeiro ano inteiro foi assim para ela, ela disse, um choque silencioso de que um homem tão atencioso e cuidadoso de fato existia.</w:t>
       </w:r>
     </w:p>
     <w:p>
@@ -7807,7 +7625,7 @@
         <w:pStyle w:val="BodyText"/>
       </w:pPr>
       <w:r>
-        <w:t xml:space="preserve">Chris fez um discurso. Meu irmão, meu guardião, aquele que disse a coisa que funcionou naquela noite. Ele ficou de pé diante dos cem deles, falou do caminho por que eu tinha passado, e o rematou em três palavras. Há Hope. Ele quis dizer a mulher de branco ao meu lado. Ele quis dizer a outra coisa também, aquela de onde ele tinha me visto sair aos centímetros. Ele deixou a sala ouvir dos dois jeitos.</w:t>
+        <w:t xml:space="preserve">Chris fez um discurso. Meu irmão, meu guardião, aquele que disse a coisa que funcionou naquela noite. Ele ficou de pé diante dos cem deles, falou do caminho por que eu tinha passado, e o rematou em três palavras. Há Hope. Ele quis dizer a mulher de branco ao meu lado. Ele quis dizer a outra coisa também, aquela de onde ele tinha me visto sair centímetro a centímetro. Ele deixou a sala ouvir dos dois jeitos.</w:t>
       </w:r>
     </w:p>
     <w:p>
@@ -7906,7 +7724,7 @@
         <w:pStyle w:val="BodyText"/>
       </w:pPr>
       <w:r>
-        <w:t xml:space="preserve">O Lou nunca embarcou no plano. Quando ele nos ouvia falar de orçamento e de cortar gastos, alguma coisa nele se irritava. Você tem que aproveitar a vida, ele dizia. Não dá pra cortar tudo. Saía com um pouco de calor, e o calor não era dirigido a nós — com o Lou, raramente era. Um homem que dava vinte dólares de gorjeta por princípio nunca ia amar um orçamento. Ele ouvia economia e entendia privação.</w:t>
+        <w:t xml:space="preserve">O Lou nunca embarcou no plano. Quando ele nos ouvia falar de orçamento e de cortar gastos, alguma coisa nele se irritava. Você tem que aproveitar a vida, ele dizia. Não dá pra cortar tudo. Falava com um pouco de irritação, e a irritação não era dirigida a nós — com o Lou, raramente era. Um homem que dava vinte dólares de gorjeta por princípio nunca ia amar um orçamento. Ele ouvia economia e entendia privação.</w:t>
       </w:r>
     </w:p>
     <w:bookmarkStart w:id="79" w:name="quem-ela-é"/>
@@ -7935,7 +7753,7 @@
         <w:pStyle w:val="BodyText"/>
       </w:pPr>
       <w:r>
-        <w:t xml:space="preserve">Ela precisa de um plano. Mudança a sobrecarrega. Ela mapeia tudo, a viagem, a semana, a ida ao mercado, e quando alguma coisa desloca as peças ela sente no corpo. No começo eu tentava demovê-la disso. Agora ajudo ela a reconstruir o plano em vez disso. A Hope já foi deixada uma vez. Ela precisa saber o que vem pela frente.</w:t>
+        <w:t xml:space="preserve">Ela precisa de um plano. Mudança a sobrecarrega. Ela mapeia tudo, a viagem, a semana, a ida ao mercado, e quando alguma coisa desloca as peças ela sente no corpo. No começo eu tentava demovê-la disso. Agora, em vez disso, ajudo ela a reconstruir o plano. A Hope já foi deixada uma vez. Ela precisa saber o que vem pela frente.</w:t>
       </w:r>
     </w:p>
     <w:p>
@@ -7967,23 +7785,23 @@
         <w:pStyle w:val="BodyText"/>
       </w:pPr>
       <w:r>
-        <w:t xml:space="preserve">Quando a Hope decide que quer uma coisa, ela tem que ter. Não existe uma deriva lenta até lá. Em Pensacola ela decidiu que queria um cavalo. Nunca teve. A gente se mudou, e precisávamos do dinheiro para a casa, então ela abriu mão do cavalo. Ela consegue querer uma coisa demais e mesmo assim largá-la quando é importante. Agora ela quer um gato sem pelo. Aprendi a não brigar com o querer. Fico aberto às ideias dela, todas elas.</w:t>
-      </w:r>
-    </w:p>
-    <w:p>
-      <w:pPr>
-        <w:pStyle w:val="BodyText"/>
-      </w:pPr>
-      <w:r>
-        <w:t xml:space="preserve">Nossa primeira briga não foi sobre dinheiro nem sobre o futuro. Foi carne de siri. Estávamos em Orange Beach, num lugar de frutos do mar e bar, a caminho de um show do Matchbox Twenty. A Hope queria que eu experimentasse. Eu não dei uma mordida. Nem uma. Virou uma discussão de verdade ali mesmo na mesa, e terminou comigo traçando um limite. Hope, eu disse não, e não vou tocar mais nesse assunto. Ela deixou pra lá. Nunca mais brigamos por comida. Limites me mantiveram vivo na recuperação. Acontece que funcionam também diante de um prato de siri.</w:t>
-      </w:r>
-    </w:p>
-    <w:p>
-      <w:pPr>
-        <w:pStyle w:val="BodyText"/>
-      </w:pPr>
-      <w:r>
-        <w:t xml:space="preserve">O trecho mais difícil que enfrentamos veio com a mudança para Raleigh. Estávamos carregando dois financiamentos, a casa da East Hill só vendeu neste ano, 2026, e o dinheiro virou a coisa à qual a gente sempre voltava. A gente falava muito de dinheiro, e por um tempo foi um ponto de atrito. Parte disso foi culpa minha. No começo eu tomava uma decisão grande sozinho e contava para ela depois de já estar feita. Para uma mulher que precisa ver as peças antes de elas se moverem, nunca foi de fato sobre o dinheiro. Era sobre ser deixada de fora de uma coisa que era nossa. A Hope não é de brigar, e ela não gritava. Ela ficava calada, e o silêncio durava, o que era mais difícil do que levar grito. Quando ela finalmente veio falar comigo, não foi cruel. Ela disse a única coisa que precisava: chega de decisões por impulso. Não tomei mais nenhuma sozinho desde então. Num casamento, não é assim que se faz as coisas. As decisões grandes são nossas, não minhas.</w:t>
+        <w:t xml:space="preserve">Quando a Hope decide que quer uma coisa, ela tem que ter. Não é uma vontade que chega devagar. Em Pensacola ela decidiu que queria um cavalo. Nunca teve. A gente se mudou, e precisávamos do dinheiro para a casa, então ela abriu mão do cavalo. Ela consegue querer uma coisa demais e mesmo assim largá-la quando é importante. Agora ela quer um gato sem pelo. Aprendi a não brigar com o querer. Fico aberto às ideias dela, todas elas.</w:t>
+      </w:r>
+    </w:p>
+    <w:p>
+      <w:pPr>
+        <w:pStyle w:val="BodyText"/>
+      </w:pPr>
+      <w:r>
+        <w:t xml:space="preserve">Nossa primeira briga não foi sobre dinheiro nem sobre o futuro. Foi carne de siri. Estávamos em Orange Beach, num lugar de frutos do mar com bar, a caminho de um show do Matchbox Twenty. A Hope queria que eu experimentasse. Eu não dei uma mordida. Nem uma. Virou uma discussão de verdade ali mesmo na mesa, e terminou comigo traçando um limite. Hope, eu disse não, e não vou tocar mais nesse assunto. Ela deixou pra lá. Nunca mais brigamos por comida. Limites me mantiveram vivo na recuperação. Acontece que funcionam também diante de um prato de siri.</w:t>
+      </w:r>
+    </w:p>
+    <w:p>
+      <w:pPr>
+        <w:pStyle w:val="BodyText"/>
+      </w:pPr>
+      <w:r>
+        <w:t xml:space="preserve">O trecho mais difícil que enfrentamos veio com a mudança para Raleigh. Estávamos carregando dois financiamentos, a casa da East Hill só vendeu neste ano, 2026, e o dinheiro virou a coisa à qual a gente sempre voltava. A gente falava muito de dinheiro, e por um tempo foi um ponto de atrito. Parte disso foi culpa minha. No começo eu tomava uma decisão grande sozinho e contava para ela depois de já estar feita. Para uma mulher que precisa ver as peças antes de elas se moverem, nunca foi de fato sobre o dinheiro. Era sobre ser deixada de fora de uma coisa que era nossa. A Hope não é de brigar, e ela não gritava. Ela ficava calada, e o silêncio durava, o que era mais difícil do que levar grito. Quando ela finalmente veio falar comigo, não foi cruel. Ela disse a única coisa que precisava: chega de decisões por impulso. Não tomei mais nenhuma sozinho desde então. Num casamento, não é assim que se fazem as coisas. As decisões grandes são nossas, não minhas.</w:t>
       </w:r>
     </w:p>
     <w:p>
@@ -7999,7 +7817,7 @@
         <w:pStyle w:val="BodyText"/>
       </w:pPr>
       <w:r>
-        <w:t xml:space="preserve">O retrato dela é feito na maior parte de coisas pequenas, repetidas. Ela atende quando eu ligo. Toda vez, não quase sempre. Se ela diz que vai fazer uma coisa, a coisa é feita, e quando temos que ir a algum lugar ela está pronta cedo, esperando na porta enquanto eu procuro minhas chaves. E quando ela sai do trabalho, meu telefone toca, porque ela não gosta de fazer o trajeto até o carro sozinha. Fico na linha até ela entrar e as portas estarem trancadas. É a menor tarefa que eu tenho. Pode ser a minha preferida. Confiável, de se contar, constante. Soam como palavras pequenas até você ter vivido sem elas.</w:t>
+        <w:t xml:space="preserve">O retrato dela é feito na maior parte de coisas pequenas, repetidas. Ela atende quando eu ligo. Toda vez, não quase sempre. Se ela diz que vai fazer uma coisa, a coisa é feita, e quando temos que ir a algum lugar ela está pronta cedo, esperando na porta enquanto eu procuro minhas chaves. E quando ela sai do trabalho, meu telefone toca, porque ela não gosta de fazer o trajeto até o carro sozinha. Fico na linha até ela entrar e as portas estarem trancadas. É a menor tarefa que eu tenho. Pode ser a minha preferida. Confiável, com quem se pode contar, constante. Soam como palavras pequenas até você ter vivido sem elas.</w:t>
       </w:r>
     </w:p>
     <w:p>
@@ -8015,7 +7833,7 @@
         <w:pStyle w:val="BodyText"/>
       </w:pPr>
       <w:r>
-        <w:t xml:space="preserve">Ela adora rir, do jeito de verdade, que a leva até o fim e puxa a sala inteira junto. É a coisa mais contagiante nela. Nos primeiros três anos a gente ria assim o tempo todo, fácil e constante, a casa cheia disso. Depois vieram os anos pesados, os que este livro trata na maior parte, e o rir ficou raro sem que nenhum de nós decidisse que devia. Estamos finalmente voltando a ele. A alegria está retornando, um pouco mais a cada mês, e não tomo uma nota disso como garantida. Mas por baixo de tudo, o que ela é para mim é minha melhor amiga. A gente se sente seguro um com o outro, e porque a gente se sente seguro, às vezes somos mais duros um com o outro do que deveríamos. Esse é o preço de baixar a guarda até o fim com a única pessoa que você tem certeza que não vai embora. Ela é essa pessoa. Eu não sabia que dava para continuar se apaixonando pela mesma mulher anos adentro de um casamento. Dá.</w:t>
+        <w:t xml:space="preserve">Ela adora rir, do jeito de verdade, que a leva até o fim e puxa a sala inteira junto. É a coisa mais contagiante nela. Nos primeiros três anos a gente ria assim o tempo todo, fácil e constante, a casa cheia disso. Depois vieram os anos pesados, os que este livro aborda na maior parte, e o riso ficou raro sem que nenhum de nós decidisse que devia. Estamos finalmente voltando a ele. A alegria está retornando, um pouco mais a cada mês, e não considero nada disso garantido. Mas por baixo de tudo, o que ela é para mim é minha melhor amiga. A gente se sente seguro um com o outro, e porque a gente se sente seguro, às vezes somos mais duros um com o outro do que deveríamos. Esse é o preço de baixar a guarda até o fim com a única pessoa que você tem certeza que não vai embora. Ela é essa pessoa. Eu não sabia que dava para continuar se apaixonando pela mesma mulher depois de tantos anos de casamento. Dá.</w:t>
       </w:r>
     </w:p>
     <w:bookmarkEnd w:id="79"/>
@@ -8037,7 +7855,7 @@
         <w:pStyle w:val="FirstParagraph"/>
       </w:pPr>
       <w:r>
-        <w:t xml:space="preserve">Em pouco tempo trabalhamos como um time. Quitamos mais de cem mil dólares em empréstimo estudantil e construímos uma vida com folga nela em vez de dívida, um lar, uma pequena segurança que eu nunca tive lá atrás, quando eu parecia bem-sucedido. A recuperação me ensinou sobre dinheiro a mesma coisa que me ensinou sobre tudo o mais: você cumpre as pequenas promessas, todo dia, e elas somam uma vida. A gente se mudou para Raleigh. Nunca tivemos filhos, e nunca planejamos ter. O que construímos foi nós dois, e uma vida com espaço nela para estar presente para as outras pessoas. Hoje em dia isso inclui a mãe da Hope. A Rhonda mora debaixo do nosso teto agora, o que não é uma frase que se diga de leve, e conhecê-la e amá-la tem sido um dos presentes silenciosos deste trecho. Ela não teve a vida mais fácil. O que eu não vi chegando foi ver a Hope e a mãe dela ficarem próximas, devagar, ao longo de anos, até a Hope começar a chamar a Rhonda de melhor amiga. Nenhuma das coisas boas acontece da noite para o dia. A gente faz viagens juntos, os Outer Banks e outras, e em algum lugar dos dias comuns debaixo de um teto só aconteceu muita cura, do tipo que você não projeta, você só continua aparecendo para ela. Eu tenho o privilégio de testemunhar. A Hope é a minha rocha. Nem sempre é tranquilo, nenhum casamento honesto é, mas ela nunca deixou de acreditar no que estamos construindo. Eu não teria me tornado este homem sem o Lou. E o amor que encontrei com a Hope é o que me preparou para o que veio depois: os cuidados paliativos, sentar em quartos onde as pessoas estão perdendo quem elas mais amam. Essa é a minha história de amor. Começou com uma mensagem teimosa no Match.com para uma menina que me mandou não escrever. A melhor regra que já quebrei.</w:t>
+        <w:t xml:space="preserve">Em pouco tempo trabalhamos como um time. Quitamos mais de cem mil dólares em empréstimo estudantil e construímos uma vida com folga em vez de dívida, um lar, uma pequena segurança que eu nunca tive lá atrás, quando eu parecia bem-sucedido. A recuperação me ensinou sobre dinheiro a mesma coisa que me ensinou sobre tudo o mais: você cumpre as pequenas promessas, todo dia, e juntas elas formam uma vida. A gente se mudou para Raleigh. Nunca tivemos filhos, e nunca planejamos ter. O que construímos foi nós dois, e uma vida com espaço para estar presente para as outras pessoas. Hoje em dia isso inclui a mãe da Hope. A Rhonda mora debaixo do nosso teto agora, o que não é uma frase que se diga de leve, e conhecê-la e amá-la tem sido um dos presentes silenciosos deste trecho. Ela não teve a vida mais fácil. O que eu não vi chegando foi a Hope e a mãe dela ficarem próximas, devagar, ao longo de anos, até a Hope começar a chamar a Rhonda de melhor amiga. Nenhuma das coisas boas acontece da noite para o dia. A gente faz viagens juntos, os Outer Banks e outras, e em algum lugar dos dias comuns debaixo de um teto só aconteceu muita cura, do tipo que você não projeta, você só continua aparecendo para ela. Eu tenho o privilégio de testemunhar. A Hope é a minha rocha. Nem sempre é tranquilo, nenhum casamento honesto é, mas ela nunca deixou de acreditar no que estamos construindo. Eu não teria me tornado este homem sem o Lou. E o amor que encontrei com a Hope é o que me preparou para o que veio depois: os cuidados paliativos, sentar em quartos onde as pessoas estão perdendo quem elas mais amam. Essa é a minha história de amor. Começou com uma mensagem teimosa no Match.com para uma menina que me mandou não escrever. A melhor regra que já quebrei.</w:t>
       </w:r>
     </w:p>
     <w:bookmarkEnd w:id="80"/>
@@ -8059,7 +7877,7 @@
         <w:pStyle w:val="FirstParagraph"/>
       </w:pPr>
       <w:r>
-        <w:t xml:space="preserve">Se você olhar nossas fotos de Paris, a gente parece ótimo. O que você não consegue ver é o dia anterior, a Hope de joelhos num quarto de hotel em Bruxelas, raspando fibra capilar derramada de dentro da minha mala para eu me sentir bem parado na frente daquela câmera. As viagens que a Hope e eu fizemos foram alguns dos melhores momentos da minha vida. Foram também uma longa sequência de pequenos desastres, e os desastres são onde a gente ficou forte. A gente não descobriu o que tinha quando o plano deu certo. A gente descobriu quando ele desmoronou e nós dois ainda estávamos ali de pé, resolvendo.</w:t>
+        <w:t xml:space="preserve">Se você olhar nossas fotos de Paris, a gente parece ótimo. O que você não consegue ver é o dia anterior, a Hope de joelhos num quarto de hotel em Bruxelas, raspando fibra capilar derramada de dentro da minha mala para eu me sentir bem parado na frente daquela câmera. As viagens que a Hope e eu fizemos foram alguns dos melhores momentos da minha vida. Foram também uma longa sequência de pequenos desastres, e foi nos desastres que a gente ficou forte. A gente não descobriu o que tinha quando o plano deu certo. A gente descobriu quando ele desmoronou e nós dois ainda estávamos ali de pé, resolvendo.</w:t>
       </w:r>
     </w:p>
     <w:p>
@@ -8075,23 +7893,23 @@
         <w:pStyle w:val="BodyText"/>
       </w:pPr>
       <w:r>
-        <w:t xml:space="preserve">O que ela fez com aquele terno é a parte que eu guardo. Em Bruxelas meu Toppik explodiu, o pó de fibra capilar que eu usava todo dia nas partes ralas, tampa aberta, pote rachado, pó preto entranhado em cada costura da mala. Minha linha do cabelo era a minha única insegurança de verdade, e eu achei que o ensaio estava acabado. Disse a ela que ia usar um chapéu puxado para baixo e chamar de estilo. Ela não fez pouco caso e não me disse que era só cabelo, o que nunca ajuda ninguém. Você podia usar o chapéu de Peaky Blinders, ela disse. Ia ficar ótimo. Aí ela se abaixou no chão e raspou o pó de dentro da mala mesmo assim, colocando de volta no pote pedacinho por pedacinho. A gente vai conseguir o suficiente, ela disse. Não se preocupa. Ela sabia que aquele pó era a única coisa capaz de me levar de me sentir bem para querer me esconder, e em vez de me convencer do contrário, ela resolveu. Se você olhar aquelas fotos de Paris, a gente parece ótimo. Ninguém vê Bruxelas.</w:t>
-      </w:r>
-    </w:p>
-    <w:p>
-      <w:pPr>
-        <w:pStyle w:val="BodyText"/>
-      </w:pPr>
-      <w:r>
-        <w:t xml:space="preserve">A Irlanda foi a que eu não consegui encontrar ela por inteiro. A gente tinha planejado muito antes, mas quando chegou a saúde do Lou estava desmoronando e eu tinha acabado de tirar uma folga do trabalho para ficar com ele. Galway, os Penhascos de Moher, cidades saídas de um cartão-postal, e minha cabeça esteve lá em casa, em Pensacola, o tempo todo. A Hope não pressionou. Ela me disse que ninguém se importava que eu tivesse tirado a folga, que eu tinha permissão de estar onde estava, e ela me amou por uma viagem inteira em que eu não estive totalmente presente. Aquilo é um jeito próprio de carregar alguém, e ela fez isso sem nunca me fazer sentir um fardo. Em Galway comprei para ela um anel de Claddagh, o coraçãozinho seguro por duas mãos, e o dei a ela como a promessa que eu não conseguia dizer em voz alta naquela semana.</w:t>
-      </w:r>
-    </w:p>
-    <w:p>
-      <w:pPr>
-        <w:pStyle w:val="BodyText"/>
-      </w:pPr>
-      <w:r>
-        <w:t xml:space="preserve">Penso naquelas viagens de um jeito diferente agora, não como tempo que eu deveria ter gastado de outra forma, mas como tempo que sou grato de a gente ter tirado, cada minuto bagunçado dele. As fotos nunca contam a história inteira. Não conseguem. Elas só capturam o segundo em que a gente estava sorrindo. Tudo o que mereceu o sorriso aconteceu fora da câmera, e a maior parte disso foi a Hope.</w:t>
+        <w:t xml:space="preserve">O que ela fez com aquele terno é a parte que eu guardo. Em Bruxelas meu Toppik explodiu, o pó de fibra capilar que eu usava todo dia nas partes ralas, tampa aberta, pote rachado, pó preto entranhado em cada costura da mala. Minha linha do cabelo era a minha única insegurança de verdade, e eu achei que o ensaio estava acabado. Disse a ela que ia usar um chapéu puxado para baixo e chamar de estilo. Ela não fez pouco caso e não me disse que era só cabelo, o que nunca ajuda ninguém. Você podia usar o chapéu de Peaky Blinders, ela disse. Ia ficar ótimo. Aí ela se abaixou no chão e raspou o pó de dentro da mala mesmo assim, colocando de volta no pote pedacinho por pedacinho. A gente vai conseguir o suficiente, ela disse. Não se preocupa. Ela sabia que aquele pó era a única coisa capaz de me fazer passar de me sentir bem a querer me esconder, e em vez de me convencer do contrário, ela resolveu. Se você olhar aquelas fotos de Paris, a gente parece ótimo. Ninguém vê Bruxelas.</w:t>
+      </w:r>
+    </w:p>
+    <w:p>
+      <w:pPr>
+        <w:pStyle w:val="BodyText"/>
+      </w:pPr>
+      <w:r>
+        <w:t xml:space="preserve">A Irlanda foi a viagem em que eu não consegui estar ali por inteiro. A gente tinha planejado muito antes, mas quando chegou a saúde do Lou estava desmoronando e eu tinha acabado de tirar uma folga do trabalho para ficar com ele. Galway, os Penhascos de Moher, cidades saídas de um cartão-postal, e minha cabeça estava lá em casa, em Pensacola, o tempo todo. A Hope não pressionou. Ela me disse que ninguém se importava que eu tivesse tirado a folga, que eu tinha permissão para estar onde estava, e ela me amou por uma viagem inteira em que eu não estive totalmente presente. Aquilo é um jeito próprio de carregar alguém, e ela fez isso sem nunca me fazer sentir um fardo. Em Galway comprei para ela um anel de Claddagh, o coraçãozinho segurado por duas mãos, e o dei a ela como a promessa que eu não conseguia dizer em voz alta naquela semana.</w:t>
+      </w:r>
+    </w:p>
+    <w:p>
+      <w:pPr>
+        <w:pStyle w:val="BodyText"/>
+      </w:pPr>
+      <w:r>
+        <w:t xml:space="preserve">Penso naquelas viagens de um jeito diferente agora, não como tempo que eu deveria ter gastado de outra forma, mas como tempo que sou grato por a gente ter tirado, cada minuto bagunçado dele. As fotos nunca contam a história inteira. Não conseguem. Elas só capturam o segundo em que a gente estava sorrindo. Tudo o que mereceu o sorriso aconteceu fora da câmera, e a maior parte disso foi a Hope.</w:t>
       </w:r>
     </w:p>
     <w:bookmarkEnd w:id="81"/>
@@ -8125,7 +7943,7 @@
         <w:pStyle w:val="BodyText"/>
       </w:pPr>
       <w:r>
-        <w:t xml:space="preserve">Pela maior parte da minha vida minha mãe foi inquebrável. Ela tirou dois meninos do México na raça, trabalhava de noite sem reclamar, e ainda dava um jeito de ter uma refeição quente e uma casa arrumada me esperando a cada esquina. Mulher-Maravilha. A primeira rachadura que eu vi nela foi no Central Park.</w:t>
+        <w:t xml:space="preserve">Durante a maior parte da minha vida minha mãe foi inquebrável. Ela tirou dois meninos do México na raça, trabalhava de noite sem reclamar, e ainda dava um jeito de ter uma refeição quente e uma casa arrumada sempre me esperando. Mulher-Maravilha. A primeira rachadura que eu vi nela foi no Central Park.</w:t>
       </w:r>
     </w:p>
     <w:p>
@@ -8149,15 +7967,15 @@
         <w:pStyle w:val="BodyText"/>
       </w:pPr>
       <w:r>
-        <w:t xml:space="preserve">Eles têm uma imagem para isso no programa. O dependente atravessa a vida como um tornado. Quando o vento finalmente baixa, ele olha em volta e conclui que está tudo bem. Todo mundo ainda está de pé nos escombros, ainda tremendo, e ele é o último a perceber. Ficar sóbrio silenciou minha tempestade anos atrás. O que isso não fez foi reparar o que a tempestade fez com as pessoas que estavam dentro dela, e minha mãe estava mais perto. Escrever este livro foi o que finalmente me virou para olhar.</w:t>
-      </w:r>
-    </w:p>
-    <w:p>
-      <w:pPr>
-        <w:pStyle w:val="BodyText"/>
-      </w:pPr>
-      <w:r>
-        <w:t xml:space="preserve">Então outro dia, numa das nossas ligações diárias, contei a ela a verdade que aquilo tinha forçado a subir em mim. Mãe, eu disse, só agora estou vendo o quanto te fiz passar. Sinto muito de verdade. Quis dizer aquilo como uma promessa de ser melhor. Ela não me deixou remoer. Ela não listou as noites, nem o dinheiro que gastou, nem a pressão que aquilo colocou em tudo ao redor. Ela disse, só estou feliz que você está bem agora.</w:t>
+        <w:t xml:space="preserve">Eles têm uma imagem para isso no programa. O dependente atravessa a vida como um tornado. Quando o vento finalmente baixa, ele olha em volta e conclui que está tudo bem. Todo mundo ainda está de pé nos escombros, ainda tremendo, e ele é o último a perceber. Ficar sóbrio silenciou minha tempestade anos atrás. O que isso não fez foi reparar o que a tempestade fez com as pessoas que estavam dentro dela, e minha mãe estava mais perto. Escrever este livro foi o que finalmente me fez virar e olhar.</w:t>
+      </w:r>
+    </w:p>
+    <w:p>
+      <w:pPr>
+        <w:pStyle w:val="BodyText"/>
+      </w:pPr>
+      <w:r>
+        <w:t xml:space="preserve">Então outro dia, numa das nossas ligações diárias, contei a ela a verdade que aquilo tinha trazido à tona em mim. Mãe, eu disse, só agora estou vendo o quanto te fiz passar. Sinto muito de verdade. Quis dizer aquilo como uma promessa de ser melhor. Ela não me deixou remoer. Ela não listou as noites, nem o dinheiro que gastou, nem a pressão que aquilo colocou em tudo ao redor. Ela disse, só estou feliz que você está bem agora.</w:t>
       </w:r>
     </w:p>
     <w:p>
@@ -8280,15 +8098,15 @@
         <w:pStyle w:val="BodyText"/>
       </w:pPr>
       <w:r>
-        <w:t xml:space="preserve">Você já conheceu o Detroit Bob — o que só estava nas salas para salvar a própria pele. O que eu não te contei é o resto dele. Conheci ele no Courage at Noon no meu primeiro ano sóbrio. Careca, uma voz áspera, um rosto que parecia permanentemente incomodado, como se o mundo tivesse decepcionado ele pessoalmente e ele ainda não tivesse decidido se ia perdoar. Ele cheirava a Old Spice, só o suficiente, nunca demais. E ele tinha a única coisa da qual eu não conseguia parar de olhar: décadas de sobriedade, velho, e em paz com tudo aquilo. Eu precisava entender como uma pessoa fazia aquilo.</w:t>
-      </w:r>
-    </w:p>
-    <w:p>
-      <w:pPr>
-        <w:pStyle w:val="BodyText"/>
-      </w:pPr>
-      <w:r>
-        <w:t xml:space="preserve">Então a gente ficou próximo. A gente ia comer depois das reuniões, o moleque com alguns anos e o velho que tinha visto de tudo. Aí, anos dentro da amizade, veio o câncer. Ele sabia que aquilo ia levá-lo, e mesmo assim ficou sóbrio, um homem no fim da vida com toda desculpa do mundo para recair, escolhendo não recair. Ele lutou contra por uns seis meses, e em algum ponto entrou em cuidados paliativos, a primeira vez que aquela palavra significou alguém que eu amava em vez de uma coisa que eu um dia faria para viver.</w:t>
+        <w:t xml:space="preserve">Você já conheceu o Detroit Bob — o que só estava nas salas para salvar a própria pele. O que eu não te contei é o resto dele. Conheci ele no Courage at Noon no meu primeiro ano sóbrio. Careca, uma voz áspera, um rosto que parecia permanentemente incomodado, como se o mundo tivesse decepcionado ele pessoalmente e ele ainda não tivesse decidido se ia perdoar. Ele cheirava a Old Spice, só o suficiente, nunca demais. E ele tinha a única coisa da qual eu não conseguia tirar os olhos: décadas de sobriedade, velho, e em paz com tudo aquilo. Eu precisava entender como uma pessoa fazia aquilo.</w:t>
+      </w:r>
+    </w:p>
+    <w:p>
+      <w:pPr>
+        <w:pStyle w:val="BodyText"/>
+      </w:pPr>
+      <w:r>
+        <w:t xml:space="preserve">Então a gente ficou próximo. A gente ia comer depois das reuniões, o moleque com alguns anos e o velho que tinha visto de tudo. Aí, muitos anos de amizade depois, veio o câncer. Ele sabia que aquilo ia levá-lo, e mesmo assim ficou sóbrio, um homem no fim da vida com toda desculpa do mundo para recair, escolhendo não recair. Ele lutou contra por uns seis meses, e em algum ponto entrou em cuidados paliativos, a primeira vez que aquela palavra significou alguém que eu amava em vez de uma coisa que eu um dia faria para viver.</w:t>
       </w:r>
     </w:p>
     <w:p>
@@ -8304,31 +8122,31 @@
         <w:pStyle w:val="BodyText"/>
       </w:pPr>
       <w:r>
-        <w:t xml:space="preserve">Perto do fim eu fui vê-lo, e não foi nada como o quarto de casa de repouso da minha infância — aquele era um homem adulto ativamente morrendo, e todo mundo na casa sabia. O lugar estava cheio. Pessoas que ele tinha carregado nas salas, pessoas que tinham carregado ele, um fluxo constante vindo sentar com ele e dizer o que precisavam dizer enquanto ele ainda podia ouvir. Meu primeiro pensamento foi um pânico pequeno e honesto: como eu ia sentir tudo aquilo sem nada para tirar o peso? Eu nunca tinha vivido o luto sem um amortecedor. O pânico não durou, e o que o substituiu não foi tristeza. Foi gratidão, e uma calma serena, o fato simples de estar ali e não precisar estar em nenhum outro lugar. Ele me disse uma vez que a sobriedade não era uma coisa contra a qual ele lutava toda manhã; era uma decisão que ele tinha tomado uma única vez e à qual nunca voltou a revisitar, e ele a carregou até a beira da vida. Décadas mais velho que eu, e ainda me mostrando como se fazia. Foi aí que entendi o que ser sóbrio tinha me comprado: a capacidade de ficar num quarto daqueles e não fugir.</w:t>
-      </w:r>
-    </w:p>
-    <w:p>
-      <w:pPr>
-        <w:pStyle w:val="BodyText"/>
-      </w:pPr>
-      <w:r>
-        <w:t xml:space="preserve">Eu estava no quarto quando ele partiu, em 2016. Eu já tinha estado por perto de muita coisa a essa altura, mas não daquilo, não da partida de verdade. Assisti aquilo acontecer, e depois fiquei pela esposa dele, uma mulher que eu amava, porque não havia mais nada a fazer a não ser estar ali e não ir. Foi aí que finalmente caiu a ficha. O Bob tinha ido. Não havia como consertar, nenhum acordo para fechar, nenhuma resposta certa que tivesse comprado para ele mais um minuto.</w:t>
-      </w:r>
-    </w:p>
-    <w:p>
-      <w:pPr>
-        <w:pStyle w:val="BodyText"/>
-      </w:pPr>
-      <w:r>
-        <w:t xml:space="preserve">Por volta desse mesmo trecho o reconhecimento que eu tinha perseguido a vida inteira finalmente apareceu no trabalho, e mal registrou. Alguém encaminhou um artigo interno. Um colega me parabenizou de passagem. Passei os olhos uma vez e fechei a tela. O Lou notou, do jeito que ele notava tudo. Você está bem-sucedido de novo, ele disse. Acho que sim, eu disse. Você não fala como se importasse. É porque não me importa, eu disse. Não do jeito que costumava. Ele assentiu. Aquele aceno foi a aprovação.</w:t>
-      </w:r>
-    </w:p>
-    <w:p>
-      <w:pPr>
-        <w:pStyle w:val="BodyText"/>
-      </w:pPr>
-      <w:r>
-        <w:t xml:space="preserve">Falei com o Lou sobre o Bob uma noite. Não sei por que isso está me atingindo tanto, eu disse. Fiz tudo certo. Ele não hesitou. Não é por isso que está te incomodando. Ele tinha razão. O Bob não tinha precisado que eu consertasse nada. Ele tinha precisado de mim no quarto. Eu estava sendo deixado entrar em lugares onde a presença era a única coisa que restava a oferecer, e alguma coisa em mim já sabia como fazer aquilo. Não como uma técnica. Como uma prática. Um velho morrendo sóbrio aos oitenta e oito me mostrou que o máximo que você pode fazer naquela beira é se recusar a ir embora. Anos depois, aquilo virou o trabalho inteiro.</w:t>
+        <w:t xml:space="preserve">Perto do fim eu fui vê-lo, e não foi nada como o quarto de casa de repouso da minha infância — aquele era um homem adulto morrendo de verdade, e todo mundo na casa sabia. O lugar estava cheio. Pessoas que ele tinha carregado nas salas, pessoas que tinham carregado ele, um fluxo constante vindo sentar com ele e dizer o que precisavam dizer enquanto ele ainda podia ouvir. Meu primeiro pensamento foi um pânico pequeno e honesto: como eu ia sentir tudo aquilo sem nada para tirar o peso? Eu nunca tinha vivido o luto sem um amortecedor. O pânico não durou, e o que o substituiu não foi tristeza. Foi gratidão, e uma calma serena, o fato simples de estar ali e não precisar estar em nenhum outro lugar. Ele me disse uma vez que a sobriedade não era uma coisa contra a qual ele lutava toda manhã; era uma decisão que ele tinha tomado uma única vez e nunca mais revisitou, e ele a carregou até a beira da vida. Décadas mais velho que eu, e ainda me mostrando como se fazia. Foi aí que entendi o que ser sóbrio tinha me comprado: a capacidade de ficar num quarto daqueles e não fugir.</w:t>
+      </w:r>
+    </w:p>
+    <w:p>
+      <w:pPr>
+        <w:pStyle w:val="BodyText"/>
+      </w:pPr>
+      <w:r>
+        <w:t xml:space="preserve">Eu estava no quarto quando ele partiu, em 2016. Eu já tinha estado por perto de muita coisa a essa altura, mas não daquilo, não da partida de verdade. Assisti àquilo acontecer, e depois fiquei pela esposa dele, uma mulher que eu amava, porque não havia mais nada a fazer a não ser estar ali e não ir. Foi aí que finalmente caiu a ficha. O Bob havia partido. Não havia como consertar, nenhum acordo para fechar, nenhuma resposta certa que tivesse comprado para ele mais um minuto.</w:t>
+      </w:r>
+    </w:p>
+    <w:p>
+      <w:pPr>
+        <w:pStyle w:val="BodyText"/>
+      </w:pPr>
+      <w:r>
+        <w:t xml:space="preserve">Por volta desse mesmo trecho o reconhecimento que eu tinha perseguido a vida inteira finalmente apareceu no trabalho, e mal me atingiu. Alguém encaminhou um artigo interno. Um colega me parabenizou de passagem. Passei os olhos uma vez e fechei a tela. O Lou notou, do jeito que ele notava tudo. Você está bem-sucedido de novo, ele disse. Acho que sim, eu disse. Você não fala como se importasse. É porque não me importa, eu disse. Não do jeito que costumava. Ele assentiu. Aquele aceno foi a aprovação.</w:t>
+      </w:r>
+    </w:p>
+    <w:p>
+      <w:pPr>
+        <w:pStyle w:val="BodyText"/>
+      </w:pPr>
+      <w:r>
+        <w:t xml:space="preserve">Falei com o Lou sobre o Bob uma noite. Não sei por que isso está me atingindo tanto, eu disse. Fiz tudo certo. Ele não hesitou. Não é por isso que está te incomodando. Ele tinha razão. O Bob não tinha precisado que eu consertasse nada. Ele tinha precisado de mim no quarto. Estavam me deixando entrar em lugares onde a presença era a única coisa que restava a oferecer, e alguma coisa em mim já sabia como fazer aquilo. Não como uma técnica. Como uma prática. Um velho morrendo sóbrio aos oitenta e oito me mostrou que o máximo que você pode fazer naquela beira é se recusar a ir embora. Anos depois, aquilo virou o trabalho inteiro.</w:t>
       </w:r>
     </w:p>
     <w:bookmarkEnd w:id="84"/>
@@ -8355,7 +8173,7 @@
           <w:iCs/>
           <w:i/>
         </w:rPr>
-        <w:t xml:space="preserve">Primavera de 2025. Nosso carro apontado para o norte, saindo de Pensacola, dezoito anos morando perto dele ficando em algum ponto lá atrás nos retrovisores. Ele tinha me mandado ir — sempre foi o jeito dele, mais preocupado que estivéssemos bem do que que estivéssemos perto. Eu não sabia que era a última viagem do tipo antigo, do tipo em que ele ainda estava na outra ponta da estrada. Desta vez, quem dirigiu fui eu.</w:t>
+        <w:t xml:space="preserve">Primavera de 2025. Nosso carro apontado para o norte, saindo de Pensacola, dezoito anos morando perto dele, ficando em algum ponto lá atrás nos retrovisores. Ele tinha me mandado ir — sempre foi o jeito dele, mais preocupado que estivéssemos bem do que perto. Eu não sabia que era a última viagem do tipo antigo, do tipo em que ele ainda estava na outra ponta da estrada. Desta vez, quem dirigiu fui eu.</w:t>
       </w:r>
     </w:p>
     <w:p>
@@ -8507,7 +8325,7 @@
         <w:pStyle w:val="BodyText"/>
       </w:pPr>
       <w:r>
-        <w:t xml:space="preserve">Por volta de um ano depois, o Dave perdeu o filho. Ele tinha vinte e um anos, trabalhava numa pizzaria, e estava voltando pra casa de bicicleta pelo bairro quando um carro o atingiu. Ele não resistiu. Gente do país inteiro da empresa veio ao velório, só pra estar ao lado do Dave. Nunca vi alguém com tanta fé. Só de voltar já teria sido suficiente. Ele fez mais.</w:t>
+        <w:t xml:space="preserve">Por volta de um ano depois, o Dave perdeu o filho. Ele tinha vinte e um anos, trabalhava numa pizzaria, e estava voltando pra casa de bicicleta pelo bairro quando um carro o atingiu. Ele não resistiu. Gente da empresa do país inteiro veio ao velório, só pra estar ao lado do Dave. Nunca vi alguém com tanta fé. Só de voltar já teria sido suficiente. Ele fez mais.</w:t>
       </w:r>
     </w:p>
     <w:p>
@@ -8636,7 +8454,7 @@
         <w:pStyle w:val="BodyText"/>
       </w:pPr>
       <w:r>
-        <w:t xml:space="preserve">Cinco semanas depois que comecei no emprego de cuidados paliativos, meu pai começou a morrer. Mudamos para Raleigh porque a vida estava se expandindo. A Hope era farmacêutica havia oito anos. Raleigh fazia sentido, empregos, comunidade, uma igreja que parecia nossa. Deixar Pensacola significava deixar raízes. A Hope nunca vacilou. É quem ela é. Não cegamente otimista; ela enxerga com clareza e faz perguntas difíceis. Mas por baixo de tudo há uma crença rochosa de que Deus tem um plano para que sejamos úteis. Quando a oportunidade dos cuidados paliativos apareceu, foi como um quarto ao redor do qual eu vinha circulando havia anos com a porta finalmente aberta. Sem debate. Sem planilha. Era ali que eu era mais necessário.</w:t>
+        <w:t xml:space="preserve">Cinco semanas depois que comecei no emprego de cuidados paliativos, meu pai começou a morrer. Mudamos para Raleigh porque a vida estava se expandindo. A Hope era farmacêutica havia oito anos. Raleigh fazia sentido, empregos, comunidade, uma igreja que parecia nossa. Deixar Pensacola significava deixar raízes. A Hope nunca vacilou. É quem ela é. Não cegamente otimista; ela enxerga com clareza e faz perguntas difíceis. Mas por baixo de tudo há uma crença firme como rocha de que Deus tem um plano para que sejamos úteis. Quando a oportunidade dos cuidados paliativos apareceu, foi como um quarto ao redor do qual eu vinha circulando havia anos com a porta finalmente aberta. Sem debate. Sem planilha. Era ali que eu era mais necessário.</w:t>
       </w:r>
     </w:p>
     <w:bookmarkStart w:id="90" w:name="os-quartos"/>
@@ -8689,31 +8507,31 @@
         <w:pStyle w:val="BodyText"/>
       </w:pPr>
       <w:r>
-        <w:t xml:space="preserve">Outro quarto ficou comigo, e vou mantê-lo vago por respeito. Dois homens, e levou cerca de um minuto para ver que fosse o que fosse que havia entre eles era a coisa mais profunda na vida de qualquer um dos dois. Mas quando um deles falava do outro, a palavra que usava era melhor amigo. Eles eram companheiros, e tinham passado uma vida inteira mantendo uma distância cuidadosa em público, e mesmo ali, mesmo no fim, o hábito se manteve. O amor era real. A demonstração dele ainda tinha que ficar escondida. Eu não nomeei aquilo. Não cabia a mim nomear. O que eu mais lembro é a sensação de que aquele que ainda podia partir precisava chegar em casa, ao único lugar onde os dois algum dia tinham sido livres para amar em voz alta. Nunca esqueci isso. Parte deste trabalho é reparar no amor que teve de viver em código, e abrir espaço para ele sem fazer disso uma questão.</w:t>
-      </w:r>
-    </w:p>
-    <w:p>
-      <w:pPr>
-        <w:pStyle w:val="BodyText"/>
-      </w:pPr>
-      <w:r>
-        <w:t xml:space="preserve">Num dos quartos eu estava conversando com o paciente, um vai e vem tranquilo, e em algum ponto contei a ele um pouco da minha própria história, o vício, os anos que perdi, a longa estrada de volta. Aprendi que quando eu abro essa porta nem que seja uma fresta, as pessoas atravessam. A esposa dele tinha entrado no meio da conversa, e quando eu terminei ela ficou quieta, depois me perguntou algo que não tinha nada a ver com o marido e tudo a ver com o que ela de fato estava carregando. O filho dela tinha trinta e oito anos, morava em casa, se afundando na bebida. Ele tinha uma filhinha própria, e a mãe dele ficava acordada de noite se perguntando se ele conseguiria cuidar dela. A reabilitação funcionava, ela queria saber. O que ela podia fazer. Se havia alguma coisa que ela podia fazer. Eu dei a ela o que eu tinha, a verdade como eu a tinha vivido, sem enfeitar. Você não causou isso, eu disse a ela. Você não pode controlar isso. Você não pode curar isso. O que você pode fazer é ficar, e ajudá-lo a viver tempo suficiente para chegar lá. Mas principalmente eu entendi que eu tinha entrado naquele quarto para me sentar com um homem que estava morrendo e acabei segurando o outro luto da esposa dele, o luto vivo. O vício não espera do lado de fora da porta dos cuidados paliativos. Ele já está em metade dos quartos, e porque eu voltei dele, as famílias me entregam esse medo também. Eu aceito.</w:t>
-      </w:r>
-    </w:p>
-    <w:p>
-      <w:pPr>
-        <w:pStyle w:val="BodyText"/>
-      </w:pPr>
-      <w:r>
-        <w:t xml:space="preserve">E teve um pastor que vou chamar de Melvin. A esposa dele era filha de pastor que tinha jurado que nunca se casaria com um pastor e tinha ido embora e conquistado o próprio doutorado, e em algum ponto disso tudo se casou com um mesmo assim. O que me impressionou foi como ela o amava. Não exatamente pelo jeito que ele a amava, mas pela vida inteira que eles tinham construído, o acúmulo completo dela empilhado no quarto com eles. O filho dele estava lá, e o neto, e a esposa, todos eles sabendo que ele podia partir a qualquer momento, todos eles ficando.</w:t>
-      </w:r>
-    </w:p>
-    <w:p>
-      <w:pPr>
-        <w:pStyle w:val="BodyText"/>
-      </w:pPr>
-      <w:r>
-        <w:t xml:space="preserve">Eu não estava lá para o fim mesmo. Eu o vi perto dele, e um único pensamento me atravessou que eu não consegui retirar: eu nunca quero ver meu próprio pai assim. Eu não tinha ideia de quão poucas semanas faltavam antes de aquilo deixar de ser um medo e se tornar uma escolha diante de mim.</w:t>
+        <w:t xml:space="preserve">Outro quarto ficou comigo, e vou mantê-lo vago por respeito. Dois homens, e levou cerca de um minuto para ver que, fosse o que fosse o que havia entre eles, era a coisa mais profunda na vida de qualquer um dos dois. Mas quando um deles falava do outro, a palavra que usava era melhor amigo. Eles eram companheiros, e tinham passado uma vida inteira mantendo uma distância cuidadosa em público, e mesmo ali, mesmo no fim, o hábito se manteve. O amor era real. A demonstração dele ainda tinha que ficar escondida. Eu não nomeei aquilo. Não cabia a mim nomear. O que eu mais lembro é a sensação de que aquele que ainda podia partir precisava chegar em casa, ao único lugar onde os dois algum dia tinham sido livres para amar em voz alta. Nunca esqueci isso. Parte deste trabalho é reparar no amor que teve de viver em código, e abrir espaço para ele sem fazer disso uma questão.</w:t>
+      </w:r>
+    </w:p>
+    <w:p>
+      <w:pPr>
+        <w:pStyle w:val="BodyText"/>
+      </w:pPr>
+      <w:r>
+        <w:t xml:space="preserve">Num dos quartos eu estava conversando com o paciente, um vai e vem tranquilo, e em algum ponto contei a ele um pouco da minha própria história, o vício, os anos que perdi, a longa estrada de volta. Aprendi que quando eu abro essa porta nem que seja uma fresta, as pessoas atravessam. A esposa dele tinha entrado no meio da conversa, e quando eu terminei ela ficou quieta, depois me perguntou algo que não tinha nada a ver com o marido e tudo a ver com o que ela de fato estava carregando. O filho dela tinha trinta e oito anos, morava em casa, se afundando na bebida. Ele mesmo tinha uma filhinha, e a mãe dele ficava acordada de noite se perguntando se ele conseguiria cuidar dela. A reabilitação funcionava, ela queria saber. O que ela podia fazer. Se havia alguma coisa que ela podia fazer. Eu dei a ela o que eu tinha, a verdade como eu a tinha vivido, sem enfeitar. Você não causou isso, eu disse a ela. Você não pode controlar isso. Você não pode curar isso. O que você pode fazer é ficar, e ajudá-lo a viver tempo suficiente para chegar lá. Mas principalmente eu entendi que eu tinha entrado naquele quarto para me sentar com um homem que estava morrendo e acabei segurando o outro luto da esposa dele, o luto vivo. O vício não espera do lado de fora da porta dos cuidados paliativos. Ele já está em metade dos quartos, e porque eu voltei dele, as famílias me entregam esse medo também. Eu aceito.</w:t>
+      </w:r>
+    </w:p>
+    <w:p>
+      <w:pPr>
+        <w:pStyle w:val="BodyText"/>
+      </w:pPr>
+      <w:r>
+        <w:t xml:space="preserve">E teve um pastor que vou chamar de Melvin. A esposa dele era filha de pastor que tinha jurado que nunca se casaria com um pastor e tinha ido embora e conquistado o próprio doutorado, e em algum ponto disso tudo acabou se casando com um mesmo assim. O que me impressionou foi como ela o amava. Não exatamente pelo jeito que ele a amava, mas pela vida inteira que eles tinham construído, o acúmulo completo daquilo empilhado no quarto com eles. O filho dele estava lá, e o neto, e a esposa, todos eles sabendo que ele podia partir a qualquer momento, todos eles ficando.</w:t>
+      </w:r>
+    </w:p>
+    <w:p>
+      <w:pPr>
+        <w:pStyle w:val="BodyText"/>
+      </w:pPr>
+      <w:r>
+        <w:t xml:space="preserve">Eu não estava lá para o fim mesmo. Eu o vi perto dele, e um único pensamento me atravessou que eu não consegui retirar: eu nunca quero ver meu próprio pai assim. Eu não tinha ideia de quão poucas semanas faltavam antes que aquilo deixasse de ser um medo e se tornasse uma escolha diante de mim.</w:t>
       </w:r>
     </w:p>
     <w:bookmarkEnd w:id="90"/>
@@ -8787,7 +8605,7 @@
         <w:pStyle w:val="BodyText"/>
       </w:pPr>
       <w:r>
-        <w:t xml:space="preserve">O Lou era um homem de lugares. Ele podia parecer simples se você só pegasse a superfície, mas carregava um mapa privado do mundo dentro dele — os melhores restaurantes, os melhores bagels, as ruas que valiam a pena pegar, a loja que valia passar por outras vinte para chegar. Nova York não era uma ideia para ele. Era memória muscular. Ele voltava sempre aos lugares que conhecia desde a infância, como se tradição fosse algo que você mantinha vivo visitando. No Clyde’s em Lodi ele tinha uma regra de limonada: duas bolas, uma sempre de limão, a outra à sua escolha. Flexível dentro de uma tradição fixa — havia espaço para escolha, mas só depois de o limão estar resolvido. Ele nunca queria ser apressado numa refeição. Um restaurante não era um lugar para consumir comida; era um lugar para ser reconhecido, para se acomodar, para deixar a coisa se desenrolar. Ele gostava de garçons de carreira, profissionais que lembravam dele e conheciam o ofício, e dava gorjeta de vinte dólares como um homem prestando respeito a pessoas que sabiam fazer o trabalho delas. Ele não era exigente com comida; a comida em si quase nunca o perdia. O que o perdia era mau atendimento, e pagar por uma refeição mal feita. Aquilo ofendia a mesma coisa nele que as gorjetas de vinte dólares honravam.</w:t>
+        <w:t xml:space="preserve">O Lou era um homem de lugares. Ele podia parecer simples se você ficasse só na superfície, mas carregava um mapa privado do mundo dentro dele — os melhores restaurantes, os melhores bagels, as ruas que valiam a pena pegar, a loja que valia passar por outras vinte para chegar. Nova York não era uma ideia para ele. Era memória muscular. Ele voltava sempre aos lugares que conhecia desde a infância, como se tradição fosse algo que você mantinha vivo visitando. No Clyde’s em Lodi ele tinha uma regra de limonada: duas bolas, uma sempre de limão, a outra à sua escolha. Flexível dentro de uma tradição fixa — havia espaço para escolha, mas só depois de o limão estar resolvido. Ele nunca queria ser apressado numa refeição. Um restaurante não era um lugar para consumir comida; era um lugar para ser reconhecido, para se acomodar, para deixar a coisa se desenrolar. Ele gostava de garçons de carreira, profissionais que lembravam dele e conheciam o ofício, e dava gorjeta de vinte dólares como um homem prestando respeito a pessoas que sabiam fazer o trabalho delas. Ele não era exigente com comida; a comida em si quase nunca o tirava do sério. O que o tirava do sério era mau atendimento, e pagar por uma refeição mal feita. Aquilo ofendia a mesma coisa nele que as gorjetas de vinte dólares honravam.</w:t>
       </w:r>
     </w:p>
     <w:p>
@@ -8803,7 +8621,7 @@
         <w:pStyle w:val="BodyText"/>
       </w:pPr>
       <w:r>
-        <w:t xml:space="preserve">E ele nunca parou de querer ser útil. Ele tinha se aposentado no papel e continuou trabalhando mesmo assim, entrando pelos oitenta anos, atendendo telefones e desenrolando problemas de computador. O pagamento era quase nada, e um dia ele me ligou como se tivesse ganhado na loteria porque o chefe tinha dobrado. O que eu lembro não é o dinheiro. É um homem de oitenta anos radiante com uma boa avaliação de desempenho. Aos oitenta, ele fez uma corrida de 5K com a Hope e comigo, terminou em último lugar, e levou para casa o prêmio da tartaruga, o que de algum jeito deixou tudo melhor. Depois da cirurgia de 2015 — tiraram cerca de metade do esôfago e metade do estômago dele — ele comia menos, pesava menos, tomava as vitaminas, ia ao médico holístico. Ele ganhou anos para si. E os passou querendo coisas. Força. Respeito. Uma boa avaliação. A prova de que não estava acabado. Há dignidade em ainda querer, e meu pai teve isso até o fim.</w:t>
+        <w:t xml:space="preserve">E ele nunca parou de querer ser útil. Ele tinha se aposentado no papel e continuou trabalhando mesmo assim, entrando pelos oitenta anos, atendendo telefones e desenrolando problemas de computador. O pagamento era quase nada, e um dia ele me ligou como se tivesse ganhado na loteria porque o chefe tinha dobrado o valor. O que eu lembro não é o dinheiro. É um homem de oitenta anos radiante com uma boa avaliação de desempenho. Aos oitenta, ele fez uma corrida de 5K com a Hope e comigo, terminou em último lugar, e levou para casa o prêmio da tartaruga, o que de algum jeito deixou tudo melhor. Depois da cirurgia de 2015 — tiraram cerca de metade do esôfago e metade do estômago dele — ele comia menos, pesava menos, tomava as vitaminas, ia ao médico holístico. Ele ganhou anos para si. E os passou querendo coisas. Força. Respeito. Uma boa avaliação. A prova de que não estava acabado. Há dignidade em ainda querer, e meu pai teve isso até o fim.</w:t>
       </w:r>
     </w:p>
     <w:bookmarkEnd w:id="93"/>
@@ -8841,7 +8659,7 @@
         <w:pStyle w:val="BodyText"/>
       </w:pPr>
       <w:r>
-        <w:t xml:space="preserve">Em janeiro de 2024 o câncer voltou. Estágio 4. Pulmões e linfonodos. O Lou tinha oitenta e dois anos. Ele contou para a Donna. Contou para a Lisa. Não contou para mais ninguém. Eu percebi antes de saber o que estava percebendo, o humor dele um pouco fora, algo na qualidade dele que eu não conseguia nomear. O Chris ia se casar em fevereiro, e o Lou tinha decidido, quieta e completamente, que o casamento do filho não ia ser sobre o diagnóstico dele. Então ele apareceu. Ele dançou. Ele comemorou. O pai da Nisha tinha falecido no ano anterior, e o casamento foi uma grande celebração indiana em Fort Lauderdale, alegre e carregando luto além de amor. O Lou entendia isso. Ele segurou aquilo por dentro e deixou o dia ser o que devia ser. Minha mãe também estava lá, o Parkinson dela pegando forte naquele mês. Ela tinha levado um tombo nos dias anteriores e veio mesmo assim, remendada com um Band-Aid que não enganava ninguém. No fim da noite ela achou o Lou e disse, Não vá morrer em mim. E meu pai — o câncer já de volta dentro dele, o segredo já selado — olhou para ela e disse, Você não vá morrer em mim. Ela não sabia o que ele estava carregando. Ele sabia. Ele guardou o segredo até março ou abril. O câncer voltou, ele disse. Janeiro. Eu não quis dizer nada por causa do casamento do Chris. E em julho de 2025, um ano e meio dentro da luta, ele estava lá quando a filha do Chris e da Nisha, a Priya, nasceu. Ele a segurou no colo.</w:t>
+        <w:t xml:space="preserve">Em janeiro de 2024 o câncer voltou. Estágio 4. Pulmões e linfonodos. O Lou tinha oitenta e dois anos. Ele contou para a Donna. Contou para a Lisa. Não contou para mais ninguém. Eu percebi antes de saber o que estava percebendo, o humor dele um pouco fora, algo no jeito dele que eu não conseguia nomear. O Chris ia se casar em fevereiro, e o Lou tinha decidido, em silêncio e por completo, que o casamento do filho não ia girar em torno do diagnóstico dele. Então ele apareceu. Ele dançou. Ele comemorou. O pai da Nisha tinha falecido no ano anterior, e o casamento foi uma grande celebração indiana em Fort Lauderdale, alegre e carregando luto além de amor. O Lou entendia isso. Ele segurou aquilo por dentro e deixou o dia ser o que devia ser. Minha mãe também estava lá, o Parkinson dela pegando forte naquele mês. Ela tinha levado um tombo nos dias anteriores e veio mesmo assim, remendada com um Band-Aid que não enganava ninguém. No fim da noite ela achou o Lou e disse, Não vá morrer em mim. E meu pai — o câncer já de volta dentro dele, o segredo já selado — olhou para ela e disse, Você não vá morrer em mim. Ela não sabia o que ele estava carregando. Ele sabia. Ele guardou o segredo até março ou abril. O câncer voltou, ele disse. Janeiro. Eu não quis dizer nada por causa do casamento do Chris. E em julho de 2025, já um ano e meio de luta, ele estava lá quando a filha do Chris e da Nisha, a Priya, nasceu. Ele a segurou no colo.</w:t>
       </w:r>
     </w:p>
     <w:p>
@@ -8893,7 +8711,7 @@
         <w:pStyle w:val="FirstParagraph"/>
       </w:pPr>
       <w:r>
-        <w:t xml:space="preserve">O Lou não dizia que estava com dor. Ele veio de um mundo em que dor não era algo que homens anunciavam. Você engolia, sacudia para fora, atravessava trabalhando, ou escondia mal o suficiente para que todo mundo ao seu redor tivesse que virar detetive. O desconforto dele saía de lado — inquietação em vez de linguagem, um homem que não conseguia se acomodar numa cadeira em que tinha sentado por vinte anos.</w:t>
+        <w:t xml:space="preserve">O Lou não dizia que estava com dor. Ele veio de um mundo em que dor não era algo que homens anunciavam. Você engolia, sacudia de si, atravessava trabalhando, ou escondia mal o suficiente para que todo mundo ao seu redor tivesse que virar detetive. O desconforto dele saía de lado — inquietação em vez de linguagem, um homem que não conseguia se acomodar numa cadeira em que tinha sentado por vinte anos.</w:t>
       </w:r>
     </w:p>
     <w:p>
@@ -8925,7 +8743,7 @@
         <w:pStyle w:val="BodyText"/>
       </w:pPr>
       <w:r>
-        <w:t xml:space="preserve">Naquela primavera, a Hope e eu contamos a ele que estávamos nos mudando para Raleigh. Dava para ver que ele ficou decepcionado. Eu tinha morado perto dele em Pensacola por dezoito anos, quase dezenove. Mas ele entendeu, e me mandou ir. Sempre foi o jeito dele, mesmo no fim, mais preocupado com se a gente estava bem do que com se a gente estava perto. A última vez que eu o vi antes da mudança a gente foi ao McGuire’s. Ele parecia bem. Ele disse que não estava preocupado, disse que enquanto a Donna estivesse ali ele estava bem. Uma parte de mim olha para trás e se pergunta se eu deveria ter ficado mais. Eu não teria como saber que cinco semanas dentro do meu novo emprego ele daria uma virada e desabaria rápido.</w:t>
+        <w:t xml:space="preserve">Naquela primavera, a Hope e eu contamos a ele que estávamos nos mudando para Raleigh. Dava para ver que ele ficou decepcionado. Eu tinha morado perto dele em Pensacola por dezoito anos, quase dezenove. Mas ele entendeu, e me mandou ir. Sempre foi o jeito dele, mesmo no fim, mais preocupado em saber se a gente estava bem do que se estava perto. A última vez que eu o vi antes da mudança a gente foi ao McGuire’s. Ele parecia bem. Ele disse que não estava preocupado, disse que enquanto a Donna estivesse ali ele estava bem. Uma parte de mim olha para trás e se pergunta se eu deveria ter ficado mais. Eu não teria como saber que cinco semanas dentro do meu novo emprego ele daria uma virada e desabaria rápido.</w:t>
       </w:r>
     </w:p>
     <w:p>
@@ -9168,7 +8986,7 @@
         <w:pStyle w:val="BodyText"/>
       </w:pPr>
       <w:r>
-        <w:t xml:space="preserve">Chris contou aquela de Fargo. Anos atrás, o Pai entrou no carro e dirigiu sozinho de Nova Jersey até Fargo, na Dakota do Norte, para ver o Chris terminar um torneio nacional de luta. Se importava a um dos filhos dele, ele aparecia, não importava a distância. E Chris partilhou a frase que os dois tinham guardado entre si por anos. Depois dos grandes momentos, diziam baixinho um para o outro. Ei, Pai, a gente conseguiu. Quatro palavras que continham todas as madrugadas e as longas viagens, todas as noites em que teria sido mais fácil desistir. Sentado ali, pensei em quantos de nós tinham a própria versão daquilo com ele, e em como todos íamos ter que aprender a dizer aquilo agora sem ele ali para responder.</w:t>
+        <w:t xml:space="preserve">Chris contou aquela de Fargo. Anos atrás, o Pai entrou no carro e dirigiu sozinho de New Jersey até Fargo, na Dakota do Norte, para ver o Chris terminar um torneio nacional de luta. Se aquilo importava a um dos filhos dele, ele aparecia, não importava a distância. E Chris partilhou a frase que os dois tinham guardado entre si por anos. Depois dos grandes momentos, diziam baixinho um para o outro. Ei, Pai, a gente conseguiu. Quatro palavras que continham todas as madrugadas e as longas viagens, todas as noites em que teria sido mais fácil desistir. Sentado ali, pensei em quantos de nós tinham a própria versão daquilo com ele, e em como todos íamos ter que aprender a dizer aquilo agora sem ele ali para responder.</w:t>
       </w:r>
     </w:p>
     <w:p>
@@ -9698,23 +9516,23 @@
         <w:pStyle w:val="BodyText"/>
       </w:pPr>
       <w:r>
-        <w:t xml:space="preserve">Naquela manhã entrei numa das comunidades de moradia assistida que eu visito, numa visita de rotina. Linda estava na mesa redonda perto do posto de enfermagem. Ela era enfermeira havia muito tempo, dava para ver pelo jeito como se portava. Compassiva, mas não do tipo que deixa todo mundo entrar. Uma firmeza que reconheci. Começamos a conversar. Ela era da região de Buffalo, no norte do estado de Nova York. Brincamos. Foi leve de um jeito que as coisas não tinham sido nos últimos dias.</w:t>
-      </w:r>
-    </w:p>
-    <w:p>
-      <w:pPr>
-        <w:pStyle w:val="BodyText"/>
-      </w:pPr>
-      <w:r>
-        <w:t xml:space="preserve">Então contei a ela que tínhamos enterrado meu pai no sábado. O rosto dela mudou. Dava para ver que ela sentiu. Só ficou ali comigo. E eu me deixei ir. Não chamaria de colapso, mas chorei no consultório dela, daquele jeito cru, na frente de alguém que eu mal conhecia, e não sei se a gente deve chorar na frente de uma enfermeira que acabou de conhecer, num lugar que você visita a trabalho. Mas naquele momento senti algo que só posso chamar de espiritual, a sensação de que Deus tinha colocado aquela pessoa no meu caminho. Não por indicações ou negócios. Por isto.</w:t>
-      </w:r>
-    </w:p>
-    <w:p>
-      <w:pPr>
-        <w:pStyle w:val="BodyText"/>
-      </w:pPr>
-      <w:r>
-        <w:t xml:space="preserve">Já não era mais sobre trabalho. Duas pessoas numa mesa redonda, uma delas de luto e a outra escolhendo ficar na sala por causa disso. Nos abraçamos. Dei um beijo no rosto dela. A partir daquele dia passei a aguardar com vontade os dias em que vejo Linda. Pela pessoa, não pelo lugar. O resto da equipe brinca com isso, ah, você sempre chega e dá um beijo no rosto da Linda. Eles não sabem o que houve antes, não sabem o que foi compartilhado naquela mesa na quarta-feira depois de enterrarmos meu pai. Tudo bem. Nem toda conexão precisa de plateia. Aqui está a parte que as pessoas talvez não esperem: como representante, sou eu quem deveria trazer o chocolate e os agrados. Quando vou ver Linda, sou eu quem se sente cuidado. Ela me dá biscoitos. Ela pergunta como estou. A relação corre ao contrário da descrição do cargo. Linda me deu um momento, três dias úteis depois do funeral, numa mesa redonda, para parar de segurar tudo. Vou carregar isso comigo.</w:t>
+        <w:t xml:space="preserve">Naquela manhã entrei numa das comunidades de moradia assistida que atendo, para uma visita de rotina. Linda estava na mesa redonda perto do posto de enfermagem. Ela era enfermeira havia muito tempo, dava para ver pelo jeito como se portava. Compassiva, mas não do tipo que deixa todo mundo entrar. Uma firmeza que reconheci. Começamos a conversar. Ela era da região de Buffalo, no norte do estado de Nova York. Brincamos. Foi leve de um jeito que as coisas não tinham sido nos últimos dias.</w:t>
+      </w:r>
+    </w:p>
+    <w:p>
+      <w:pPr>
+        <w:pStyle w:val="BodyText"/>
+      </w:pPr>
+      <w:r>
+        <w:t xml:space="preserve">Então contei a ela que tínhamos enterrado meu pai no sábado. O rosto dela mudou. Dava para ver que ela sentiu. Só ficou ali comigo. E me deixei levar. Não chamaria de colapso, mas chorei no consultório dela, daquele jeito cru, na frente de alguém que eu mal conhecia, e não sei se a gente deve chorar na frente de uma enfermeira que acabou de conhecer, num lugar que você visita a trabalho. Mas naquele momento senti algo que só posso chamar de espiritual, a sensação de que Deus tinha colocado aquela pessoa no meu caminho. Não por indicações ou negócios. Por isto.</w:t>
+      </w:r>
+    </w:p>
+    <w:p>
+      <w:pPr>
+        <w:pStyle w:val="BodyText"/>
+      </w:pPr>
+      <w:r>
+        <w:t xml:space="preserve">Já não era mais sobre trabalho. Duas pessoas numa mesa redonda, uma delas de luto e a outra escolhendo ficar na sala por causa disso. Nos abraçamos. Dei um beijo no rosto dela. A partir daquele dia passei a aguardar com expectativa os dias em que vejo Linda. Pela pessoa, não pelo lugar. O resto da equipe brinca com isso, ah, você sempre chega e dá um beijo no rosto da Linda. Eles não sabem o que houve antes, não sabem o que foi compartilhado naquela mesa na quarta-feira depois de enterrarmos meu pai. Tudo bem. Nem toda conexão precisa de plateia. Aqui está a parte que as pessoas talvez não esperem: como representante, sou eu quem deveria trazer o chocolate e os agrados. Quando vou ver Linda, sou eu quem se sente cuidado. Ela me dá biscoitos. Ela pergunta como estou. A relação corre ao contrário da descrição do cargo. Linda me deu um momento, três dias úteis depois do funeral, numa mesa redonda, para parar de segurar tudo. Vou carregar isso comigo.</w:t>
       </w:r>
     </w:p>
     <w:bookmarkStart w:id="103" w:name="a-mesa-da-lisa"/>
@@ -9759,7 +9577,7 @@
         <w:pStyle w:val="BodyText"/>
       </w:pPr>
       <w:r>
-        <w:t xml:space="preserve">Aquela mesa viu todas as versões de mim. Durante anos, na dependência ativa, eu aparecia no Dia de Ação de Graças e acabava apagado no sofá dela, morto para o mundo, esparramado por cima dele inteiro para que ninguém mais pudesse se deitar. Virou uma piada recorrente que sobreviveu ao uso, chega ao sofá antes que o Rob chegue. Consigo rir disso hoje por causa de como ela lidou com aquilo na época. Lisa nunca me envergonhou por isso. Ela pôs um prato para a pior versão de mim e me amou mesmo assim, sem sermão, só um lugar à mesa e um sofá que eu ia monopolizar. Ela sempre me dizia que eu tinha um lugar para onde voltar, acontecesse o que acontecesse. Naqueles anos não sobrava muita gente do meu lado. Ela era uma delas. Ela continuou orgulhosa de me chamar de irmão muito antes de eu conseguir enxergar por quê. Já voltei em muitos anos sóbrios desde então, sem apagar, mas a piada pegou, do jeito que as boas pegam.</w:t>
+        <w:t xml:space="preserve">Aquela mesa viu todas as versões de mim. Durante anos, na dependência ativa, eu aparecia no Dia de Ação de Graças e acabava apagado no sofá dela, morto para o mundo, esparramado por ele inteiro para que ninguém mais pudesse se deitar. Virou uma piada recorrente que sobreviveu ao uso, chega ao sofá antes que o Rob chegue. Consigo rir disso hoje por causa de como ela lidou com aquilo na época. Lisa nunca me envergonhou por isso. Ela pôs um prato para a pior versão de mim e me amou mesmo assim, sem sermão, só um lugar à mesa e um sofá que eu ia monopolizar. Ela sempre me dizia que eu tinha um lugar para onde voltar, acontecesse o que acontecesse. Naqueles anos não sobrava muita gente do meu lado. Ela era uma delas. Ela continuou orgulhosa de me chamar de irmão muito antes de eu conseguir enxergar por quê. Voltei muitos anos sóbrio desde então, sem apagar, mas a piada pegou, do jeito que as boas pegam.</w:t>
       </w:r>
     </w:p>
     <w:p>
@@ -9775,7 +9593,7 @@
         <w:pStyle w:val="BodyText"/>
       </w:pPr>
       <w:r>
-        <w:t xml:space="preserve">Não era só a mesa da Lisa. Na nossa família, ninguém dizia amor em voz alta. Eles cozinhavam. Minha mãe do lado de fora das pesagens com sanduíches de frango do Wendy’s assim que eu batia o peso. Nancey em Boca Raton, mantendo chantilly em casa porque torta de creme de banana era a minha favorita, fazendo frango à parmegiana para mim sem ocasião nenhuma, alimentando um sobrinho que tinha aparecido na porta dela sem lugar melhor para ir e sem lhe perguntar nada que uma torta não pudesse responder. Comi meu caminho de volta ao pertencimento em mais mesas do que consigo contar, e nenhuma delas jamais me entregou uma conta.</w:t>
+        <w:t xml:space="preserve">Não era só a mesa da Lisa. Na nossa família, ninguém dizia amor em voz alta. Eles cozinhavam. Minha mãe do lado de fora das pesagens com sanduíches de frango do Wendy’s assim que eu batia o peso. Nancey em Boca Raton, mantendo chantilly em casa porque torta de creme de banana era a minha favorita, fazendo frango à parmegiana para mim sem ocasião nenhuma, alimentando um sobrinho que tinha aparecido na porta dela sem lugar melhor para ir e sem lhe perguntar nada que uma torta não pudesse responder. Foi comendo que encontrei o caminho de volta ao pertencimento, em mais mesas do que consigo contar, e nenhuma delas jamais me entregou uma conta.</w:t>
       </w:r>
     </w:p>
     <w:p>
@@ -9813,7 +9631,7 @@
         <w:pStyle w:val="FirstParagraph"/>
       </w:pPr>
       <w:r>
-        <w:t xml:space="preserve">Quase toda manhã há quinze anos meu telefone toca cedo e é o Mager, ou eu liguei primeiro, e a gente reza. Algumas frases simples para começar o dia apontado na direção certa. Nada eloquente. Dois homens sóbrios numa linha telefônica, dizendo obrigado, pedindo ajuda, desligando, indo trabalhar. As pessoas me perguntam onde Deus estava em tudo isso, e a resposta honesta é que Ele nunca foi quem foi embora. Fui eu. Ainda não consigo explicar Deus no papel, e parei de tentar. O que posso te dizer é que toda vez que bati no fundo de mim mesmo, algo que eu não tinha colocado ali segurava o chão. Hoje minha fé não se parece com certeza. Se parece com aquela ligação da manhã. Um pássaro vermelho num espelho. Entrar no quarto de um estranho que está morrendo com nada de útil nas mãos e confiar que a presença é um tipo próprio de oração. Parei de precisar que a teologia fosse à prova d’água. Só precisava ficar na sala, e me deixar ser acompanhado. Isso, tanto quanto qualquer coisa, é o que me trouxe até aqui.</w:t>
+        <w:t xml:space="preserve">Quase toda manhã há quinze anos meu telefone toca cedo e é o Mager, ou eu liguei primeiro, e a gente reza. Algumas frases simples para começar o dia apontado na direção certa. Nada eloquente. Dois homens sóbrios numa linha telefônica, dizendo obrigado, pedindo ajuda, desligando, indo trabalhar. As pessoas me perguntam onde Deus estava em tudo isso, e a resposta honesta é que Ele nunca foi quem foi embora. Fui eu. Ainda não consigo explicar Deus no papel, e parei de tentar. O que posso te dizer é que toda vez que bati no fundo de mim mesmo, algo que eu não tinha colocado ali segurava o chão. Hoje minha fé não se parece com certeza. Se parece com aquela ligação da manhã. Um pássaro vermelho num espelho. Entrar no quarto de um estranho que está morrendo sem nada de útil nas mãos e confiar que a presença é um tipo próprio de oração. Parei de precisar que a teologia fosse à prova d’água. Só precisava ficar na sala, e me deixar ser acompanhado. Isso, tanto quanto qualquer coisa, é o que me trouxe até aqui.</w:t>
       </w:r>
     </w:p>
     <w:bookmarkEnd w:id="104"/>
@@ -9897,7 +9715,7 @@
         <w:pStyle w:val="BodyText"/>
       </w:pPr>
       <w:r>
-        <w:t xml:space="preserve">9 de janeiro de 2026. Dezessete anos sóbrio no dia exato, e quinze dias depois da morte do meu pai. Estou no meu carro, no estacionamento de uma clínica de enfermagem especializada em Raleigh, café na mão, recém-saído de uma visita a uma família ainda decidindo se começa os cuidados paliativos para a mãe. Eu tinha me sentado com eles, respondido às perguntas, ficado até o ficar estar terminado. Uma manhã cinzenta de janeiro, o café esfriando, o espaço entre uma visita e a seguinte.</w:t>
+        <w:t xml:space="preserve">9 de janeiro de 2026. Dezessete anos sóbrio no dia exato, e quinze dias depois da morte do meu pai. Estou no meu carro, no estacionamento de uma clínica de enfermagem especializada em Raleigh, café na mão, recém-saído de uma visita a uma família ainda decidindo se começa os cuidados paliativos para a mãe. Eu tinha me sentado com eles, respondido às perguntas, ficado até o ficar terminar. Uma manhã cinzenta de janeiro, o café esfriando, o espaço entre uma visita e a seguinte.</w:t>
       </w:r>
     </w:p>
     <w:p>
@@ -9937,7 +9755,7 @@
         <w:pStyle w:val="BodyText"/>
       </w:pPr>
       <w:r>
-        <w:t xml:space="preserve">Pego meu telefone, devagar e com cuidado. Acho que estou gravando um vídeo. Aperto o botão. O cardeal fica. Dois minutos, talvez menos, talvez mais. Por fim eu digo, Pai, tenho que ir. E ele voa, sem se assustar, sem ser de repente. Levanta do retrovisor até uma árvore próxima, fica um momento, e então se foi.</w:t>
+        <w:t xml:space="preserve">Pego meu telefone, devagar e com cuidado. Acho que estou gravando um vídeo. Aperto o botão. O cardeal fica. Dois minutos, talvez menos, talvez mais. Por fim eu digo, Pai, tenho que ir. E ele voa, sem se assustar, sem nada de repentino. Levanta voo do retrovisor até uma árvore próxima, fica um momento, e então se foi.</w:t>
       </w:r>
     </w:p>
     <w:p>
@@ -9953,7 +9771,7 @@
         <w:pStyle w:val="BodyText"/>
       </w:pPr>
       <w:r>
-        <w:t xml:space="preserve">O cardeal não foi um milagre. O que eu acredito é mais simples. A mensagem tinha sido entregue a vida inteira, em salas de luta e porões de igreja e celas de detenção e caminhões de mudança, em limites que pareciam duros e segundas chances que eu não tinha merecido e tardes comuns de terça-feira que ninguém anotou. O cardeal era um lembrete de que a mensagem ainda está sendo enviada. Que Lou, em qualquer forma que o amor assume quando a pessoa que o carregava se foi, ainda está aqui, no trabalho que faço em nome dele sem nunca dizer o nome dele, na firmeza que trago para o dia mais difícil de outra pessoa, firmeza que foi construída pelas mãos dele.</w:t>
+        <w:t xml:space="preserve">O cardeal não foi um milagre. O que eu creio é mais simples. A mensagem tinha sido entregue a vida inteira, em salas de luta e porões de igreja e celas de detenção e caminhões de mudança, em limites que pareciam duros e segundas chances que eu não tinha merecido e tardes comuns de terça-feira que ninguém anotou. O cardeal era um lembrete de que a mensagem ainda está sendo enviada. Que Lou, em qualquer forma que o amor assuma quando a pessoa que o carregava se foi, ainda está aqui, no trabalho que faço em nome dele sem nunca dizer o nome dele, na firmeza que trago para o dia mais difícil de outra pessoa, firmeza que foi construída pelas mãos dele.</w:t>
       </w:r>
     </w:p>
     <w:p>
@@ -10015,15 +9833,15 @@
         <w:pStyle w:val="BodyText"/>
       </w:pPr>
       <w:r>
-        <w:t xml:space="preserve">Existe uma velha frase que ensinam nas salas para onde as famílias vão, e só do outro lado dela é que vi como ela é verdadeira. Você não causou. Você não pode controlar. Você não pode curar. Três frases, cada uma delas uma misericórdia, porque as três dizem a mesma coisa: isto nunca foi seu para consertar.</w:t>
-      </w:r>
-    </w:p>
-    <w:p>
-      <w:pPr>
-        <w:pStyle w:val="BodyText"/>
-      </w:pPr>
-      <w:r>
-        <w:t xml:space="preserve">Sei que você tentou. Sei que você ficou acordado virando a vida de outra pessoa de um lado para o outro, procurando a coisa que você deixou passar. Eu era a pessoa do outro lado dessas noites. Minha mãe me mandava dinheiro que ela dizia a si mesma que era para o aluguel. Meu pai dirigiu um caminhão atravessando o estado para me levar para casa. Nada disso me fez parar. Não porque eles falharam. Porque não era deles para vencer. Mas escute a outra metade, porque é igualmente verdadeira: o resgate não me deixou sóbrio. Ele me manteve vivo tempo o bastante para eu chegar lá. Você não pode fazer com que parem. Você pode ajudá-los a viver até que parem.</w:t>
+        <w:t xml:space="preserve">Existe uma velha frase que ensinam nas salas para onde as famílias vão, e só do outro lado dela é que vi como ela é verdadeira. Você não causou. Você não pode controlar. Você não pode curar. Três frases, cada uma delas uma misericórdia, porque as três dizem a mesma coisa: consertar isto nunca foi tarefa sua.</w:t>
+      </w:r>
+    </w:p>
+    <w:p>
+      <w:pPr>
+        <w:pStyle w:val="BodyText"/>
+      </w:pPr>
+      <w:r>
+        <w:t xml:space="preserve">Sei que você tentou. Sei que você ficou acordado virando a vida de outra pessoa de um lado para o outro, procurando a coisa que você deixou passar. Eu era a pessoa do outro lado dessas noites. Minha mãe me mandava dinheiro que ela dizia a si mesma que era para o aluguel. Meu pai dirigiu um caminhão atravessando o estado para me levar para casa. Nada disso me fez parar. Não porque eles falharam. Porque não cabia a eles vencer. Mas escute a outra metade, porque é igualmente verdadeira: o resgate não me deixou sóbrio. Ele me manteve vivo tempo o bastante para eu chegar lá. Você não pode fazer com que parem. Você pode ajudá-los a viver até que parem.</w:t>
       </w:r>
     </w:p>
     <w:p>
@@ -10077,7 +9895,7 @@
         <w:pStyle w:val="FirstParagraph"/>
       </w:pPr>
       <w:r>
-        <w:t xml:space="preserve">Tyler é primo em primeiro grau de Hope, o que o torna minha família também, e por cerca de oito anos ele esteve preso num ciclo: reabilitação, cadeia, um casamento que ia e voltava e não parava de puxá-lo para baixo. Fiquei na vida dele o tempo todo, mas a distância, porque eu tinha a minha própria sobriedade para proteger e não podia ter o que ele estava usando perto de mim nem do lar que Hope e eu tínhamos construído. Isso é difícil de admitir. Mas é o que amar um dependente exige de você quando você mesmo mal acabou de sair.</w:t>
+        <w:t xml:space="preserve">Tyler é primo em primeiro grau de Hope, o que o torna minha família também, e por cerca de oito anos ele esteve preso num ciclo: reabilitação, cadeia, um casamento que ia e voltava e não parava de puxá-lo para baixo. Fiquei na vida dele o tempo todo, mas à distância, porque eu tinha a minha própria sobriedade para proteger e não podia ter o que ele estava usando perto de mim nem do lar que Hope e eu tínhamos construído. Isso é difícil de admitir. Mas é o que amar um dependente exige de você quando você mesmo mal acabou de sair.</w:t>
       </w:r>
     </w:p>
     <w:p>
@@ -10125,7 +9943,7 @@
         <w:pStyle w:val="BodyText"/>
       </w:pPr>
       <w:r>
-        <w:t xml:space="preserve">O que aconteceu em seguida levou apenas alguns minutos. Uma caminhada até o parque com a enteada pequena dele virou uma confrontação com um vizinho, e virou física. Tyler acabou no chão, o pescoço quebrado em C5 e C6, sem conseguir mover nada abaixo disso. A ajuda foi lenta para chegar até ele.</w:t>
+        <w:t xml:space="preserve">O que aconteceu em seguida levou apenas alguns minutos. Uma caminhada até o parque com a enteada pequena dele virou um confronto com um vizinho, e virou física. Tyler acabou no chão, o pescoço quebrado em C5 e C6, sem conseguir mover nada abaixo disso. O socorro demorou a chegar até ele.</w:t>
       </w:r>
     </w:p>
     <w:p>
@@ -10221,7 +10039,7 @@
         <w:pStyle w:val="FirstParagraph"/>
       </w:pPr>
       <w:r>
-        <w:t xml:space="preserve">Aqui está a parte que pertence a você — quem ama alguém que não consegue consertar, quem está sentado num estacionamento com medo de entrar na sala, quem ainda carrega as palavras que nunca chegou a dizer. Fui guiado pela escuridão por um homem que não ia embora. O nome dele era Lou. Agora é a minha vez de te entregar o mapa e te apontar a porta.</w:t>
+        <w:t xml:space="preserve">Aqui está a parte que pertence a você — quem ama alguém que não consegue consertar, quem está sentado num estacionamento com medo de entrar na sala, quem ainda carrega as palavras que nunca chegou a dizer. Fui guiado através da escuridão por um homem que não ia embora. O nome dele era Lou. Agora é a minha vez de te entregar o mapa e te apontar a porta.</w:t>
       </w:r>
     </w:p>
     <w:p>
@@ -10245,7 +10063,7 @@
         <w:pStyle w:val="BodyText"/>
       </w:pPr>
       <w:r>
-        <w:t xml:space="preserve">Diga as palavras agora. Eu te amo. Me desculpe. Obrigado. Eu te perdoo. Não vem aí nenhum momento melhor.</w:t>
+        <w:t xml:space="preserve">Diga as palavras agora. Eu te amo. Me desculpe. Obrigado. Eu te perdoo. Não há um momento melhor a caminho.</w:t>
       </w:r>
     </w:p>
     <w:p>
@@ -10301,7 +10119,7 @@
         <w:pStyle w:val="BodyText"/>
       </w:pPr>
       <w:r>
-        <w:t xml:space="preserve">O amor aparece onde é preciso, não onde é merecido. Essa é a promessa do cardeal. Foi feito por mim. Agora vá e faça por outra pessoa.</w:t>
+        <w:t xml:space="preserve">O amor aparece onde é preciso, não onde é merecido. Essa é a promessa do cardeal. Foi feito para mim. Agora vá e faça por outra pessoa.</w:t>
       </w:r>
     </w:p>
     <w:bookmarkEnd w:id="111"/>
@@ -10387,7 +10205,7 @@
         <w:pStyle w:val="BodyText"/>
       </w:pPr>
       <w:r>
-        <w:t xml:space="preserve">Ele me ensinou que cuidar é aprender a porta pela qual uma pessoa está disposta a passar.</w:t>
+        <w:t xml:space="preserve">Ele me ensinou que cuidar é descobrir a porta pela qual uma pessoa está disposta a passar.</w:t>
       </w:r>
     </w:p>
     <w:p>
@@ -10417,7 +10235,7 @@
         <w:pStyle w:val="FirstParagraph"/>
       </w:pPr>
       <w:r>
-        <w:t xml:space="preserve">Quando reencontrei o Rob, foi como se nenhum tempo tivesse passado. Em poucos minutos, nossa conversa deixou nós dois em lágrimas. Ao ouvi-lo falar do pai, entendi que este homem tem um chamado insubstituível. Durante anos o Rob esteve a serviço de quem está em recuperação, e continuou esse serviço através do seu trabalho nos cuidados paliativos. Ele senta-se com as famílias naquilo que chama de o último capítulo. Ele esteve presente para pessoas em seus momentos mais vulneráveis, guiando famílias por conversas que a maioria de nós passa a vida inteira evitando, e faz isso com todo o peso da própria experiência como um filho que ele mesmo foi guiado através da escuridão pela presença firme e incondicional de um pai que se entregou por inteiro.</w:t>
+        <w:t xml:space="preserve">Quando reencontrei o Rob, foi como se nenhum tempo tivesse passado. Em poucos minutos, nossa conversa deixou nós dois em lágrimas. Ao ouvi-lo falar do pai, entendi que este homem tem um chamado insubstituível. Durante anos o Rob esteve a serviço de quem está em recuperação, e continuou esse serviço por meio do seu trabalho nos cuidados paliativos. Ele se senta com as famílias naquilo que chama de o último capítulo. Ele esteve presente para pessoas em seus momentos mais vulneráveis, guiando famílias por conversas que a maioria de nós passa a vida inteira evitando, e faz isso com todo o peso da própria experiência como filho — ele mesmo um filho conduzido através da escuridão pela presença firme e incondicional de um pai que se entregou por inteiro.</w:t>
       </w:r>
     </w:p>
     <w:p>
@@ -10457,7 +10275,7 @@
         <w:pStyle w:val="BodyText"/>
       </w:pPr>
       <w:r>
-        <w:t xml:space="preserve">Este livro vai ajudar você a fazer exatamente isso. Sou grato por ele existir, e sou grato por você o estar segurando.</w:t>
+        <w:t xml:space="preserve">Este livro vai ajudar você a fazer exatamente isso. Sou grato por ele existir, e sou grato por você estar segurando ele.</w:t>
       </w:r>
     </w:p>
     <w:p>
@@ -10511,7 +10329,7 @@
         <w:pStyle w:val="BodyText"/>
       </w:pPr>
       <w:r>
-        <w:t xml:space="preserve">Escrever este livro tirou a máscara. Ao colocar esses anos no papel, as partes de que eu me orgulhava e as partes que passei décadas escondendo, descobri que não sobrava nada para proteger. O medo em torno do qual construí a vida inteira — que se as pessoas vissem a coisa verdadeira, elas dariam as costas — era a mentira. O que o substituiu é mais silencioso do que alívio. É paz. Pela primeira vez, não estou encenando o Rob Brizzi. Sou apenas ele. Foi isso que escrever me custou, e o que me devolveu.</w:t>
+        <w:t xml:space="preserve">Escrever este livro tirou a máscara. Ao colocar esses anos no papel, as partes de que eu me orgulhava e as partes que passei décadas escondendo, descobri que não sobrava nada para proteger. O medo em torno do qual construí a vida inteira — que, se as pessoas vissem a coisa verdadeira, elas dariam as costas — era a mentira. O que o substituiu é mais silencioso do que alívio. É paz. Pela primeira vez, não estou encenando o Rob Brizzi. Sou apenas ele. Foi isso que escrever me custou, e o que me devolveu.</w:t>
       </w:r>
     </w:p>
     <w:p>
@@ -10606,14 +10424,6 @@
       </w:pPr>
       <w:r>
         <w:t xml:space="preserve">Scott, meu editor, que deixou estas páginas melhores e as deixou serem minhas.</w:t>
-      </w:r>
-    </w:p>
-    <w:p>
-      <w:pPr>
-        <w:pStyle w:val="BodyText"/>
-      </w:pPr>
-      <w:r>
-        <w:t xml:space="preserve">Grace Nobrega, que deu ao cardeal o seu céu.</w:t>
       </w:r>
     </w:p>
     <w:p>
@@ -10677,7 +10487,7 @@
         </w:numPr>
       </w:pPr>
       <w:r>
-        <w:t xml:space="preserve">O livro nos dá dois pais, e seu veredito é: Um pai continuou ligando. O outro continuou aparecendo. Como seus sentimentos em relação ao Horacio mudaram enquanto você lia, e qual momento mais os moveu?</w:t>
+        <w:t xml:space="preserve">O livro nos dá dois pais, e seu veredito é: Um pai continuou ligando. O outro continuou aparecendo. Como seus sentimentos em relação ao Horacio mudaram enquanto você lia, e qual momento mais o comoveu?</w:t>
       </w:r>
     </w:p>
     <w:p>
@@ -10743,7 +10553,7 @@
         </w:numPr>
       </w:pPr>
       <w:r>
-        <w:t xml:space="preserve">Depois de dezessete anos sóbrio, o luto empurrou o Rob a um fundo do poço emocional, o primeiro que ele teve de sentir até o fim. Como o colapso sóbrio depois da morte do Lou é diferente dos fundos do poço da época em que ele usava? Como é igual?</w:t>
+        <w:t xml:space="preserve">Depois de dezessete anos sóbrio, o luto empurrou o Rob para um fundo do poço emocional, o primeiro que ele teve de sentir até o fim. Como o colapso sóbrio depois da morte do Lou é diferente dos fundos do poço da época em que ele usava? Como é igual?</w:t>
       </w:r>
     </w:p>
     <w:p>

</xml_diff>

<commit_message>
Add Dave Meyer praise page to Portuguese front matter
Insert an ELOGIOS endorsement page (translated Dave Meyer quote) ahead of
the copyright page, so it appears in every format and is read by Speechify.
Rebuild PT PDF/EPUB/DOCX/TTS + Speechify EPUB.

Co-Authored-By: Claude Opus 4.8 <noreply@anthropic.com>
Claude-Session: https://claude.ai/code/session_013TTacQAr67Pe2VUwTPop1A
</commit_message>
<xml_diff>
--- a/The_Cardinals_Promise_PT.docx
+++ b/The_Cardinals_Promise_PT.docx
@@ -64,7 +64,55 @@
       </w:r>
     </w:p>
     <w:bookmarkEnd w:id="20"/>
-    <w:bookmarkStart w:id="21" w:name="direitos-autorais"/>
+    <w:bookmarkStart w:id="21" w:name="elogios"/>
+    <w:p>
+      <w:pPr>
+        <w:pStyle w:val="Heading1"/>
+      </w:pPr>
+      <w:r>
+        <w:rPr>
+          <w:bCs/>
+          <w:b/>
+        </w:rPr>
+        <w:t xml:space="preserve">ELOGIOS</w:t>
+      </w:r>
+    </w:p>
+    <w:p>
+      <w:pPr>
+        <w:pStyle w:val="BlockText"/>
+      </w:pPr>
+      <w:r>
+        <w:rPr>
+          <w:iCs/>
+          <w:i/>
+        </w:rPr>
+        <w:t xml:space="preserve">“</w:t>
+      </w:r>
+      <w:r>
+        <w:rPr>
+          <w:iCs/>
+          <w:i/>
+        </w:rPr>
+        <w:t xml:space="preserve">Conheço este homem há trinta e cinco anos. Você pode confiar no que está prestes a ler.</w:t>
+      </w:r>
+      <w:r>
+        <w:rPr>
+          <w:iCs/>
+          <w:i/>
+        </w:rPr>
+        <w:t xml:space="preserve">”</w:t>
+      </w:r>
+    </w:p>
+    <w:p>
+      <w:pPr>
+        <w:pStyle w:val="BlockText"/>
+      </w:pPr>
+      <w:r>
+        <w:t xml:space="preserve">— DAVE MEYER, ex-quarterback da NFL</w:t>
+      </w:r>
+    </w:p>
+    <w:bookmarkEnd w:id="21"/>
+    <w:bookmarkStart w:id="22" w:name="direitos-autorais"/>
     <w:p>
       <w:pPr>
         <w:pStyle w:val="Heading1"/>
@@ -819,8 +867,8 @@
         <w:t xml:space="preserve">Sobre o Autor</w:t>
       </w:r>
     </w:p>
-    <w:bookmarkEnd w:id="21"/>
-    <w:bookmarkStart w:id="22" w:name="prefácio"/>
+    <w:bookmarkEnd w:id="22"/>
+    <w:bookmarkStart w:id="23" w:name="prefácio"/>
     <w:p>
       <w:pPr>
         <w:pStyle w:val="Heading1"/>
@@ -885,8 +933,8 @@
         <w:t xml:space="preserve">Dave Meyer</w:t>
       </w:r>
     </w:p>
-    <w:bookmarkEnd w:id="22"/>
-    <w:bookmarkStart w:id="23" w:name="prólogo"/>
+    <w:bookmarkEnd w:id="23"/>
+    <w:bookmarkStart w:id="24" w:name="prólogo"/>
     <w:p>
       <w:pPr>
         <w:pStyle w:val="Heading1"/>
@@ -1131,8 +1179,8 @@
         <w:t xml:space="preserve">PARTE UM</w:t>
       </w:r>
     </w:p>
-    <w:bookmarkEnd w:id="23"/>
-    <w:bookmarkStart w:id="30" w:name="a-fuga"/>
+    <w:bookmarkEnd w:id="24"/>
+    <w:bookmarkStart w:id="31" w:name="a-fuga"/>
     <w:p>
       <w:pPr>
         <w:pStyle w:val="Heading1"/>
@@ -1169,7 +1217,7 @@
         <w:t xml:space="preserve">CAPÍTULO 1</w:t>
       </w:r>
     </w:p>
-    <w:bookmarkStart w:id="24" w:name="cidade-do-méxico-a-fuga"/>
+    <w:bookmarkStart w:id="25" w:name="cidade-do-méxico-a-fuga"/>
     <w:p>
       <w:pPr>
         <w:pStyle w:val="Heading2"/>
@@ -1609,8 +1657,8 @@
         <w:t xml:space="preserve">CAPÍTULO 2</w:t>
       </w:r>
     </w:p>
-    <w:bookmarkEnd w:id="24"/>
-    <w:bookmarkStart w:id="25" w:name="new-jersey-sobrevivência"/>
+    <w:bookmarkEnd w:id="25"/>
+    <w:bookmarkStart w:id="26" w:name="new-jersey-sobrevivência"/>
     <w:p>
       <w:pPr>
         <w:pStyle w:val="Heading2"/>
@@ -1867,8 +1915,8 @@
         <w:t xml:space="preserve">CAPÍTULO 3</w:t>
       </w:r>
     </w:p>
-    <w:bookmarkEnd w:id="25"/>
-    <w:bookmarkStart w:id="26" w:name="o-homem-que-não-precisava"/>
+    <w:bookmarkEnd w:id="26"/>
+    <w:bookmarkStart w:id="27" w:name="o-homem-que-não-precisava"/>
     <w:p>
       <w:pPr>
         <w:pStyle w:val="Heading2"/>
@@ -2141,8 +2189,8 @@
         <w:t xml:space="preserve">CAPÍTULO 4</w:t>
       </w:r>
     </w:p>
-    <w:bookmarkEnd w:id="26"/>
-    <w:bookmarkStart w:id="28" w:name="escolhido"/>
+    <w:bookmarkEnd w:id="27"/>
+    <w:bookmarkStart w:id="29" w:name="escolhido"/>
     <w:p>
       <w:pPr>
         <w:pStyle w:val="Heading2"/>
@@ -2275,7 +2323,7 @@
         <w:t xml:space="preserve">Nem tudo daqueles anos era pesado. A gente morava na Woodridge Street, e Domino’s era a nossa pizza. Naquela época eles cumpriam a promessa: trinta minutos ou é de graça. O que eles não previram foi que nossa cidade tinha uma Woodridge Street e uma Woodridge Avenue, e o entregador ia para a Avenue todas as vezes. Ele chegava na nossa porta atrasado e pedindo desculpa, e ele devolvia o dinheiro e a gente ficava com a pizza. Domino’s de graça, vez após vez, porque um cara não conseguia diferenciar uma street de uma avenue. Eu e o Chris tínhamos certeza de que a gente tinha vencido o sistema.</w:t>
       </w:r>
     </w:p>
-    <w:bookmarkStart w:id="27" w:name="claudio-e-rob"/>
+    <w:bookmarkStart w:id="28" w:name="claudio-e-rob"/>
     <w:p>
       <w:pPr>
         <w:pStyle w:val="Heading3"/>
@@ -2420,9 +2468,9 @@
         <w:t xml:space="preserve">CAPÍTULO 5</w:t>
       </w:r>
     </w:p>
-    <w:bookmarkEnd w:id="27"/>
     <w:bookmarkEnd w:id="28"/>
-    <w:bookmarkStart w:id="29" w:name="o-homem-que-me-criou"/>
+    <w:bookmarkEnd w:id="29"/>
+    <w:bookmarkStart w:id="30" w:name="o-homem-que-me-criou"/>
     <w:p>
       <w:pPr>
         <w:pStyle w:val="Heading2"/>
@@ -2627,9 +2675,9 @@
         <w:t xml:space="preserve">Levei anos para enxergar o que ele tinha me dado. Eu ganho a vida aparecendo. Eu entro em quartos onde outras pessoas não conseguem se forçar a entrar, e eu fico. Nem sempre sei o que dizer. Mas sei estar presente, e aprendi isso com um homem que me levava a torneios no interior de New York, e uma hora fora do caminho por um White Castle porque eu pedi. Tudo o que faço à beira de um leito, aprendi primeiro no carro dele.</w:t>
       </w:r>
     </w:p>
-    <w:bookmarkEnd w:id="29"/>
     <w:bookmarkEnd w:id="30"/>
-    <w:bookmarkStart w:id="31" w:name="as-viagens-i"/>
+    <w:bookmarkEnd w:id="31"/>
+    <w:bookmarkStart w:id="32" w:name="as-viagens-i"/>
     <w:p>
       <w:pPr>
         <w:pStyle w:val="Heading1"/>
@@ -2662,8 +2710,8 @@
         <w:t xml:space="preserve">PARTE DOIS</w:t>
       </w:r>
     </w:p>
-    <w:bookmarkEnd w:id="31"/>
-    <w:bookmarkStart w:id="48" w:name="o-tatame"/>
+    <w:bookmarkEnd w:id="32"/>
+    <w:bookmarkStart w:id="49" w:name="o-tatame"/>
     <w:p>
       <w:pPr>
         <w:pStyle w:val="Heading1"/>
@@ -2700,7 +2748,7 @@
         <w:t xml:space="preserve">CAPÍTULO 6</w:t>
       </w:r>
     </w:p>
-    <w:bookmarkStart w:id="34" w:name="o-lutador"/>
+    <w:bookmarkStart w:id="35" w:name="o-lutador"/>
     <w:p>
       <w:pPr>
         <w:pStyle w:val="Heading2"/>
@@ -2909,7 +2957,7 @@
         <w:t xml:space="preserve">Ele estava sempre na arquibancada. Quase nunca faltou a uma luta em quatro anos de ensino médio, nem à de dezenove segundos, nem às apertadas que deram errado, nem às boas quando o trabalho começou a aparecer. Terceira fila, em geral. Braços cruzados, não em julgamento, em atenção, ou a filmadora ligada e gravando. A luta era a única coisa que ele filmava, a única razão de ele ter o aparelho. Minha mãe e a tia Nancey também estavam lá. Todas as lutas. E depois de cada pesagem, quando eu tinha me matado de fome até o número por dias, minha mãe estava lá com sanduíches de frango do Wendy’s, prontos no segundo em que eu batia o peso. Ela sempre parecia saber o que uma coisa tinha me custado, e sempre tinha a comida esperando. Era assim que ela amava você. Ela te alimentava.</w:t>
       </w:r>
     </w:p>
-    <w:bookmarkStart w:id="32" w:name="cooperstown"/>
+    <w:bookmarkStart w:id="33" w:name="cooperstown"/>
     <w:p>
       <w:pPr>
         <w:pStyle w:val="Heading3"/>
@@ -3038,8 +3086,8 @@
         <w:t xml:space="preserve">Voltamos para o carro um pouco antes das cinco, e eu dormi logo em seguida. Quando acordei, estávamos em casa. Dez horas de estrada por um prédio cheio de luvas e uma bola que Babe Ruth um dia tocou. Ele nunca disse por quê.</w:t>
       </w:r>
     </w:p>
-    <w:bookmarkEnd w:id="32"/>
-    <w:bookmarkStart w:id="33" w:name="dave-meyer"/>
+    <w:bookmarkEnd w:id="33"/>
+    <w:bookmarkStart w:id="34" w:name="dave-meyer"/>
     <w:p>
       <w:pPr>
         <w:pStyle w:val="Heading3"/>
@@ -3117,9 +3165,9 @@
         <w:t xml:space="preserve">CAPÍTULO 7</w:t>
       </w:r>
     </w:p>
-    <w:bookmarkEnd w:id="33"/>
     <w:bookmarkEnd w:id="34"/>
-    <w:bookmarkStart w:id="42" w:name="o-que-o-tatame-deixou"/>
+    <w:bookmarkEnd w:id="35"/>
+    <w:bookmarkStart w:id="43" w:name="o-que-o-tatame-deixou"/>
     <w:p>
       <w:pPr>
         <w:pStyle w:val="Heading2"/>
@@ -3180,7 +3228,7 @@
         <w:t xml:space="preserve">Ramsey, New Jersey, 1993</w:t>
       </w:r>
     </w:p>
-    <w:bookmarkStart w:id="35" w:name="segundo-ano-a-virada"/>
+    <w:bookmarkStart w:id="36" w:name="segundo-ano-a-virada"/>
     <w:p>
       <w:pPr>
         <w:pStyle w:val="Heading3"/>
@@ -3217,8 +3265,8 @@
         <w:t xml:space="preserve">Eu não conseguia absorver nada daquilo. A distância entre quem todos de repente diziam que eu era e quem eu sabia que era, era grande demais para atravessar. A conquista era real. A sensação de que eu a tinha merecido não estava lá, e não estaria por anos. Eu sentiria a mesma coisa depois, na MTV com câmeras apontadas para mim, a mesma pergunta silenciosa correndo por baixo de tudo: quem sou eu para ser alguém? Levaria muito tempo, e perder quase tudo, antes que eu pudesse ficar de pé numa sala e acreditar que pertencia a ela.</w:t>
       </w:r>
     </w:p>
-    <w:bookmarkEnd w:id="35"/>
-    <w:bookmarkStart w:id="36" w:name="terceiro-ano"/>
+    <w:bookmarkEnd w:id="36"/>
+    <w:bookmarkStart w:id="37" w:name="terceiro-ano"/>
     <w:p>
       <w:pPr>
         <w:pStyle w:val="Heading3"/>
@@ -3267,8 +3315,8 @@
         <w:t xml:space="preserve">Venci minha semifinal, perdi uma apertada na final, mesmo assim fui ao Estadual. Terminei 18–4. Depois daquela luta Lou sentou comigo enquanto eu recuperava o fôlego e a chave seguia sem a gente. Então: É isso que você é. Não boa luta. Não eu sabia que você conseguia. É isso que você é. Eu só assenti. Para ele, aquilo bastava.</w:t>
       </w:r>
     </w:p>
-    <w:bookmarkEnd w:id="36"/>
-    <w:bookmarkStart w:id="37" w:name="charlie"/>
+    <w:bookmarkEnd w:id="37"/>
+    <w:bookmarkStart w:id="38" w:name="charlie"/>
     <w:p>
       <w:pPr>
         <w:pStyle w:val="Heading3"/>
@@ -3305,8 +3353,8 @@
         <w:t xml:space="preserve">Eis o que fica comigo agora: Lou entrou naquele apartamento antes de um dia entrar no meu. Quando ele veio me buscar em West Palm Beach anos depois e me encontrou no escuro, não era a primeira vez que fazia aquilo. Ele já tinha entrado num quarto onde alguém que amava estava se perdendo, e não tinha bastado. Ele veio me buscar mesmo assim, sabendo como aquilo pode terminar.</w:t>
       </w:r>
     </w:p>
-    <w:bookmarkEnd w:id="37"/>
-    <w:bookmarkStart w:id="38" w:name="último-ano-campeão-do-condado"/>
+    <w:bookmarkEnd w:id="38"/>
+    <w:bookmarkStart w:id="39" w:name="último-ano-campeão-do-condado"/>
     <w:p>
       <w:pPr>
         <w:pStyle w:val="Heading3"/>
@@ -3361,8 +3409,8 @@
         <w:t xml:space="preserve">Machuquei o tornozelo na Regional, não fui eu mesmo nas semifinais, perdi. Lutei apesar disso pela terceira colocação, venci aquela luta e avancei ao Estadual. Terminei o ensino médio 81–18. De 2–4 como calouro a um recorde da escola.</w:t>
       </w:r>
     </w:p>
-    <w:bookmarkEnd w:id="38"/>
-    <w:bookmarkStart w:id="39" w:name="chris"/>
+    <w:bookmarkEnd w:id="39"/>
+    <w:bookmarkStart w:id="40" w:name="chris"/>
     <w:p>
       <w:pPr>
         <w:pStyle w:val="Heading3"/>
@@ -3391,8 +3439,8 @@
         <w:t xml:space="preserve">Ele é complicado. Inteligente. Polido e estratégico, um sujeito de alto desempenho no sentido verdadeiro. E ainda assim, a primeira coisa que qualquer um diz sobre ele é que é gentil. De um jeito silencioso, constante. Ele é meu melhor amigo. Seguimos caminhos diferentes e processamos a mesma infância de formas diferentes, mas não há ninguém que eu prefira que me ligue na manhã de Natal, ninguém que eu prefira ter ao meu lado à beira de um túmulo. Lou construiu a nós dois, de formas diferentes, e nunca nos comparou. Ele apareceu pelos recordes do Chris e pelo meu título do condado com o mesmo orgulho.</w:t>
       </w:r>
     </w:p>
-    <w:bookmarkEnd w:id="39"/>
-    <w:bookmarkStart w:id="40" w:name="a-lição-e-a-exceção"/>
+    <w:bookmarkEnd w:id="40"/>
+    <w:bookmarkStart w:id="41" w:name="a-lição-e-a-exceção"/>
     <w:p>
       <w:pPr>
         <w:pStyle w:val="Heading3"/>
@@ -3437,8 +3485,8 @@
         <w:t xml:space="preserve">Quando eu vomitava numa luta, ele não via fraqueza. Quando fui encostado em dezenove segundos, ele não via fracasso. Ele via o filho dele. Ele esteve na terceira fila em tudo aquilo, e eu nunca uma vez sequer perguntei o que tinha lhe custado estar lá.</w:t>
       </w:r>
     </w:p>
-    <w:bookmarkEnd w:id="40"/>
-    <w:bookmarkStart w:id="41" w:name="as-marcas"/>
+    <w:bookmarkEnd w:id="41"/>
+    <w:bookmarkStart w:id="42" w:name="as-marcas"/>
     <w:p>
       <w:pPr>
         <w:pStyle w:val="Heading3"/>
@@ -3471,9 +3519,9 @@
         <w:t xml:space="preserve">CAPÍTULO 8</w:t>
       </w:r>
     </w:p>
-    <w:bookmarkEnd w:id="41"/>
     <w:bookmarkEnd w:id="42"/>
-    <w:bookmarkStart w:id="43" w:name="o-terno"/>
+    <w:bookmarkEnd w:id="43"/>
+    <w:bookmarkStart w:id="44" w:name="o-terno"/>
     <w:p>
       <w:pPr>
         <w:pStyle w:val="Heading2"/>
@@ -3626,8 +3674,8 @@
         <w:t xml:space="preserve">CAPÍTULO 9</w:t>
       </w:r>
     </w:p>
-    <w:bookmarkEnd w:id="43"/>
-    <w:bookmarkStart w:id="45" w:name="quando-trabalhei-para-a-máfia"/>
+    <w:bookmarkEnd w:id="44"/>
+    <w:bookmarkStart w:id="46" w:name="quando-trabalhei-para-a-máfia"/>
     <w:p>
       <w:pPr>
         <w:pStyle w:val="Heading2"/>
@@ -3862,7 +3910,7 @@
         <w:t xml:space="preserve">Meu pai não vivia naquele mundo. Ele vivia ao lado dele. Perto o bastante para conhecer as regras, perto o bastante para saber quando dizer algo e quando ficar de boca fechada. Quando criança eu só achava que meu pai conhecia um monte de gente interessante. E conhecia. Alguns deles eram mais interessantes do que um menino de sete anos precisava saber.</w:t>
       </w:r>
     </w:p>
-    <w:bookmarkStart w:id="44" w:name="o-homem-mais-interessante-do-mundo"/>
+    <w:bookmarkStart w:id="45" w:name="o-homem-mais-interessante-do-mundo"/>
     <w:p>
       <w:pPr>
         <w:pStyle w:val="Heading3"/>
@@ -3959,9 +4007,9 @@
         <w:t xml:space="preserve">CAPÍTULO 10</w:t>
       </w:r>
     </w:p>
-    <w:bookmarkEnd w:id="44"/>
     <w:bookmarkEnd w:id="45"/>
-    <w:bookmarkStart w:id="46" w:name="oxford"/>
+    <w:bookmarkEnd w:id="46"/>
+    <w:bookmarkStart w:id="47" w:name="oxford"/>
     <w:p>
       <w:pPr>
         <w:pStyle w:val="Heading2"/>
@@ -4190,8 +4238,8 @@
         <w:t xml:space="preserve">CAPÍTULO 11</w:t>
       </w:r>
     </w:p>
-    <w:bookmarkEnd w:id="46"/>
-    <w:bookmarkStart w:id="47" w:name="mtv"/>
+    <w:bookmarkEnd w:id="47"/>
+    <w:bookmarkStart w:id="48" w:name="mtv"/>
     <w:p>
       <w:pPr>
         <w:pStyle w:val="Heading2"/>
@@ -4324,9 +4372,9 @@
         <w:t xml:space="preserve">Miami mudou a minha vida, e o homem que a tornou possível estava dividindo um aluguel em Mahwah, pagando empréstimos por anos, sem uma vez sequer fazer o custo parecer algo que eu devia a ele. Eu me formei em maio de 2000, o Lou e a minha mãe na plateia, rastreando o mar de becas idênticas até acharem a minha. O carro estava apontado para o oeste. A Califórnia esperava.</w:t>
       </w:r>
     </w:p>
-    <w:bookmarkEnd w:id="47"/>
     <w:bookmarkEnd w:id="48"/>
-    <w:bookmarkStart w:id="49" w:name="as-viagens-ii"/>
+    <w:bookmarkEnd w:id="49"/>
+    <w:bookmarkStart w:id="50" w:name="as-viagens-ii"/>
     <w:p>
       <w:pPr>
         <w:pStyle w:val="Heading1"/>
@@ -4359,8 +4407,8 @@
         <w:t xml:space="preserve">PARTE TRÊS</w:t>
       </w:r>
     </w:p>
-    <w:bookmarkEnd w:id="49"/>
-    <w:bookmarkStart w:id="62" w:name="a-queda"/>
+    <w:bookmarkEnd w:id="50"/>
+    <w:bookmarkStart w:id="63" w:name="a-queda"/>
     <w:p>
       <w:pPr>
         <w:pStyle w:val="Heading1"/>
@@ -4397,7 +4445,7 @@
         <w:t xml:space="preserve">CAPÍTULO 12</w:t>
       </w:r>
     </w:p>
-    <w:bookmarkStart w:id="50" w:name="o-guardião-do-meu-irmão"/>
+    <w:bookmarkStart w:id="51" w:name="o-guardião-do-meu-irmão"/>
     <w:p>
       <w:pPr>
         <w:pStyle w:val="Heading2"/>
@@ -4572,8 +4620,8 @@
         <w:t xml:space="preserve">CAPÍTULO 13</w:t>
       </w:r>
     </w:p>
-    <w:bookmarkEnd w:id="50"/>
-    <w:bookmarkStart w:id="57" w:name="a-armadilha-da-performance"/>
+    <w:bookmarkEnd w:id="51"/>
+    <w:bookmarkStart w:id="58" w:name="a-armadilha-da-performance"/>
     <w:p>
       <w:pPr>
         <w:pStyle w:val="Heading2"/>
@@ -4666,7 +4714,7 @@
         <w:t xml:space="preserve">A fome permaneceu. Fui transferido para a Abercrombie de maior faturamento do país, em Newport Beach. Depois um emprego de vendas. Depois vendas de dispositivos médicos. Aos vinte e quatro eu estava tirando seis dígitos.</w:t>
       </w:r>
     </w:p>
-    <w:bookmarkStart w:id="51" w:name="a-sensação-de-fraude"/>
+    <w:bookmarkStart w:id="52" w:name="a-sensação-de-fraude"/>
     <w:p>
       <w:pPr>
         <w:pStyle w:val="Heading3"/>
@@ -4719,8 +4767,8 @@
         <w:t xml:space="preserve">Aí foi se empilhando. Performance sobre performance, ano após ano, até que o menino enterrado estava tão fundo que esqueci por completo que ele estava ali. Na época em que eu dobrava camisas polo em San Diego, eu achava que a fantasia era eu.</w:t>
       </w:r>
     </w:p>
-    <w:bookmarkEnd w:id="51"/>
-    <w:bookmarkStart w:id="52" w:name="vendas"/>
+    <w:bookmarkEnd w:id="52"/>
+    <w:bookmarkStart w:id="53" w:name="vendas"/>
     <w:p>
       <w:pPr>
         <w:pStyle w:val="Heading3"/>
@@ -4757,8 +4805,8 @@
         <w:t xml:space="preserve">Nos primeiros seis meses eu estava sóbrio. Tentando. Ligando para Lou aos domingos, dando a ele os números de verdade, ouvindo ele ficar em silêncio do jeito bom. Há uma satisfação em relatar progresso a um homem que já viu você no seu pior. Ele nunca soava tão impressionado quanto eu queria que ficasse. Você está bem por aí? ele perguntava. Estou ótimo, pai, eu dizia, ganhando mais do que jamais achei que ganharia. Que bom, ele dizia. Mas você está feliz? Feliz parecia a pergunta errada. Eu era bem-sucedido, eu estava vencendo, e eu dizia a mim mesmo que essas coisas eram a mesma coisa. Estou, pai. Estou feliz. Não sei se ele acreditou em mim. Não tenho certeza se eu acreditei em mim mesmo.</w:t>
       </w:r>
     </w:p>
-    <w:bookmarkEnd w:id="52"/>
-    <w:bookmarkStart w:id="53" w:name="comecei-a-usar"/>
+    <w:bookmarkEnd w:id="53"/>
+    <w:bookmarkStart w:id="54" w:name="comecei-a-usar"/>
     <w:p>
       <w:pPr>
         <w:pStyle w:val="Heading3"/>
@@ -4819,8 +4867,8 @@
         <w:t xml:space="preserve">O álcool entrou junto. Comprimidos para acelerar de dia, drinques para descer à noite. Desde a primeira vez que bebi eu era do tipo que apaga, não risonho depois de duas cervejas, só apagado, remontando a noite pelos rostos dos outros de manhã. Eu apagava quatro noites por semana. Por fora eu projetava uma confiança que passava como arrogância. Por dentro eu era o mesmo menino assustado que precisava provar que pertencia a qualquer sala em que tivesse entrado.</w:t>
       </w:r>
     </w:p>
-    <w:bookmarkEnd w:id="53"/>
-    <w:bookmarkStart w:id="54" w:name="os-destroços"/>
+    <w:bookmarkEnd w:id="54"/>
+    <w:bookmarkStart w:id="55" w:name="os-destroços"/>
     <w:p>
       <w:pPr>
         <w:pStyle w:val="Heading3"/>
@@ -4865,8 +4913,8 @@
         <w:t xml:space="preserve">Rezo para que tenham me perdoado. Parte disso eu consegui reparar. Parte disso eu só tenho que carregar.</w:t>
       </w:r>
     </w:p>
-    <w:bookmarkEnd w:id="54"/>
-    <w:bookmarkStart w:id="55" w:name="o-primeiro-dui"/>
+    <w:bookmarkEnd w:id="55"/>
+    <w:bookmarkStart w:id="56" w:name="o-primeiro-dui"/>
     <w:p>
       <w:pPr>
         <w:pStyle w:val="Heading3"/>
@@ -4919,8 +4967,8 @@
         <w:t xml:space="preserve">Mas ele me manteve. Um bom advogado, o escritório Taylor, dez mil dólares, conseguiu reduzir para um wet reckless (contravenção leve por dirigir sob influência), com uma condição atrelada: se eu pegasse outro DUI dentro de cinco anos, o wet reckless contaria como um primeiro DUI, e o novo seria o meu segundo. Eu deveria ter recebido aquilo como o aviso que era. Em vez disso continuei. O sucesso veio depois disso. Construí uma carreira em cima do único momento em que eu poderia ter parado e me perguntado o que estava realmente acontecendo. Não perguntei. Só dirigi com mais força.</w:t>
       </w:r>
     </w:p>
-    <w:bookmarkEnd w:id="55"/>
-    <w:bookmarkStart w:id="56" w:name="o-segundo-dui"/>
+    <w:bookmarkEnd w:id="56"/>
+    <w:bookmarkStart w:id="57" w:name="o-segundo-dui"/>
     <w:p>
       <w:pPr>
         <w:pStyle w:val="Heading3"/>
@@ -5037,9 +5085,9 @@
         <w:t xml:space="preserve">CAPÍTULO 14</w:t>
       </w:r>
     </w:p>
-    <w:bookmarkEnd w:id="56"/>
     <w:bookmarkEnd w:id="57"/>
-    <w:bookmarkStart w:id="59" w:name="marcar-as-caixas"/>
+    <w:bookmarkEnd w:id="58"/>
+    <w:bookmarkStart w:id="60" w:name="marcar-as-caixas"/>
     <w:p>
       <w:pPr>
         <w:pStyle w:val="Heading2"/>
@@ -5212,7 +5260,7 @@
         <w:t xml:space="preserve">Porque eu tinha o Lou. Ensenada esclareceu uma coisa que eu sempre soube sem conseguir dizer. Lou Brizzi era meu pai. Não por causa de uma certidão de nascimento. Porque ele escolheu. Todo dia. Sem fazer a conta. Por anos eu contei aquele fim de semana como um livro-caixa. Parei, porque nunca foi justo. O dinheiro nunca foi a variável; o estágio da minha doença é que era — eu teria gastado o presente de qualquer um do mesmo jeito naquele ano. O presente de Horacio foi genuíno, um pai tentando fazer reparação com o que tinha, e quero que isso seja reconhecido por inteiro.</w:t>
       </w:r>
     </w:p>
-    <w:bookmarkStart w:id="58" w:name="boca-raton"/>
+    <w:bookmarkStart w:id="59" w:name="boca-raton"/>
     <w:p>
       <w:pPr>
         <w:pStyle w:val="Heading3"/>
@@ -5336,9 +5384,9 @@
         <w:t xml:space="preserve">CAPÍTULO 15</w:t>
       </w:r>
     </w:p>
-    <w:bookmarkEnd w:id="58"/>
     <w:bookmarkEnd w:id="59"/>
-    <w:bookmarkStart w:id="60" w:name="west-palm-beach"/>
+    <w:bookmarkEnd w:id="60"/>
+    <w:bookmarkStart w:id="61" w:name="west-palm-beach"/>
     <w:p>
       <w:pPr>
         <w:pStyle w:val="Heading2"/>
@@ -5555,8 +5603,8 @@
         <w:t xml:space="preserve">CAPÍTULO 16</w:t>
       </w:r>
     </w:p>
-    <w:bookmarkEnd w:id="60"/>
-    <w:bookmarkStart w:id="61" w:name="nova-orleans"/>
+    <w:bookmarkEnd w:id="61"/>
+    <w:bookmarkStart w:id="62" w:name="nova-orleans"/>
     <w:p>
       <w:pPr>
         <w:pStyle w:val="Heading2"/>
@@ -5753,9 +5801,9 @@
         <w:t xml:space="preserve">Entregar aquele frasco a ele foi a primeira coisa honesta que minhas mãos fizeram em anos. Uns dias depois ele me levou de carro até uma fazenda no panhandle e assinou a papelada ele mesmo.</w:t>
       </w:r>
     </w:p>
-    <w:bookmarkEnd w:id="61"/>
     <w:bookmarkEnd w:id="62"/>
-    <w:bookmarkStart w:id="63" w:name="as-viagens-iii"/>
+    <w:bookmarkEnd w:id="63"/>
+    <w:bookmarkStart w:id="64" w:name="as-viagens-iii"/>
     <w:p>
       <w:pPr>
         <w:pStyle w:val="Heading1"/>
@@ -5788,8 +5836,8 @@
         <w:t xml:space="preserve">PARTE QUATRO</w:t>
       </w:r>
     </w:p>
-    <w:bookmarkEnd w:id="63"/>
-    <w:bookmarkStart w:id="72" w:name="acertar-as-contas"/>
+    <w:bookmarkEnd w:id="64"/>
+    <w:bookmarkStart w:id="73" w:name="acertar-as-contas"/>
     <w:p>
       <w:pPr>
         <w:pStyle w:val="Heading1"/>
@@ -5826,7 +5874,7 @@
         <w:t xml:space="preserve">CAPÍTULO 17</w:t>
       </w:r>
     </w:p>
-    <w:bookmarkStart w:id="64" w:name="chumuckla"/>
+    <w:bookmarkStart w:id="65" w:name="chumuckla"/>
     <w:p>
       <w:pPr>
         <w:pStyle w:val="Heading2"/>
@@ -6035,8 +6083,8 @@
         <w:t xml:space="preserve">CAPÍTULO 18</w:t>
       </w:r>
     </w:p>
-    <w:bookmarkEnd w:id="64"/>
-    <w:bookmarkStart w:id="65" w:name="os-anos-silenciosos"/>
+    <w:bookmarkEnd w:id="65"/>
+    <w:bookmarkStart w:id="66" w:name="os-anos-silenciosos"/>
     <w:p>
       <w:pPr>
         <w:pStyle w:val="Heading2"/>
@@ -6287,8 +6335,8 @@
         <w:t xml:space="preserve">CAPÍTULO 19</w:t>
       </w:r>
     </w:p>
-    <w:bookmarkEnd w:id="65"/>
-    <w:bookmarkStart w:id="66" w:name="Xc8cb55e407101f9b60dc730341676a38fdec5b5"/>
+    <w:bookmarkEnd w:id="66"/>
+    <w:bookmarkStart w:id="67" w:name="Xc8cb55e407101f9b60dc730341676a38fdec5b5"/>
     <w:p>
       <w:pPr>
         <w:pStyle w:val="Heading2"/>
@@ -6497,8 +6545,8 @@
         <w:t xml:space="preserve">CAPÍTULO 20</w:t>
       </w:r>
     </w:p>
-    <w:bookmarkEnd w:id="66"/>
-    <w:bookmarkStart w:id="67" w:name="horacio"/>
+    <w:bookmarkEnd w:id="67"/>
+    <w:bookmarkStart w:id="68" w:name="horacio"/>
     <w:p>
       <w:pPr>
         <w:pStyle w:val="Heading2"/>
@@ -6715,8 +6763,8 @@
         <w:t xml:space="preserve">CAPÍTULO 21</w:t>
       </w:r>
     </w:p>
-    <w:bookmarkEnd w:id="67"/>
-    <w:bookmarkStart w:id="68" w:name="a-linha"/>
+    <w:bookmarkEnd w:id="68"/>
+    <w:bookmarkStart w:id="69" w:name="a-linha"/>
     <w:p>
       <w:pPr>
         <w:pStyle w:val="Heading2"/>
@@ -6837,8 +6885,8 @@
         <w:t xml:space="preserve">CAPÍTULO 22</w:t>
       </w:r>
     </w:p>
-    <w:bookmarkEnd w:id="68"/>
-    <w:bookmarkStart w:id="69" w:name="o-palácio-salmão"/>
+    <w:bookmarkEnd w:id="69"/>
+    <w:bookmarkStart w:id="70" w:name="o-palácio-salmão"/>
     <w:p>
       <w:pPr>
         <w:pStyle w:val="Heading2"/>
@@ -6967,8 +7015,8 @@
         <w:t xml:space="preserve">CAPÍTULO 23</w:t>
       </w:r>
     </w:p>
-    <w:bookmarkEnd w:id="69"/>
-    <w:bookmarkStart w:id="70" w:name="eles-me-deram-uma-chance"/>
+    <w:bookmarkEnd w:id="70"/>
+    <w:bookmarkStart w:id="71" w:name="eles-me-deram-uma-chance"/>
     <w:p>
       <w:pPr>
         <w:pStyle w:val="Heading2"/>
@@ -7145,8 +7193,8 @@
         <w:t xml:space="preserve">CAPÍTULO 24</w:t>
       </w:r>
     </w:p>
-    <w:bookmarkEnd w:id="70"/>
-    <w:bookmarkStart w:id="71" w:name="fazendo-reparação"/>
+    <w:bookmarkEnd w:id="71"/>
+    <w:bookmarkStart w:id="72" w:name="fazendo-reparação"/>
     <w:p>
       <w:pPr>
         <w:pStyle w:val="Heading2"/>
@@ -7263,9 +7311,9 @@
         <w:t xml:space="preserve">Os tribunais vieram por último. Em 2013, quatro anos sóbrio, eu mesmo escrevi ao tribunal e peticionei para que os casos fossem arquivados. Sem advogado desta vez. Em 2002 aquele trabalho tinha exigido o escritório Taylor e dez mil dólares. Em 2013 exigiu uma carta de um homem sóbrio que tinha feito tudo o que o tribunal pediu. Os arquivamentos saíram.</w:t>
       </w:r>
     </w:p>
-    <w:bookmarkEnd w:id="71"/>
     <w:bookmarkEnd w:id="72"/>
-    <w:bookmarkStart w:id="73" w:name="as-viagens-iv"/>
+    <w:bookmarkEnd w:id="73"/>
+    <w:bookmarkStart w:id="74" w:name="as-viagens-iv"/>
     <w:p>
       <w:pPr>
         <w:pStyle w:val="Heading1"/>
@@ -7298,8 +7346,8 @@
         <w:t xml:space="preserve">PARTE CINCO</w:t>
       </w:r>
     </w:p>
-    <w:bookmarkEnd w:id="73"/>
-    <w:bookmarkStart w:id="85" w:name="hope"/>
+    <w:bookmarkEnd w:id="74"/>
+    <w:bookmarkStart w:id="86" w:name="hope"/>
     <w:p>
       <w:pPr>
         <w:pStyle w:val="Heading1"/>
@@ -7336,7 +7384,7 @@
         <w:t xml:space="preserve">CAPÍTULO 25</w:t>
       </w:r>
     </w:p>
-    <w:bookmarkStart w:id="78" w:name="hope-1"/>
+    <w:bookmarkStart w:id="79" w:name="hope-1"/>
     <w:p>
       <w:pPr>
         <w:pStyle w:val="Heading2"/>
@@ -7469,7 +7517,7 @@
         <w:t xml:space="preserve">O momento em que eu soube veio em silêncio. Eu estava lutando com uma velha insegurança, do tipo que eu sempre tinha administrado sozinho, e em vez de administrá-la eu a disse em voz alta. Ela disse, Vou te amar não importa o quê. As pessoas dizem essas palavras. Eu conseguia sentir que ela as dizia de verdade, até o fundo. Meu pai passou uma vida inteira provando essa frase sem nunca precisar dizê-la. Ouvi-la dita a mim, e acreditar nela, foi o momento em que eu soube que me casaria com ela. Me apaixonar por ela foi a coisa mais fácil que eu já fiz.</w:t>
       </w:r>
     </w:p>
-    <w:bookmarkStart w:id="74" w:name="você-é-salvo"/>
+    <w:bookmarkStart w:id="75" w:name="você-é-salvo"/>
     <w:p>
       <w:pPr>
         <w:pStyle w:val="Heading3"/>
@@ -7514,8 +7562,8 @@
         <w:t xml:space="preserve">Fora o meu próprio pai, Jeff é um de dois homens que me mostraram como é a fé quando ela é vivida em vez de só falada. O outro é Dave Meyer, meu amigo desde o fundamental dois. Homens diferentes, a mesma espinha. Nenhum dos dois fala da boca para fora e para por aí; ambos vivem aquilo. Nenhum jamais perdeu de vista onde Deus está nisso. Precisei dos dois como prova de que aquilo que eu busquei num campo enlameado em Chumuckla se sustenta ao longo de uma vida inteira.</w:t>
       </w:r>
     </w:p>
-    <w:bookmarkEnd w:id="74"/>
-    <w:bookmarkStart w:id="75" w:name="bênçãos"/>
+    <w:bookmarkEnd w:id="75"/>
+    <w:bookmarkStart w:id="76" w:name="bênçãos"/>
     <w:p>
       <w:pPr>
         <w:pStyle w:val="Heading3"/>
@@ -7576,8 +7624,8 @@
         <w:t xml:space="preserve">Depois ele olhou para mim. Você é firme, ele disse. Então: ela também é. Foi isso. Nenhuma bênção formal, nenhum discurso. Ele viu duas pessoas firmes na mesma direção e reparou.</w:t>
       </w:r>
     </w:p>
-    <w:bookmarkEnd w:id="75"/>
-    <w:bookmarkStart w:id="76" w:name="o-pedido"/>
+    <w:bookmarkEnd w:id="76"/>
+    <w:bookmarkStart w:id="77" w:name="o-pedido"/>
     <w:p>
       <w:pPr>
         <w:pStyle w:val="Heading3"/>
@@ -7598,8 +7646,8 @@
         <w:t xml:space="preserve">Eu a pedi em casamento no Jackson’s. Minha mãe estava lá, tia Terry, tia Nancey, e Gary, o namorado da minha mãe. Eu tinha contado à Terry o plano: depois do jantar. Mas não consegui esperar. Nervoso demais. Não consigo aguentar essa refeição inteira, eu disse, vou só fazer isto. Então me ajoelhei, meio sem jeito, e pedi que ela se casasse comigo. Hope disse sim, e o nervosismo saiu de mim tudo de uma vez. O que se instalou no lugar foi a sensação mais certa que eu já tive sobre qualquer coisa. Eu finalmente pude aproveitar o resto da minha refeição. Logo depois, a gente arranjou um chihuahua juntos, um pequenininho chamado Nola. Ela tem oito anos agora. Aquela cachorra esteve com a gente em tudo.</w:t>
       </w:r>
     </w:p>
-    <w:bookmarkEnd w:id="76"/>
-    <w:bookmarkStart w:id="77" w:name="o-casamento"/>
+    <w:bookmarkEnd w:id="77"/>
+    <w:bookmarkStart w:id="78" w:name="o-casamento"/>
     <w:p>
       <w:pPr>
         <w:pStyle w:val="Heading3"/>
@@ -7648,9 +7696,9 @@
         <w:t xml:space="preserve">CAPÍTULO 26</w:t>
       </w:r>
     </w:p>
-    <w:bookmarkEnd w:id="77"/>
     <w:bookmarkEnd w:id="78"/>
-    <w:bookmarkStart w:id="83" w:name="o-que-construímos"/>
+    <w:bookmarkEnd w:id="79"/>
+    <w:bookmarkStart w:id="84" w:name="o-que-construímos"/>
     <w:p>
       <w:pPr>
         <w:pStyle w:val="Heading2"/>
@@ -7727,7 +7775,7 @@
         <w:t xml:space="preserve">O Lou nunca embarcou no plano. Quando ele nos ouvia falar de orçamento e de cortar gastos, alguma coisa nele se irritava. Você tem que aproveitar a vida, ele dizia. Não dá pra cortar tudo. Falava com um pouco de irritação, e a irritação não era dirigida a nós — com o Lou, raramente era. Um homem que dava vinte dólares de gorjeta por princípio nunca ia amar um orçamento. Ele ouvia economia e entendia privação.</w:t>
       </w:r>
     </w:p>
-    <w:bookmarkStart w:id="79" w:name="quem-ela-é"/>
+    <w:bookmarkStart w:id="80" w:name="quem-ela-é"/>
     <w:p>
       <w:pPr>
         <w:pStyle w:val="Heading3"/>
@@ -7836,8 +7884,8 @@
         <w:t xml:space="preserve">Ela adora rir, do jeito de verdade, que a leva até o fim e puxa a sala inteira junto. É a coisa mais contagiante nela. Nos primeiros três anos a gente ria assim o tempo todo, fácil e constante, a casa cheia disso. Depois vieram os anos pesados, os que este livro aborda na maior parte, e o riso ficou raro sem que nenhum de nós decidisse que devia. Estamos finalmente voltando a ele. A alegria está retornando, um pouco mais a cada mês, e não considero nada disso garantido. Mas por baixo de tudo, o que ela é para mim é minha melhor amiga. A gente se sente seguro um com o outro, e porque a gente se sente seguro, às vezes somos mais duros um com o outro do que deveríamos. Esse é o preço de baixar a guarda até o fim com a única pessoa que você tem certeza que não vai embora. Ela é essa pessoa. Eu não sabia que dava para continuar se apaixonando pela mesma mulher depois de tantos anos de casamento. Dá.</w:t>
       </w:r>
     </w:p>
-    <w:bookmarkEnd w:id="79"/>
-    <w:bookmarkStart w:id="80" w:name="a-jornada"/>
+    <w:bookmarkEnd w:id="80"/>
+    <w:bookmarkStart w:id="81" w:name="a-jornada"/>
     <w:p>
       <w:pPr>
         <w:pStyle w:val="Heading3"/>
@@ -7858,8 +7906,8 @@
         <w:t xml:space="preserve">Em pouco tempo trabalhamos como um time. Quitamos mais de cem mil dólares em empréstimo estudantil e construímos uma vida com folga em vez de dívida, um lar, uma pequena segurança que eu nunca tive lá atrás, quando eu parecia bem-sucedido. A recuperação me ensinou sobre dinheiro a mesma coisa que me ensinou sobre tudo o mais: você cumpre as pequenas promessas, todo dia, e juntas elas formam uma vida. A gente se mudou para Raleigh. Nunca tivemos filhos, e nunca planejamos ter. O que construímos foi nós dois, e uma vida com espaço para estar presente para as outras pessoas. Hoje em dia isso inclui a mãe da Hope. A Rhonda mora debaixo do nosso teto agora, o que não é uma frase que se diga de leve, e conhecê-la e amá-la tem sido um dos presentes silenciosos deste trecho. Ela não teve a vida mais fácil. O que eu não vi chegando foi a Hope e a mãe dela ficarem próximas, devagar, ao longo de anos, até a Hope começar a chamar a Rhonda de melhor amiga. Nenhuma das coisas boas acontece da noite para o dia. A gente faz viagens juntos, os Outer Banks e outras, e em algum lugar dos dias comuns debaixo de um teto só aconteceu muita cura, do tipo que você não projeta, você só continua aparecendo para ela. Eu tenho o privilégio de testemunhar. A Hope é a minha rocha. Nem sempre é tranquilo, nenhum casamento honesto é, mas ela nunca deixou de acreditar no que estamos construindo. Eu não teria me tornado este homem sem o Lou. E o amor que encontrei com a Hope é o que me preparou para o que veio depois: os cuidados paliativos, sentar em quartos onde as pessoas estão perdendo quem elas mais amam. Essa é a minha história de amor. Começou com uma mensagem teimosa no Match.com para uma menina que me mandou não escrever. A melhor regra que já quebrei.</w:t>
       </w:r>
     </w:p>
-    <w:bookmarkEnd w:id="80"/>
-    <w:bookmarkStart w:id="81" w:name="as-fotos-nunca-contam-a-história-inteira"/>
+    <w:bookmarkEnd w:id="81"/>
+    <w:bookmarkStart w:id="82" w:name="as-fotos-nunca-contam-a-história-inteira"/>
     <w:p>
       <w:pPr>
         <w:pStyle w:val="Heading3"/>
@@ -7912,8 +7960,8 @@
         <w:t xml:space="preserve">Penso naquelas viagens de um jeito diferente agora, não como tempo que eu deveria ter gastado de outra forma, mas como tempo que sou grato por a gente ter tirado, cada minuto bagunçado dele. As fotos nunca contam a história inteira. Não conseguem. Elas só capturam o segundo em que a gente estava sorrindo. Tudo o que mereceu o sorriso aconteceu fora da câmera, e a maior parte disso foi a Hope.</w:t>
       </w:r>
     </w:p>
-    <w:bookmarkEnd w:id="81"/>
-    <w:bookmarkStart w:id="82" w:name="mulher-maravilha"/>
+    <w:bookmarkEnd w:id="82"/>
+    <w:bookmarkStart w:id="83" w:name="mulher-maravilha"/>
     <w:p>
       <w:pPr>
         <w:pStyle w:val="Heading3"/>
@@ -7998,9 +8046,9 @@
         <w:t xml:space="preserve">CAPÍTULO 27</w:t>
       </w:r>
     </w:p>
-    <w:bookmarkEnd w:id="82"/>
     <w:bookmarkEnd w:id="83"/>
-    <w:bookmarkStart w:id="84" w:name="X36aa41766a025d67b6126baf6311f581c782617"/>
+    <w:bookmarkEnd w:id="84"/>
+    <w:bookmarkStart w:id="85" w:name="X36aa41766a025d67b6126baf6311f581c782617"/>
     <w:p>
       <w:pPr>
         <w:pStyle w:val="Heading2"/>
@@ -8149,9 +8197,9 @@
         <w:t xml:space="preserve">Falei com o Lou sobre o Bob uma noite. Não sei por que isso está me atingindo tanto, eu disse. Fiz tudo certo. Ele não hesitou. Não é por isso que está te incomodando. Ele tinha razão. O Bob não tinha precisado que eu consertasse nada. Ele tinha precisado de mim no quarto. Estavam me deixando entrar em lugares onde a presença era a única coisa que restava a oferecer, e alguma coisa em mim já sabia como fazer aquilo. Não como uma técnica. Como uma prática. Um velho morrendo sóbrio aos oitenta e oito me mostrou que o máximo que você pode fazer naquela beira é se recusar a ir embora. Anos depois, aquilo virou o trabalho inteiro.</w:t>
       </w:r>
     </w:p>
-    <w:bookmarkEnd w:id="84"/>
     <w:bookmarkEnd w:id="85"/>
-    <w:bookmarkStart w:id="86" w:name="as-viagens-v"/>
+    <w:bookmarkEnd w:id="86"/>
+    <w:bookmarkStart w:id="87" w:name="as-viagens-v"/>
     <w:p>
       <w:pPr>
         <w:pStyle w:val="Heading1"/>
@@ -8184,8 +8232,8 @@
         <w:t xml:space="preserve">PARTE SEIS</w:t>
       </w:r>
     </w:p>
-    <w:bookmarkEnd w:id="86"/>
-    <w:bookmarkStart w:id="106" w:name="o-último-capítulo"/>
+    <w:bookmarkEnd w:id="87"/>
+    <w:bookmarkStart w:id="107" w:name="o-último-capítulo"/>
     <w:p>
       <w:pPr>
         <w:pStyle w:val="Heading1"/>
@@ -8222,7 +8270,7 @@
         <w:t xml:space="preserve">CAPÍTULO 28</w:t>
       </w:r>
     </w:p>
-    <w:bookmarkStart w:id="89" w:name="o-viagra-dos-remédios-para-diabetes"/>
+    <w:bookmarkStart w:id="90" w:name="o-viagra-dos-remédios-para-diabetes"/>
     <w:p>
       <w:pPr>
         <w:pStyle w:val="Heading2"/>
@@ -8291,7 +8339,7 @@
         <w:t xml:space="preserve">O reconhecimento que eu tinha parado de perseguir tinha um jeito de me encontrar de qualquer forma. Depois de dez anos no atendimento domiciliar, um dos representantes da empresa que vende Ozempic começou a reparar em mim nos consultórios, perguntando por aí quem daria um bom parceiro. Quando uma vaga abriu, ela ficou ligando. Você quer se candidatar? Não, eu disse, estou feliz onde estou. Mas um amigo me falou, arrisca. Então fiz a entrevista, e consegui o emprego. Foi difícil sair. Dez anos. A Brenda Jahn tinha sido uma gerente incrível. Mas eu vi aquilo como uma chance de aprender. Quando comecei na Novo Nordisk eu não sabia a diferença entre diabetes tipo 1 e tipo 2. Com o treinamento e o estudo em casa, eu fiquei bom nisso. Muito bom.</w:t>
       </w:r>
     </w:p>
-    <w:bookmarkStart w:id="87" w:name="diabetes-dave"/>
+    <w:bookmarkStart w:id="88" w:name="diabetes-dave"/>
     <w:p>
       <w:pPr>
         <w:pStyle w:val="Heading3"/>
@@ -8344,8 +8392,8 @@
         <w:t xml:space="preserve">Eu não sabia então o que aquele Natal levaria de mim, nem o que pousaria no meu retrovisor do lado do motorista duas semanas depois. Mas quando chegou, eu reconheceria. O Dave tinha me ensinado a língua.</w:t>
       </w:r>
     </w:p>
-    <w:bookmarkEnd w:id="87"/>
-    <w:bookmarkStart w:id="88" w:name="o-entremeio"/>
+    <w:bookmarkEnd w:id="88"/>
+    <w:bookmarkStart w:id="89" w:name="o-entremeio"/>
     <w:p>
       <w:pPr>
         <w:pStyle w:val="Heading3"/>
@@ -8386,9 +8434,9 @@
         <w:t xml:space="preserve">CAPÍTULO 29</w:t>
       </w:r>
     </w:p>
-    <w:bookmarkEnd w:id="88"/>
     <w:bookmarkEnd w:id="89"/>
-    <w:bookmarkStart w:id="97" w:name="cinco-semanas"/>
+    <w:bookmarkEnd w:id="90"/>
+    <w:bookmarkStart w:id="98" w:name="cinco-semanas"/>
     <w:p>
       <w:pPr>
         <w:pStyle w:val="Heading2"/>
@@ -8457,7 +8505,7 @@
         <w:t xml:space="preserve">Cinco semanas depois que comecei no emprego de cuidados paliativos, meu pai começou a morrer. Mudamos para Raleigh porque a vida estava se expandindo. A Hope era farmacêutica havia oito anos. Raleigh fazia sentido, empregos, comunidade, uma igreja que parecia nossa. Deixar Pensacola significava deixar raízes. A Hope nunca vacilou. É quem ela é. Não cegamente otimista; ela enxerga com clareza e faz perguntas difíceis. Mas por baixo de tudo há uma crença firme como rocha de que Deus tem um plano para que sejamos úteis. Quando a oportunidade dos cuidados paliativos apareceu, foi como um quarto ao redor do qual eu vinha circulando havia anos com a porta finalmente aberta. Sem debate. Sem planilha. Era ali que eu era mais necessário.</w:t>
       </w:r>
     </w:p>
-    <w:bookmarkStart w:id="90" w:name="os-quartos"/>
+    <w:bookmarkStart w:id="91" w:name="os-quartos"/>
     <w:p>
       <w:pPr>
         <w:pStyle w:val="Heading3"/>
@@ -8534,8 +8582,8 @@
         <w:t xml:space="preserve">Eu não estava lá para o fim mesmo. Eu o vi perto dele, e um único pensamento me atravessou que eu não consegui retirar: eu nunca quero ver meu próprio pai assim. Eu não tinha ideia de quão poucas semanas faltavam antes que aquilo deixasse de ser um medo e se tornasse uma escolha diante de mim.</w:t>
       </w:r>
     </w:p>
-    <w:bookmarkEnd w:id="90"/>
-    <w:bookmarkStart w:id="91" w:name="cinco-semanas-1"/>
+    <w:bookmarkEnd w:id="91"/>
+    <w:bookmarkStart w:id="92" w:name="cinco-semanas-1"/>
     <w:p>
       <w:pPr>
         <w:pStyle w:val="Heading3"/>
@@ -8556,8 +8604,8 @@
         <w:t xml:space="preserve">O declínio não foi dramático no começo, menos energia na voz dele no telefone, conversas que costumavam se estender terminando mais rápido, com menos daquela textura que as fazia ser dele. Eu sabia como ler aquilo. Eu tinha acabado de passar cinco semanas aprendendo a ler exatamente aquilo. Eu estava entrando na casa de estranhos explicando o que os cuidados paliativos eram e não eram, e o tempo todo meu próprio pai estava cruzando a mesma linha que eu vinha descrevendo às famílias a semana inteira. Eu não contava a elas que meu pai também estava morrendo. Não precisava.</w:t>
       </w:r>
     </w:p>
-    <w:bookmarkEnd w:id="91"/>
-    <w:bookmarkStart w:id="92" w:name="a-gente-disse-tudo"/>
+    <w:bookmarkEnd w:id="92"/>
+    <w:bookmarkStart w:id="93" w:name="a-gente-disse-tudo"/>
     <w:p>
       <w:pPr>
         <w:pStyle w:val="Heading3"/>
@@ -8578,8 +8626,8 @@
         <w:t xml:space="preserve">O relacionamento entre meu pai e eu não era perfeito. Nada nesta história foi. Mas nos anos da minha sobriedade, os anos de verdade, os anos de estar presente e ficar, a gente disse tudo que precisava ser dito. Não numa só conversa. Não numa cena de leito de morte. Nas coisas comuns, os telefonemas de domingo, a varanda dos fundos em Pensacola, o momento no meu casamento em que o brinde da minha mãe alcançou ele e o punho dele subiu, o momento na conferência de negócios em que o Quint disse o nome dele numa sala cheia de líderes. Eu fiz reparação a ele. Não com um discurso, o Lou teria odiado um discurso. Com anos de comportamento que diziam: eu sei o que você fez, eu sei o que custou, eu não vou desperdiçar isso. Ele me disse. Quatro palavras num telefonema. Tenho orgulho de você. A gente não estava inacabado. Isso não é pouca coisa.</w:t>
       </w:r>
     </w:p>
-    <w:bookmarkEnd w:id="92"/>
-    <w:bookmarkStart w:id="93" w:name="o-lugar-certo"/>
+    <w:bookmarkEnd w:id="93"/>
+    <w:bookmarkStart w:id="94" w:name="o-lugar-certo"/>
     <w:p>
       <w:pPr>
         <w:pStyle w:val="Heading3"/>
@@ -8624,8 +8672,8 @@
         <w:t xml:space="preserve">E ele nunca parou de querer ser útil. Ele tinha se aposentado no papel e continuou trabalhando mesmo assim, entrando pelos oitenta anos, atendendo telefones e desenrolando problemas de computador. O pagamento era quase nada, e um dia ele me ligou como se tivesse ganhado na loteria porque o chefe tinha dobrado o valor. O que eu lembro não é o dinheiro. É um homem de oitenta anos radiante com uma boa avaliação de desempenho. Aos oitenta, ele fez uma corrida de 5K com a Hope e comigo, terminou em último lugar, e levou para casa o prêmio da tartaruga, o que de algum jeito deixou tudo melhor. Depois da cirurgia de 2015 — tiraram cerca de metade do esôfago e metade do estômago dele — ele comia menos, pesava menos, tomava as vitaminas, ia ao médico holístico. Ele ganhou anos para si. E os passou querendo coisas. Força. Respeito. Uma boa avaliação. A prova de que não estava acabado. Há dignidade em ainda querer, e meu pai teve isso até o fim.</w:t>
       </w:r>
     </w:p>
-    <w:bookmarkEnd w:id="93"/>
-    <w:bookmarkStart w:id="94" w:name="vigílias"/>
+    <w:bookmarkEnd w:id="94"/>
+    <w:bookmarkStart w:id="95" w:name="vigílias"/>
     <w:p>
       <w:pPr>
         <w:pStyle w:val="Heading3"/>
@@ -8670,8 +8718,8 @@
         <w:t xml:space="preserve">A Lisa e eu conversamos. A gente sabia que ele tinha que fazer alguma coisa. O Chris foi quem chegou até ele, pesquisou, achou um cirurgião em Birmingham usando contatos de um emprego anterior, conseguiu uma consulta para ele. O cirurgião olhou para ele e disse, estágio 4, sua idade, nenhum cirurgião vai operar você. A gente ficou arrasado. A cirurgia tinha funcionado da primeira vez; a gente achou que era a resposta de novo. A imunoterapia surgiu, em geral não tão dura para o corpo quanto quimioterapia ou radiação, nos disseram. O Lou concordou em tentar. Ele estava escolhendo tentar. Não por si mesmo. Por nós.</w:t>
       </w:r>
     </w:p>
-    <w:bookmarkEnd w:id="94"/>
-    <w:bookmarkStart w:id="95" w:name="o-tratamento"/>
+    <w:bookmarkEnd w:id="95"/>
+    <w:bookmarkStart w:id="96" w:name="o-tratamento"/>
     <w:p>
       <w:pPr>
         <w:pStyle w:val="Heading3"/>
@@ -8692,8 +8740,8 @@
         <w:t xml:space="preserve">A imunoterapia começou no verão de 2024. No começo, impossivelmente, funcionou. O tumor no pulmão dele quase se dissolveu. O oncologista usou a palavra animador. Depois vieram os efeitos colaterais, erupções por todo o corpo dele. O Lou nunca reclamava. A frequência cardíaca e a pressão dele começaram a sair do lugar e ele acabou no hospital. Eu estava lá quando colocaram o marca-passo. Ele estava otimista com aquilo, pronto para continuar lutando. Um marca-passo aos oitenta e três e ele saiu procurando o próximo round. Ele fez uma segunda rodada de imunoterapia, depois uma terceira, tentando limpar os linfonodos. A terceira rodada foi o que finalmente cobrou o preço. Ele ficou fraco. Lá pela metade de 2025 os telefonemas tinham mudado, e ele parou de perguntar sobre o meu trabalho. Não porque não se importasse. Porque perguntar exigia um foco que estava indo para a manutenção básica de existir.</w:t>
       </w:r>
     </w:p>
-    <w:bookmarkEnd w:id="95"/>
-    <w:bookmarkStart w:id="96" w:name="ele-não-dizia-dor"/>
+    <w:bookmarkEnd w:id="96"/>
+    <w:bookmarkStart w:id="97" w:name="ele-não-dizia-dor"/>
     <w:p>
       <w:pPr>
         <w:pStyle w:val="Heading3"/>
@@ -8774,9 +8822,9 @@
         <w:t xml:space="preserve">CAPÍTULO 30</w:t>
       </w:r>
     </w:p>
-    <w:bookmarkEnd w:id="96"/>
     <w:bookmarkEnd w:id="97"/>
-    <w:bookmarkStart w:id="100" w:name="os-dias-seguintes"/>
+    <w:bookmarkEnd w:id="98"/>
+    <w:bookmarkStart w:id="101" w:name="os-dias-seguintes"/>
     <w:p>
       <w:pPr>
         <w:pStyle w:val="Heading2"/>
@@ -9061,7 +9109,7 @@
         <w:t xml:space="preserve">Dirigimos de volta para casa pelo mesmo caminho por onde tínhamos vindo, ainda falando sobre ele — a picape que dizia Jersey num estacionamento da Flórida, tudo aquilo. O luto viajou conosco. Ele viaja comigo ainda. Parei de desejar que ele fosse embora. É o peso de ter sido amado daquele jeito, e prefiro carregá-lo a não ter nada para carregar.</w:t>
       </w:r>
     </w:p>
-    <w:bookmarkStart w:id="98" w:name="a-conversa-que-nunca-tive"/>
+    <w:bookmarkStart w:id="99" w:name="a-conversa-que-nunca-tive"/>
     <w:p>
       <w:pPr>
         <w:pStyle w:val="Heading3"/>
@@ -9098,8 +9146,8 @@
         <w:t xml:space="preserve">Eu sento com famílias para viver e entrego a elas as perguntas que nunca entreguei a ele. Pergunte agora, eu digo a elas. Este é o dia certo. Acredito em cada palavra disso, e também sei o que é ficar do lado de fora de uma porta que um homem decidiu manter fechada, e amá-lo o bastante para deixá-la assim. As duas coisas são verdadeiras. Passei a vida sendo salvo pelo meu pai. No fim, tive que aprender que amá-lo não significava salvá-lo de volta.</w:t>
       </w:r>
     </w:p>
-    <w:bookmarkEnd w:id="98"/>
-    <w:bookmarkStart w:id="99" w:name="quem-fica.-quem-vai."/>
+    <w:bookmarkEnd w:id="99"/>
+    <w:bookmarkStart w:id="100" w:name="quem-fica.-quem-vai."/>
     <w:p>
       <w:pPr>
         <w:pStyle w:val="Heading3"/>
@@ -9156,9 +9204,9 @@
         <w:t xml:space="preserve">CAPÍTULO 31</w:t>
       </w:r>
     </w:p>
-    <w:bookmarkEnd w:id="99"/>
     <w:bookmarkEnd w:id="100"/>
-    <w:bookmarkStart w:id="101" w:name="a-primeira-milha-honesta"/>
+    <w:bookmarkEnd w:id="101"/>
+    <w:bookmarkStart w:id="102" w:name="a-primeira-milha-honesta"/>
     <w:p>
       <w:pPr>
         <w:pStyle w:val="Heading2"/>
@@ -9279,8 +9327,8 @@
         <w:t xml:space="preserve">CAPÍTULO 32</w:t>
       </w:r>
     </w:p>
-    <w:bookmarkEnd w:id="101"/>
-    <w:bookmarkStart w:id="102" w:name="o-que-o-luto-ensinou-ao-trabalho"/>
+    <w:bookmarkEnd w:id="102"/>
+    <w:bookmarkStart w:id="103" w:name="o-que-o-luto-ensinou-ao-trabalho"/>
     <w:p>
       <w:pPr>
         <w:pStyle w:val="Heading2"/>
@@ -9441,8 +9489,8 @@
         <w:t xml:space="preserve">CAPÍTULO 33</w:t>
       </w:r>
     </w:p>
-    <w:bookmarkEnd w:id="102"/>
-    <w:bookmarkStart w:id="105" w:name="a-mesa"/>
+    <w:bookmarkEnd w:id="103"/>
+    <w:bookmarkStart w:id="106" w:name="a-mesa"/>
     <w:p>
       <w:pPr>
         <w:pStyle w:val="Heading2"/>
@@ -9535,7 +9583,7 @@
         <w:t xml:space="preserve">Já não era mais sobre trabalho. Duas pessoas numa mesa redonda, uma delas de luto e a outra escolhendo ficar na sala por causa disso. Nos abraçamos. Dei um beijo no rosto dela. A partir daquele dia passei a aguardar com expectativa os dias em que vejo Linda. Pela pessoa, não pelo lugar. O resto da equipe brinca com isso, ah, você sempre chega e dá um beijo no rosto da Linda. Eles não sabem o que houve antes, não sabem o que foi compartilhado naquela mesa na quarta-feira depois de enterrarmos meu pai. Tudo bem. Nem toda conexão precisa de plateia. Aqui está a parte que as pessoas talvez não esperem: como representante, sou eu quem deveria trazer o chocolate e os agrados. Quando vou ver Linda, sou eu quem se sente cuidado. Ela me dá biscoitos. Ela pergunta como estou. A relação corre ao contrário da descrição do cargo. Linda me deu um momento, três dias úteis depois do funeral, numa mesa redonda, para parar de segurar tudo. Vou carregar isso comigo.</w:t>
       </w:r>
     </w:p>
-    <w:bookmarkStart w:id="103" w:name="a-mesa-da-lisa"/>
+    <w:bookmarkStart w:id="104" w:name="a-mesa-da-lisa"/>
     <w:p>
       <w:pPr>
         <w:pStyle w:val="Heading3"/>
@@ -9612,8 +9660,8 @@
         <w:t xml:space="preserve">Penso numa noite muito tempo atrás em que ela cozinhou bolo de carne para dois meninos que não facilitavam. Ela ainda está de pé junto ao balcão. Ainda abrindo a porta. Da última vez que estive lá no Dia de Ação de Graças, fiquei um minuto na cozinha dela antes de nos sentarmos. Não disse nada. Só observei, e pensei em como as pessoas que mantêm as famílias unidas geralmente não recebem agradecimento por isso. Elas só continuam fazendo. Ano após ano. Nos sentamos. Alguém rezou. A comida foi passada. E por algumas horas tudo teve um centro de novo. Lisa fez questão disso.</w:t>
       </w:r>
     </w:p>
-    <w:bookmarkEnd w:id="103"/>
-    <w:bookmarkStart w:id="104" w:name="o-chão"/>
+    <w:bookmarkEnd w:id="104"/>
+    <w:bookmarkStart w:id="105" w:name="o-chão"/>
     <w:p>
       <w:pPr>
         <w:pStyle w:val="Heading3"/>
@@ -9634,10 +9682,10 @@
         <w:t xml:space="preserve">Quase toda manhã há quinze anos meu telefone toca cedo e é o Mager, ou eu liguei primeiro, e a gente reza. Algumas frases simples para começar o dia apontado na direção certa. Nada eloquente. Dois homens sóbrios numa linha telefônica, dizendo obrigado, pedindo ajuda, desligando, indo trabalhar. As pessoas me perguntam onde Deus estava em tudo isso, e a resposta honesta é que Ele nunca foi quem foi embora. Fui eu. Ainda não consigo explicar Deus no papel, e parei de tentar. O que posso te dizer é que toda vez que bati no fundo de mim mesmo, algo que eu não tinha colocado ali segurava o chão. Hoje minha fé não se parece com certeza. Se parece com aquela ligação da manhã. Um pássaro vermelho num espelho. Entrar no quarto de um estranho que está morrendo sem nada de útil nas mãos e confiar que a presença é um tipo próprio de oração. Parei de precisar que a teologia fosse à prova d’água. Só precisava ficar na sala, e me deixar ser acompanhado. Isso, tanto quanto qualquer coisa, é o que me trouxe até aqui.</w:t>
       </w:r>
     </w:p>
-    <w:bookmarkEnd w:id="104"/>
     <w:bookmarkEnd w:id="105"/>
     <w:bookmarkEnd w:id="106"/>
-    <w:bookmarkStart w:id="107" w:name="epílogo-a-promessa-do-cardeal"/>
+    <w:bookmarkEnd w:id="107"/>
+    <w:bookmarkStart w:id="108" w:name="epílogo-a-promessa-do-cardeal"/>
     <w:p>
       <w:pPr>
         <w:pStyle w:val="Heading1"/>
@@ -9798,8 +9846,8 @@
         <w:t xml:space="preserve">O cardeal voou para dentro do cinza. A promessa permanece. Ela nunca esteve no pássaro. Esteve no que Lou construiu em mim, ao longo de trinta anos de amor escolhido e presença teimosa. Agora é a minha vez. Continue aparecendo. Continue escolhendo o amor.</w:t>
       </w:r>
     </w:p>
-    <w:bookmarkEnd w:id="107"/>
-    <w:bookmarkStart w:id="108" w:name="uma-carta-a-quem-ama-um-dependente"/>
+    <w:bookmarkEnd w:id="108"/>
+    <w:bookmarkStart w:id="109" w:name="uma-carta-a-quem-ama-um-dependente"/>
     <w:p>
       <w:pPr>
         <w:pStyle w:val="Heading1"/>
@@ -9876,8 +9924,8 @@
         <w:t xml:space="preserve">Então agora você sabe como eu sei. Uma promessa era tudo que eu tinha a oferecer — dizer a você a verdade do começo ao fim — e eu a cumpri tão bem quanto sei. Há mais uma página, e ela é sua.</w:t>
       </w:r>
     </w:p>
-    <w:bookmarkEnd w:id="108"/>
-    <w:bookmarkStart w:id="109" w:name="tyler-e-jaye"/>
+    <w:bookmarkEnd w:id="109"/>
+    <w:bookmarkStart w:id="110" w:name="tyler-e-jaye"/>
     <w:p>
       <w:pPr>
         <w:pStyle w:val="Heading1"/>
@@ -9954,8 +10002,8 @@
         <w:t xml:space="preserve">Foi ali que a vida de Tyler se dividiu em duas. Depois disso veio a cama de hospital na sala de estar, as rampas, o chuveiro acessível, as rotinas matinais que levam horas, e a irmã dele, Jaye, prima de Hope também, se mudando para ajudar a levá-lo de volta rumo a alguma independência, um marido e duas filhas e uma carreira própria deixados de lado para que ela pudesse ficar. Este é um dos lugares onde aprendi a reparar no cuidador. Tyler ainda está lutando, e Jaye ainda está aparecendo.</w:t>
       </w:r>
     </w:p>
-    <w:bookmarkEnd w:id="109"/>
-    <w:bookmarkStart w:id="110" w:name="a-cadeira-vazia"/>
+    <w:bookmarkEnd w:id="110"/>
+    <w:bookmarkStart w:id="111" w:name="a-cadeira-vazia"/>
     <w:p>
       <w:pPr>
         <w:pStyle w:val="Heading1"/>
@@ -10020,8 +10068,8 @@
         <w:t xml:space="preserve">Descanse em paz, AJ. Vamos manter a cadeira quentinha e o café ruim.</w:t>
       </w:r>
     </w:p>
-    <w:bookmarkEnd w:id="110"/>
-    <w:bookmarkStart w:id="111" w:name="o-que-eu-peço-a-você"/>
+    <w:bookmarkEnd w:id="111"/>
+    <w:bookmarkStart w:id="112" w:name="o-que-eu-peço-a-você"/>
     <w:p>
       <w:pPr>
         <w:pStyle w:val="Heading1"/>
@@ -10122,8 +10170,8 @@
         <w:t xml:space="preserve">O amor aparece onde é preciso, não onde é merecido. Essa é a promessa do cardeal. Foi feito para mim. Agora vá e faça por outra pessoa.</w:t>
       </w:r>
     </w:p>
-    <w:bookmarkEnd w:id="111"/>
-    <w:bookmarkStart w:id="112" w:name="o-jeito-do-lou"/>
+    <w:bookmarkEnd w:id="112"/>
+    <w:bookmarkStart w:id="113" w:name="o-jeito-do-lou"/>
     <w:p>
       <w:pPr>
         <w:pStyle w:val="Heading1"/>
@@ -10216,8 +10264,8 @@
         <w:t xml:space="preserve">Ele ficou.</w:t>
       </w:r>
     </w:p>
-    <w:bookmarkEnd w:id="112"/>
-    <w:bookmarkStart w:id="113" w:name="posfácio"/>
+    <w:bookmarkEnd w:id="113"/>
+    <w:bookmarkStart w:id="114" w:name="posfácio"/>
     <w:p>
       <w:pPr>
         <w:pStyle w:val="Heading1"/>
@@ -10302,8 +10350,8 @@
         <w:t xml:space="preserve">Dave Meyer</w:t>
       </w:r>
     </w:p>
-    <w:bookmarkEnd w:id="113"/>
-    <w:bookmarkStart w:id="114" w:name="nota-do-autor"/>
+    <w:bookmarkEnd w:id="114"/>
+    <w:bookmarkStart w:id="115" w:name="nota-do-autor"/>
     <w:p>
       <w:pPr>
         <w:pStyle w:val="Heading1"/>
@@ -10340,8 +10388,8 @@
         <w:t xml:space="preserve">Esta é uma história verdadeira, contada de memória. Os diálogos foram reconstruídos com toda a fidelidade que a memória permite; eles guardam a essência do que foi dito, se nem sempre as palavras exatas. Alguns nomes e detalhes de identificação foram mudados para proteger a privacidade, acima de tudo os dos pacientes e das famílias que atendi no atendimento domiciliar e nos cuidados paliativos, cujos dias mais difíceis merecem proteção, não exposição. Onde os homens e as mulheres sóbrios das salas aparecem com seus nomes reais, é com a permissão deles; outros foram renomeados. Algumas das salas que descrevo a partir do meu trabalho são combinações de muitas salas, pela mesma razão. Nada nestas páginas foi inventado para deixar a história mais afiada. Minha mãe, que está por todo este livro, conferiu mais dessas lembranças do que qualquer outra pessoa. O que eu ainda errei é meu.</w:t>
       </w:r>
     </w:p>
-    <w:bookmarkEnd w:id="114"/>
-    <w:bookmarkStart w:id="115" w:name="agradecimentos"/>
+    <w:bookmarkEnd w:id="115"/>
+    <w:bookmarkStart w:id="116" w:name="agradecimentos"/>
     <w:p>
       <w:pPr>
         <w:pStyle w:val="Heading1"/>
@@ -10442,8 +10490,8 @@
         <w:t xml:space="preserve">E o Pai. Eu cumpri a promessa.</w:t>
       </w:r>
     </w:p>
-    <w:bookmarkEnd w:id="115"/>
-    <w:bookmarkStart w:id="116" w:name="guia-de-leitura"/>
+    <w:bookmarkEnd w:id="116"/>
+    <w:bookmarkStart w:id="117" w:name="guia-de-leitura"/>
     <w:p>
       <w:pPr>
         <w:pStyle w:val="Heading1"/>
@@ -10611,8 +10659,8 @@
         <w:t xml:space="preserve">O livro termina com instruções: diga as palavras agora, atravesse o estacionamento, abra a porta. Qual instrução é a sua — e quando você vai segui-la?</w:t>
       </w:r>
     </w:p>
-    <w:bookmarkEnd w:id="116"/>
-    <w:bookmarkStart w:id="121" w:name="recursos"/>
+    <w:bookmarkEnd w:id="117"/>
+    <w:bookmarkStart w:id="122" w:name="recursos"/>
     <w:p>
       <w:pPr>
         <w:pStyle w:val="Heading1"/>
@@ -10641,7 +10689,7 @@
         <w:t xml:space="preserve">988 Suicide and Crisis Lifeline. Ligue ou mande mensagem para o 988. Vinte e quatro horas por dia, gratuito e confidencial. Para qualquer um que leia isto num lugar escuro — as páginas sobre a dependência, as páginas sobre o luto, qualquer uma delas.</w:t>
       </w:r>
     </w:p>
-    <w:bookmarkStart w:id="117" w:name="X87a2b3afcec3c798bb11f0610669dfc80b3aaf5"/>
+    <w:bookmarkStart w:id="118" w:name="X87a2b3afcec3c798bb11f0610669dfc80b3aaf5"/>
     <w:p>
       <w:pPr>
         <w:pStyle w:val="Heading3"/>
@@ -10678,8 +10726,8 @@
         <w:t xml:space="preserve">Al-Anon Family Groups. al-anon.org. Para as famílias e os amigos de alcoólatras. Se você ama alguém que bebe, este é para você, quer essa pessoa um dia procure ajuda ou não.</w:t>
       </w:r>
     </w:p>
-    <w:bookmarkEnd w:id="117"/>
-    <w:bookmarkStart w:id="118" w:name="Xf406460502d981cfe1fef966e93a888224e460d"/>
+    <w:bookmarkEnd w:id="118"/>
+    <w:bookmarkStart w:id="119" w:name="Xf406460502d981cfe1fef966e93a888224e460d"/>
     <w:p>
       <w:pPr>
         <w:pStyle w:val="Heading3"/>
@@ -10732,8 +10780,8 @@
         <w:t xml:space="preserve">Medicare Care Compare. medicare.gov/care-compare. Compare prestadores de cuidados paliativos na sua região, incluindo medidas de qualidade e retorno das famílias.</w:t>
       </w:r>
     </w:p>
-    <w:bookmarkEnd w:id="118"/>
-    <w:bookmarkStart w:id="119" w:name="leituras-complementares"/>
+    <w:bookmarkEnd w:id="119"/>
+    <w:bookmarkStart w:id="120" w:name="leituras-complementares"/>
     <w:p>
       <w:pPr>
         <w:pStyle w:val="Heading3"/>
@@ -10788,8 +10836,8 @@
         <w:t xml:space="preserve">.</w:t>
       </w:r>
     </w:p>
-    <w:bookmarkEnd w:id="119"/>
-    <w:bookmarkStart w:id="120" w:name="uma-nota-sobre-estes-recursos"/>
+    <w:bookmarkEnd w:id="120"/>
+    <w:bookmarkStart w:id="121" w:name="uma-nota-sobre-estes-recursos"/>
     <w:p>
       <w:pPr>
         <w:pStyle w:val="Heading3"/>
@@ -10810,9 +10858,9 @@
         <w:t xml:space="preserve">Os números de telefone e endereços na web estavam atualizados quando este livro foi para a gráfica. As organizações mudam. Se um número parar de funcionar, procure pelo nome. Nada disto é orientação médica ou jurídica. É um lugar para começar. Um cuidado: parar de beber de repente depois de um consumo pesado e constante pode ser perigoso do ponto de vista médico. A abstinência pode trazer convulsões. Deixe que um médico ou um programa de desintoxicação supervisione isso.</w:t>
       </w:r>
     </w:p>
-    <w:bookmarkEnd w:id="120"/>
     <w:bookmarkEnd w:id="121"/>
-    <w:bookmarkStart w:id="122" w:name="sobre-o-autor"/>
+    <w:bookmarkEnd w:id="122"/>
+    <w:bookmarkStart w:id="123" w:name="sobre-o-autor"/>
     <w:p>
       <w:pPr>
         <w:pStyle w:val="Heading1"/>
@@ -10849,7 +10897,7 @@
         <w:t xml:space="preserve">é seu primeiro livro.</w:t>
       </w:r>
     </w:p>
-    <w:bookmarkEnd w:id="122"/>
+    <w:bookmarkEnd w:id="123"/>
     <w:sectPr>
       <w:footerReference w:type="default" r:id="rIdFtr1"/>
       <w:pgSz w:w="12240" w:h="15840"/>

</xml_diff>